<commit_message>
xong noi dung 2.1 - 2.2 - 2.3
</commit_message>
<xml_diff>
--- a/docs/Đào Huy Hoàng-Đề cương BTL_2026.docx
+++ b/docs/Đào Huy Hoàng-Đề cương BTL_2026.docx
@@ -4940,7 +4940,8 @@
           <w:lang w:val="de-DE"/>
         </w:rPr>
       </w:pPr>
-      <w:bookmarkStart w:id="2" w:name="_Toc242968871"/>
+      <w:bookmarkStart w:id="2" w:name="_Toc242968877"/>
+      <w:bookmarkStart w:id="3" w:name="_Toc242968871"/>
       <w:r>
         <w:rPr>
           <w:lang w:val="de-DE"/>
@@ -4948,7 +4949,58 @@
         <w:lastRenderedPageBreak/>
         <w:t>Các công nghệ sử dụng trong hệ thống</w:t>
       </w:r>
-      <w:bookmarkEnd w:id="2"/>
+      <w:bookmarkEnd w:id="3"/>
+    </w:p>
+    <w:p>
+      <w:pPr>
+        <w:jc w:val="center"/>
+      </w:pPr>
+      <w:r>
+        <w:rPr>
+          <w:noProof/>
+        </w:rPr>
+        <w:drawing>
+          <wp:inline distT="0" distB="0" distL="0" distR="0" wp14:anchorId="637D74BD" wp14:editId="5EF46F85">
+            <wp:extent cx="5943600" cy="1426464"/>
+            <wp:effectExtent l="0" t="0" r="0" b="0"/>
+            <wp:docPr id="88" name="Hình tổng quan các nhóm công nghệ" descr="Sơ đồ bốn nhóm công nghệ và công cụ của đề tài, không thể hiện kiến trúc hệ thống"/>
+            <wp:cNvGraphicFramePr/>
+            <a:graphic xmlns:a="http://schemas.openxmlformats.org/drawingml/2006/main">
+              <a:graphicData uri="http://schemas.openxmlformats.org/drawingml/2006/picture">
+                <pic:pic xmlns:pic="http://schemas.openxmlformats.org/drawingml/2006/picture">
+                  <pic:nvPicPr>
+                    <pic:cNvPr id="0" name="chapter2_technology_groups.png"/>
+                    <pic:cNvPicPr/>
+                  </pic:nvPicPr>
+                  <pic:blipFill>
+                    <a:blip r:embed="rId9"/>
+                    <a:stretch>
+                      <a:fillRect/>
+                    </a:stretch>
+                  </pic:blipFill>
+                  <pic:spPr>
+                    <a:xfrm>
+                      <a:off x="0" y="0"/>
+                      <a:ext cx="5943600" cy="1426464"/>
+                    </a:xfrm>
+                    <a:prstGeom prst="rect">
+                      <a:avLst/>
+                    </a:prstGeom>
+                  </pic:spPr>
+                </pic:pic>
+              </a:graphicData>
+            </a:graphic>
+          </wp:inline>
+        </w:drawing>
+      </w:r>
+    </w:p>
+    <w:p>
+      <w:pPr>
+        <w:jc w:val="center"/>
+      </w:pPr>
+      <w:r>
+        <w:t>Hình 2.1. Các nhóm công nghệ và công cụ sử dụng trong đề tài</w:t>
+      </w:r>
     </w:p>
     <w:p>
       <w:pPr>
@@ -4957,36 +5009,21 @@
           <w:lang w:val="de-DE"/>
         </w:rPr>
       </w:pPr>
-      <w:bookmarkStart w:id="3" w:name="_Toc242968872"/>
+      <w:bookmarkStart w:id="4" w:name="_Toc242968872"/>
       <w:r>
         <w:rPr>
           <w:lang w:val="de-DE"/>
         </w:rPr>
-        <w:t>Front</w:t>
-      </w:r>
-      <w:r>
-        <w:rPr>
-          <w:lang w:val="de-DE"/>
-        </w:rPr>
-        <w:t>e</w:t>
-      </w:r>
-      <w:r>
-        <w:rPr>
-          <w:lang w:val="de-DE"/>
-        </w:rPr>
-        <w:t>nd</w:t>
-      </w:r>
-      <w:bookmarkEnd w:id="3"/>
+        <w:t>Frontend</w:t>
+      </w:r>
+      <w:bookmarkStart w:id="5" w:name="_Toc242968873"/>
+      <w:bookmarkEnd w:id="4"/>
     </w:p>
     <w:p>
       <w:pPr>
         <w:pStyle w:val="onVnHH"/>
         <w:ind w:firstLine="567"/>
-        <w:rPr>
-          <w:sz w:val="24"/>
-        </w:rPr>
-      </w:pPr>
-      <w:bookmarkStart w:id="4" w:name="_Toc242968873"/>
+      </w:pPr>
       <w:r>
         <w:rPr>
           <w:i/>
@@ -5002,18 +5039,207 @@
     <w:p>
       <w:pPr>
         <w:pStyle w:val="onVnHH"/>
+        <w:rPr>
+          <w:sz w:val="24"/>
+        </w:rPr>
+      </w:pPr>
+      <w:r>
+        <w:rPr>
+          <w:noProof/>
+          <w:sz w:val="24"/>
+        </w:rPr>
+        <w:drawing>
+          <wp:inline distT="0" distB="0" distL="0" distR="0" wp14:anchorId="62671AA1" wp14:editId="2875801C">
+            <wp:extent cx="5753100" cy="2346960"/>
+            <wp:effectExtent l="0" t="0" r="0" b="0"/>
+            <wp:docPr id="99776219" name="Hình ảnh 5"/>
+            <wp:cNvGraphicFramePr>
+              <a:graphicFrameLocks xmlns:a="http://schemas.openxmlformats.org/drawingml/2006/main" noChangeAspect="1"/>
+            </wp:cNvGraphicFramePr>
+            <a:graphic xmlns:a="http://schemas.openxmlformats.org/drawingml/2006/main">
+              <a:graphicData uri="http://schemas.openxmlformats.org/drawingml/2006/picture">
+                <pic:pic xmlns:pic="http://schemas.openxmlformats.org/drawingml/2006/picture">
+                  <pic:nvPicPr>
+                    <pic:cNvPr id="0" name="Picture 12"/>
+                    <pic:cNvPicPr>
+                      <a:picLocks noChangeAspect="1" noChangeArrowheads="1"/>
+                    </pic:cNvPicPr>
+                  </pic:nvPicPr>
+                  <pic:blipFill>
+                    <a:blip r:embed="rId10" cstate="print">
+                      <a:extLst>
+                        <a:ext uri="{28A0092B-C50C-407E-A947-70E740481C1C}">
+                          <a14:useLocalDpi xmlns:a14="http://schemas.microsoft.com/office/drawing/2010/main" val="0"/>
+                        </a:ext>
+                      </a:extLst>
+                    </a:blip>
+                    <a:srcRect/>
+                    <a:stretch>
+                      <a:fillRect/>
+                    </a:stretch>
+                  </pic:blipFill>
+                  <pic:spPr bwMode="auto">
+                    <a:xfrm>
+                      <a:off x="0" y="0"/>
+                      <a:ext cx="5753100" cy="2346960"/>
+                    </a:xfrm>
+                    <a:prstGeom prst="rect">
+                      <a:avLst/>
+                    </a:prstGeom>
+                    <a:noFill/>
+                    <a:ln>
+                      <a:noFill/>
+                    </a:ln>
+                  </pic:spPr>
+                </pic:pic>
+              </a:graphicData>
+            </a:graphic>
+          </wp:inline>
+        </w:drawing>
+      </w:r>
+    </w:p>
+    <w:p>
+      <w:pPr>
+        <w:pStyle w:val="onVnHH"/>
         <w:ind w:firstLine="567"/>
-      </w:pPr>
-      <w:r>
+        <w:rPr>
+          <w:sz w:val="24"/>
+        </w:rPr>
+      </w:pPr>
+      <w:r>
+        <w:t>Trong ứng dụng nghe nhạc, React hỗ trợ cập nhật riêng phần giao diện chịu ảnh hưởng bởi thay đổi dữ liệu, chẳng hạn thông tin bài hát đang phát hoặc trạng thái yêu thích. Cơ chế điều hướng phía trình duyệt của SPA giúp chuyển giữa các màn hình mà không phải tải lại toàn bộ tài liệu HTML; việc duy trì phát nhạc vẫn cần bố trí trình phát ở vùng giao diện dùng chung và quản lý vòng đời đối tượng audio phù hợp.</w:t>
+      </w:r>
+    </w:p>
+    <w:p>
+      <w:pPr>
+        <w:pStyle w:val="onVnHH"/>
+        <w:rPr>
+          <w:sz w:val="24"/>
+        </w:rPr>
+      </w:pPr>
+      <w:r>
+        <w:t>Các điểm áp dụng chính trong đề tài:</w:t>
+      </w:r>
+    </w:p>
+    <w:p>
+      <w:pPr>
+        <w:pStyle w:val="onVnHH"/>
+        <w:numPr>
+          <w:ilvl w:val="0"/>
+          <w:numId w:val="23"/>
+        </w:numPr>
+        <w:rPr>
+          <w:sz w:val="24"/>
+        </w:rPr>
+      </w:pPr>
+      <w:r>
+        <w:t>Tách giao diện thành các thành phần có trách nhiệm rõ ràng để thuận lợi tái sử dụng và bảo trì.</w:t>
+      </w:r>
+    </w:p>
+    <w:p>
+      <w:pPr>
+        <w:pStyle w:val="onVnHH"/>
+        <w:numPr>
+          <w:ilvl w:val="0"/>
+          <w:numId w:val="23"/>
+        </w:numPr>
+        <w:rPr>
+          <w:sz w:val="24"/>
+        </w:rPr>
+      </w:pPr>
+      <w:r>
+        <w:t>Kết hợp Vite làm công cụ phục vụ phát triển và đóng gói mã nguồn; Vite không thay thế React mà hỗ trợ quy trình làm việc với dự án Frontend.</w:t>
+      </w:r>
+    </w:p>
+    <w:p>
+      <w:pPr>
+        <w:pStyle w:val="onVnHH"/>
+        <w:ind w:firstLine="567"/>
         <w:rPr>
           <w:i/>
           <w:iCs/>
           <w:u w:val="single"/>
         </w:rPr>
+      </w:pPr>
+    </w:p>
+    <w:p>
+      <w:pPr>
+        <w:pStyle w:val="onVnHH"/>
+        <w:ind w:firstLine="567"/>
+      </w:pPr>
+      <w:r>
+        <w:rPr>
+          <w:i/>
+          <w:iCs/>
+          <w:u w:val="single"/>
+        </w:rPr>
+        <w:lastRenderedPageBreak/>
         <w:t>Zustand:</w:t>
       </w:r>
       <w:r>
         <w:t xml:space="preserve"> Là thư viện quản lý trạng thái toàn cục, được sử dụng để lưu trữ trạng thái trình phát nhạc như bài hát hiện tại, trạng thái phát/dừng, âm lượng và hàng đợi phát. Nhờ đó, trình phát có thể duy trì trạng thái khi người dùng chuyển giữa các trang.</w:t>
+      </w:r>
+    </w:p>
+    <w:p>
+      <w:pPr>
+        <w:pStyle w:val="onVnHH"/>
+        <w:ind w:firstLine="567"/>
+      </w:pPr>
+      <w:r>
+        <w:t>Cung cấp cách tạo store dùng chung để các thành phần cần thiết đọc hoặc cập nhật trạng thái mà không phải truyền dữ liệu qua nhiều tầng component. Store có thể chứa cả dữ liệu trạng thái và các hàm thao tác trạng thái; phạm vi sử dụng nên được giới hạn ở dữ liệu thực sự cần chia sẻ để tránh làm ứng dụng khó kiểm soát.</w:t>
+      </w:r>
+    </w:p>
+    <w:p>
+      <w:pPr>
+        <w:pStyle w:val="onVnHH"/>
+        <w:ind w:firstLine="567"/>
+      </w:pPr>
+      <w:r>
+        <w:t>Đối với trình phát nhạc, một store có thể quản lý mã bài hát hiện tại, danh sách chờ, vị trí phát, âm lượng, chế độ phát lặp/ngẫu nhiên và trạng thái đang phát. Khi người dùng chuyển trang, các thành phần giao diện mới vẫn có thể đọc cùng một trạng thái phát. Zustand quản lý trạng thái giao diện; việc phát/giải mã âm thanh do trình duyệt và phần tử Audio đảm nhiệm, vì vậy cần đồng bộ sự kiện của Audio với store.</w:t>
+      </w:r>
+    </w:p>
+    <w:p>
+      <w:pPr>
+        <w:pStyle w:val="onVnHH"/>
+      </w:pPr>
+      <w:r>
+        <w:t>Một số nguyên tắc sử dụng:</w:t>
+      </w:r>
+    </w:p>
+    <w:p>
+      <w:pPr>
+        <w:pStyle w:val="onVnHH"/>
+        <w:numPr>
+          <w:ilvl w:val="0"/>
+          <w:numId w:val="24"/>
+        </w:numPr>
+      </w:pPr>
+      <w:r>
+        <w:t>Chỉ cập nhật những trường trạng thái có liên quan đến thao tác, giúp giao diện phản hồi đúng và dễ dự đoán.</w:t>
+      </w:r>
+    </w:p>
+    <w:p>
+      <w:pPr>
+        <w:pStyle w:val="onVnHH"/>
+        <w:numPr>
+          <w:ilvl w:val="0"/>
+          <w:numId w:val="24"/>
+        </w:numPr>
+      </w:pPr>
+      <w:r>
+        <w:t>Tách các hành động như play, pause, next và setVolume thành hàm có mục đích rõ ràng; kiểm thử các chuyển trạng thái quan trọng.</w:t>
+      </w:r>
+    </w:p>
+    <w:p>
+      <w:pPr>
+        <w:pStyle w:val="onVnHH"/>
+        <w:numPr>
+          <w:ilvl w:val="0"/>
+          <w:numId w:val="24"/>
+        </w:numPr>
+      </w:pPr>
+      <w:r>
+        <w:t>Không lưu dữ liệu nhạy cảm hoặc thay thế cơ chế xác thực của máy chủ bằng store phía trình duyệt.</w:t>
       </w:r>
     </w:p>
     <w:p>
@@ -5026,7 +5252,7 @@
           <w:noProof/>
         </w:rPr>
         <w:drawing>
-          <wp:inline distT="0" distB="0" distL="0" distR="0" wp14:anchorId="62F7DAF0" wp14:editId="5997166F">
+          <wp:inline distT="0" distB="0" distL="0" distR="0" wp14:anchorId="3EC0820C" wp14:editId="7A49D1F5">
             <wp:extent cx="5120640" cy="1809231"/>
             <wp:effectExtent l="0" t="0" r="0" b="0"/>
             <wp:docPr id="101" name="Hình minh họa 2.1. Nhóm công nghệ Frontend và vai trò trong ứng dụng SPA" descr="Hình minh họa 2.1. Nhóm công nghệ Frontend và vai trò trong ứng dụng SPA"/>
@@ -5038,403 +5264,6 @@
                 <pic:pic xmlns:pic="http://schemas.openxmlformats.org/drawingml/2006/picture">
                   <pic:nvPicPr>
                     <pic:cNvPr id="101" name="Hình minh họa 2.1. Nhóm công nghệ Frontend và vai trò trong ứng dụng SPA"/>
-                    <pic:cNvPicPr/>
-                  </pic:nvPicPr>
-                  <pic:blipFill>
-                    <a:blip r:embed="rId9"/>
-                    <a:stretch>
-                      <a:fillRect/>
-                    </a:stretch>
-                  </pic:blipFill>
-                  <pic:spPr>
-                    <a:xfrm>
-                      <a:off x="0" y="0"/>
-                      <a:ext cx="5943600" cy="2100000"/>
-                    </a:xfrm>
-                    <a:prstGeom prst="rect">
-                      <a:avLst/>
-                    </a:prstGeom>
-                  </pic:spPr>
-                </pic:pic>
-              </a:graphicData>
-            </a:graphic>
-          </wp:inline>
-        </w:drawing>
-      </w:r>
-    </w:p>
-    <w:p>
-      <w:pPr>
-        <w:pStyle w:val="onVnHH"/>
-        <w:ind w:firstLine="567"/>
-      </w:pPr>
-      <w:r>
-        <w:rPr>
-          <w:i/>
-          <w:iCs/>
-          <w:u w:val="single"/>
-        </w:rPr>
-        <w:t>Axios:</w:t>
-      </w:r>
-      <w:r>
-        <w:t xml:space="preserve"> Là thư viện hỗ trợ gửi các yêu cầu HTTP từ Frontend đến Backend thông qua RESTful API. Axios được sử dụng để thực hiện các thao tác như đăng nhập, tìm kiếm bài hát, quản lý playlist và gửi dữ liệu đăng tải bài hát.</w:t>
-      </w:r>
-    </w:p>
-    <w:p>
-      <w:pPr>
-        <w:pStyle w:val="onVnHH"/>
-        <w:ind w:firstLine="567"/>
-      </w:pPr>
-      <w:r>
-        <w:rPr>
-          <w:i/>
-          <w:iCs/>
-          <w:u w:val="single"/>
-        </w:rPr>
-        <w:t>Tailwind CSS + Shadcn UI:</w:t>
-      </w:r>
-      <w:r>
-        <w:t xml:space="preserve"> Tailwind CSS hỗ trợ thiết kế giao diện thông qua các lớp tiện ích, giúp tùy chỉnh bố cục và màu sắc nhanh chóng. Shadcn UI cung cấp các thành phần giao diện có thể tùy chỉnh và tái sử dụng. Hai công nghệ được kết hợp để xây dựng giao diện theo phong cách Dark Theme, phù hợp với ứng dụng nghe nhạc trực tuyến.</w:t>
-      </w:r>
-    </w:p>
-    <w:p>
-      <w:pPr>
-        <w:pStyle w:val="u3"/>
-        <w:rPr>
-          <w:lang w:val="de-DE"/>
-        </w:rPr>
-      </w:pPr>
-      <w:r>
-        <w:rPr>
-          <w:lang w:val="de-DE"/>
-        </w:rPr>
-        <w:t>Back</w:t>
-      </w:r>
-      <w:r>
-        <w:rPr>
-          <w:lang w:val="de-DE"/>
-        </w:rPr>
-        <w:t>e</w:t>
-      </w:r>
-      <w:r>
-        <w:rPr>
-          <w:lang w:val="de-DE"/>
-        </w:rPr>
-        <w:t>nd</w:t>
-      </w:r>
-      <w:bookmarkEnd w:id="4"/>
-    </w:p>
-    <w:p>
-      <w:pPr>
-        <w:pStyle w:val="onVnHH"/>
-        <w:ind w:firstLine="567"/>
-        <w:rPr>
-          <w:i/>
-          <w:iCs/>
-          <w:u w:val="single"/>
-          <w:lang w:val="de-DE"/>
-        </w:rPr>
-      </w:pPr>
-      <w:bookmarkStart w:id="5" w:name="_Toc242968874"/>
-      <w:r>
-        <w:rPr>
-          <w:bCs/>
-          <w:i/>
-          <w:iCs/>
-          <w:u w:val="single"/>
-        </w:rPr>
-        <w:t>Spring Boot:</w:t>
-      </w:r>
-      <w:r>
-        <w:t xml:space="preserve"> Nền tảng phát triển ứng dụng Java, hỗ trợ cấu hình tự động và xây dựng ứng dụng web/API theo mô hình Spring. Trong đề tài, Spring Boot tổ chức các endpoint REST, tiếp nhận yêu cầu từ Frontend, gọi các lớp nghiệp vụ và phối hợp với tầng truy cập dữ liệu.</w:t>
-      </w:r>
-    </w:p>
-    <w:p>
-      <w:pPr>
-        <w:pStyle w:val="onVnHH"/>
-        <w:ind w:firstLine="567"/>
-        <w:rPr>
-          <w:i/>
-          <w:iCs/>
-          <w:u w:val="single"/>
-        </w:rPr>
-      </w:pPr>
-      <w:r>
-        <w:rPr>
-          <w:bCs/>
-          <w:i/>
-          <w:iCs/>
-          <w:u w:val="single"/>
-        </w:rPr>
-        <w:t>Spring Security và JWT:</w:t>
-      </w:r>
-      <w:r>
-        <w:t xml:space="preserve"> Spring Security cung cấp cơ chế xác thực và kiểm soát quyền truy cập cho các endpoint. Sau khi đăng nhập thành công, hệ thống có thể cấp JSON Web Token (JWT) để client gửi kèm các yêu cầu tiếp theo; Backend xác minh </w:t>
-      </w:r>
-      <w:r>
-        <w:lastRenderedPageBreak/>
-        <w:t>token và áp dụng quyền tương ứng với vai trò người dùng. Token cần được truyền qua HTTPS, kiểm tra chữ ký và thời hạn; không lưu thông tin nhạy cảm bên trong payload.</w:t>
-      </w:r>
-    </w:p>
-    <w:p>
-      <w:pPr>
-        <w:pStyle w:val="onVnHH"/>
-        <w:ind w:firstLine="567"/>
-      </w:pPr>
-      <w:r>
-        <w:rPr>
-          <w:bCs/>
-          <w:i/>
-          <w:iCs/>
-          <w:u w:val="single"/>
-        </w:rPr>
-        <w:t>Spring Data JPA (Hibernate):</w:t>
-      </w:r>
-      <w:r>
-        <w:t xml:space="preserve"> Spring Data JPA hỗ trợ thao tác dữ liệu theo chuẩn JPA thông qua repository, giảm mã truy vấn lặp lại; Hibernate là bộ triển khai ORM ánh xạ đối tượng Java với bảng quan hệ. Công nghệ này được sử dụng để lưu và truy xuất các thực thể như tài khoản, bài hát, album và playlist. Các ràng buộc, giao dịch và truy vấn cần được thiết kế phù hợp với yêu cầu hệ thống.</w:t>
-      </w:r>
-    </w:p>
-    <w:p>
-      <w:pPr>
-        <w:pStyle w:val="onVnHH"/>
-        <w:jc w:val="center"/>
-        <w:rPr>
-          <w:i/>
-          <w:iCs/>
-          <w:u w:val="single"/>
-        </w:rPr>
-      </w:pPr>
-      <w:r>
-        <w:rPr>
-          <w:noProof/>
-        </w:rPr>
-        <w:drawing>
-          <wp:inline distT="0" distB="0" distL="0" distR="0" wp14:anchorId="5B5A20F5" wp14:editId="2BAF4407">
-            <wp:extent cx="5394961" cy="1906154"/>
-            <wp:effectExtent l="0" t="0" r="0" b="0"/>
-            <wp:docPr id="102" name="Hình minh họa 2.2. Luồng xử lý và các thành phần Backend" descr="Hình minh họa 2.2. Luồng xử lý và các thành phần Backend"/>
-            <wp:cNvGraphicFramePr>
-              <a:graphicFrameLocks xmlns:a="http://schemas.openxmlformats.org/drawingml/2006/main" noChangeAspect="1"/>
-            </wp:cNvGraphicFramePr>
-            <a:graphic xmlns:a="http://schemas.openxmlformats.org/drawingml/2006/main">
-              <a:graphicData uri="http://schemas.openxmlformats.org/drawingml/2006/picture">
-                <pic:pic xmlns:pic="http://schemas.openxmlformats.org/drawingml/2006/picture">
-                  <pic:nvPicPr>
-                    <pic:cNvPr id="102" name="Hình minh họa 2.2. Luồng xử lý và các thành phần Backend"/>
-                    <pic:cNvPicPr/>
-                  </pic:nvPicPr>
-                  <pic:blipFill>
-                    <a:blip r:embed="rId10"/>
-                    <a:stretch>
-                      <a:fillRect/>
-                    </a:stretch>
-                  </pic:blipFill>
-                  <pic:spPr>
-                    <a:xfrm>
-                      <a:off x="0" y="0"/>
-                      <a:ext cx="5943600" cy="2100000"/>
-                    </a:xfrm>
-                    <a:prstGeom prst="rect">
-                      <a:avLst/>
-                    </a:prstGeom>
-                  </pic:spPr>
-                </pic:pic>
-              </a:graphicData>
-            </a:graphic>
-          </wp:inline>
-        </w:drawing>
-      </w:r>
-    </w:p>
-    <w:p>
-      <w:pPr>
-        <w:pStyle w:val="u3"/>
-        <w:rPr>
-          <w:lang w:val="de-DE"/>
-        </w:rPr>
-      </w:pPr>
-      <w:r>
-        <w:rPr>
-          <w:lang w:val="de-DE"/>
-        </w:rPr>
-        <w:t>Cơ sở dữ liệu</w:t>
-      </w:r>
-      <w:bookmarkEnd w:id="5"/>
-    </w:p>
-    <w:p>
-      <w:pPr>
-        <w:rPr>
-          <w:rFonts w:ascii="Times New Roman" w:hAnsi="Times New Roman"/>
-          <w:i/>
-          <w:iCs/>
-          <w:u w:val="single"/>
-          <w:lang w:val="de-DE"/>
-        </w:rPr>
-      </w:pPr>
-      <w:r>
-        <w:rPr>
-          <w:rFonts w:ascii="Times New Roman" w:hAnsi="Times New Roman"/>
-          <w:i/>
-          <w:iCs/>
-          <w:u w:val="single"/>
-          <w:lang w:val="de-DE"/>
-        </w:rPr>
-        <w:t>PostgreSQL</w:t>
-      </w:r>
-    </w:p>
-    <w:p>
-      <w:pPr>
-        <w:pStyle w:val="u3"/>
-        <w:rPr>
-          <w:lang w:val="de-DE"/>
-        </w:rPr>
-      </w:pPr>
-      <w:bookmarkStart w:id="6" w:name="_Toc242968875"/>
-      <w:r>
-        <w:rPr>
-          <w:lang w:val="de-DE"/>
-        </w:rPr>
-        <w:t>Công cụ sử dụng</w:t>
-      </w:r>
-      <w:bookmarkEnd w:id="6"/>
-    </w:p>
-    <w:p>
-      <w:pPr>
-        <w:ind w:firstLine="567"/>
-        <w:rPr>
-          <w:rFonts w:eastAsiaTheme="majorEastAsia"/>
-          <w:lang w:val="de-DE"/>
-        </w:rPr>
-      </w:pPr>
-      <w:r>
-        <w:rPr>
-          <w:rFonts w:eastAsiaTheme="majorEastAsia"/>
-          <w:lang w:val="de-DE"/>
-        </w:rPr>
-        <w:t>Vscode, drawio</w:t>
-      </w:r>
-    </w:p>
-    <w:p>
-      <w:pPr>
-        <w:spacing w:before="120" w:after="120" w:line="360" w:lineRule="auto"/>
-        <w:rPr>
-          <w:rFonts w:ascii="Times New Roman" w:eastAsiaTheme="majorEastAsia" w:hAnsi="Times New Roman" w:cstheme="majorBidi"/>
-          <w:b/>
-          <w:color w:val="000000" w:themeColor="text1"/>
-          <w:szCs w:val="26"/>
-          <w:lang w:val="de-DE"/>
-        </w:rPr>
-      </w:pPr>
-      <w:bookmarkStart w:id="7" w:name="_Toc242968876"/>
-      <w:r>
-        <w:rPr>
-          <w:lang w:val="de-DE"/>
-        </w:rPr>
-        <w:br w:type="page"/>
-      </w:r>
-    </w:p>
-    <w:p>
-      <w:pPr>
-        <w:pStyle w:val="u2"/>
-        <w:rPr>
-          <w:lang w:val="de-DE"/>
-        </w:rPr>
-      </w:pPr>
-      <w:r>
-        <w:rPr>
-          <w:lang w:val="de-DE"/>
-        </w:rPr>
-        <w:lastRenderedPageBreak/>
-        <w:t>Kiến trúc hệ thống</w:t>
-      </w:r>
-      <w:bookmarkEnd w:id="7"/>
-    </w:p>
-    <w:p>
-      <w:pPr>
-        <w:rPr>
-          <w:lang w:val="de-DE"/>
-        </w:rPr>
-      </w:pPr>
-      <w:r>
-        <w:rPr>
-          <w:lang w:val="de-DE"/>
-        </w:rPr>
-        <w:t>MVC</w:t>
-      </w:r>
-    </w:p>
-    <w:p>
-      <w:pPr>
-        <w:spacing w:before="120" w:after="120" w:line="360" w:lineRule="auto"/>
-        <w:rPr>
-          <w:rFonts w:ascii="Times New Roman" w:eastAsiaTheme="majorEastAsia" w:hAnsi="Times New Roman" w:cstheme="majorBidi"/>
-          <w:b/>
-          <w:color w:val="000000" w:themeColor="text1"/>
-          <w:szCs w:val="26"/>
-          <w:lang w:val="de-DE"/>
-        </w:rPr>
-      </w:pPr>
-      <w:bookmarkStart w:id="8" w:name="_Toc242968877"/>
-      <w:r>
-        <w:rPr>
-          <w:lang w:val="de-DE"/>
-        </w:rPr>
-        <w:br w:type="page"/>
-      </w:r>
-    </w:p>
-    <w:p>
-      <w:pPr>
-        <w:pStyle w:val="u2"/>
-        <w:rPr>
-          <w:lang w:val="de-DE"/>
-        </w:rPr>
-      </w:pPr>
-      <w:r>
-        <w:rPr>
-          <w:lang w:val="de-DE"/>
-        </w:rPr>
-        <w:lastRenderedPageBreak/>
-        <w:t>Công cụ hỗ trợ</w:t>
-      </w:r>
-      <w:bookmarkEnd w:id="8"/>
-    </w:p>
-    <w:p>
-      <w:pPr>
-        <w:pStyle w:val="onVnHH"/>
-        <w:ind w:firstLine="510"/>
-        <w:rPr>
-          <w:rFonts w:eastAsiaTheme="majorEastAsia"/>
-          <w:lang w:val="de-DE"/>
-        </w:rPr>
-      </w:pPr>
-      <w:r>
-        <w:rPr>
-          <w:rStyle w:val="onVnHHChar"/>
-        </w:rPr>
-        <w:t>Visual Studio Code và diagrams.net (draw.io): Visual Studio Code là trình soạn thảo mã nguồn dùng để viết, tìm kiếm, chạy và gỡ lỗi dự án thông qua các tiện ích mở rộng phù hợp. diagrams.net (tên miền draw.io) là công cụ tạo sơ đồ, hỗ trợ phác thảo kiến trúc, quy trình và biểu đồ phục vụ phân tích, thiết kế. Hai công cụ hỗ trợ các công đoạn khác nhau: VS Code làm việc với mã nguồn, còn diagrams.net trực quan hóa thiết kế</w:t>
-      </w:r>
-      <w:r>
-        <w:t>.</w:t>
-      </w:r>
-    </w:p>
-    <w:p>
-      <w:pPr>
-        <w:jc w:val="center"/>
-      </w:pPr>
-      <w:r>
-        <w:rPr>
-          <w:noProof/>
-        </w:rPr>
-        <w:drawing>
-          <wp:inline distT="0" distB="0" distL="0" distR="0" wp14:anchorId="1B4C07A2" wp14:editId="4ECD9955">
-            <wp:extent cx="5349240" cy="1890000"/>
-            <wp:effectExtent l="0" t="0" r="0" b="0"/>
-            <wp:docPr id="104" name="Hình minh họa 2.4. Vai trò của các công cụ phát triển và thiết kế" descr="Hình minh họa 2.4. Vai trò của các công cụ phát triển và thiết kế"/>
-            <wp:cNvGraphicFramePr>
-              <a:graphicFrameLocks xmlns:a="http://schemas.openxmlformats.org/drawingml/2006/main" noChangeAspect="1"/>
-            </wp:cNvGraphicFramePr>
-            <a:graphic xmlns:a="http://schemas.openxmlformats.org/drawingml/2006/main">
-              <a:graphicData uri="http://schemas.openxmlformats.org/drawingml/2006/picture">
-                <pic:pic xmlns:pic="http://schemas.openxmlformats.org/drawingml/2006/picture">
-                  <pic:nvPicPr>
-                    <pic:cNvPr id="104" name="Hình minh họa 2.4. Vai trò của các công cụ phát triển và thiết kế"/>
                     <pic:cNvPicPr/>
                   </pic:nvPicPr>
                   <pic:blipFill>
@@ -5462,6 +5291,1422 @@
     <w:p>
       <w:pPr>
         <w:spacing w:before="120" w:after="120" w:line="360" w:lineRule="auto"/>
+        <w:rPr>
+          <w:rFonts w:ascii="Times New Roman" w:hAnsi="Times New Roman"/>
+          <w:i/>
+          <w:iCs/>
+          <w:u w:val="single"/>
+        </w:rPr>
+      </w:pPr>
+      <w:r>
+        <w:rPr>
+          <w:i/>
+          <w:iCs/>
+          <w:u w:val="single"/>
+        </w:rPr>
+        <w:br w:type="page"/>
+      </w:r>
+    </w:p>
+    <w:p>
+      <w:pPr>
+        <w:pStyle w:val="onVnHH"/>
+        <w:ind w:firstLine="567"/>
+      </w:pPr>
+      <w:r>
+        <w:rPr>
+          <w:i/>
+          <w:iCs/>
+          <w:u w:val="single"/>
+        </w:rPr>
+        <w:lastRenderedPageBreak/>
+        <w:t>Axios:</w:t>
+      </w:r>
+      <w:r>
+        <w:t xml:space="preserve"> Là thư viện hỗ trợ gửi các yêu cầu HTTP từ Frontend đến Backend thông qua RESTful API. Axios được sử dụng để thực hiện các thao tác như đăng nhập, tìm kiếm bài hát, quản lý playlist và gửi dữ liệu đăng tải bài hát.</w:t>
+      </w:r>
+    </w:p>
+    <w:p>
+      <w:pPr>
+        <w:pStyle w:val="onVnHH"/>
+        <w:ind w:firstLine="567"/>
+      </w:pPr>
+      <w:r>
+        <w:t>Quy trình giao tiếp thường gồm: giao diện phát sinh thao tác → Frontend gửi yêu cầu HTTP đến endpoint tương ứng → Backend kiểm tra dữ liệu và xử lý nghiệp vụ → Axios nhận phản hồi → giao diện cập nhật trạng thái và hiển thị kết quả. Các trạng thái đang tải, thành công và lỗi cần được xử lý riêng để người dùng biết kết quả thao tác.</w:t>
+      </w:r>
+      <w:r>
+        <w:rPr>
+          <w:noProof/>
+        </w:rPr>
+        <w:drawing>
+          <wp:inline distT="0" distB="0" distL="0" distR="0" wp14:anchorId="7D08AEC5" wp14:editId="5125A4B1">
+            <wp:extent cx="5753100" cy="2194560"/>
+            <wp:effectExtent l="0" t="0" r="0" b="0"/>
+            <wp:docPr id="1373753362" name="Hình ảnh 3"/>
+            <wp:cNvGraphicFramePr>
+              <a:graphicFrameLocks xmlns:a="http://schemas.openxmlformats.org/drawingml/2006/main" noChangeAspect="1"/>
+            </wp:cNvGraphicFramePr>
+            <a:graphic xmlns:a="http://schemas.openxmlformats.org/drawingml/2006/main">
+              <a:graphicData uri="http://schemas.openxmlformats.org/drawingml/2006/picture">
+                <pic:pic xmlns:pic="http://schemas.openxmlformats.org/drawingml/2006/picture">
+                  <pic:nvPicPr>
+                    <pic:cNvPr id="0" name="Picture 6"/>
+                    <pic:cNvPicPr>
+                      <a:picLocks noChangeAspect="1" noChangeArrowheads="1"/>
+                    </pic:cNvPicPr>
+                  </pic:nvPicPr>
+                  <pic:blipFill>
+                    <a:blip r:embed="rId12">
+                      <a:extLst>
+                        <a:ext uri="{28A0092B-C50C-407E-A947-70E740481C1C}">
+                          <a14:useLocalDpi xmlns:a14="http://schemas.microsoft.com/office/drawing/2010/main" val="0"/>
+                        </a:ext>
+                      </a:extLst>
+                    </a:blip>
+                    <a:srcRect/>
+                    <a:stretch>
+                      <a:fillRect/>
+                    </a:stretch>
+                  </pic:blipFill>
+                  <pic:spPr bwMode="auto">
+                    <a:xfrm>
+                      <a:off x="0" y="0"/>
+                      <a:ext cx="5753100" cy="2194560"/>
+                    </a:xfrm>
+                    <a:prstGeom prst="rect">
+                      <a:avLst/>
+                    </a:prstGeom>
+                    <a:noFill/>
+                    <a:ln>
+                      <a:noFill/>
+                    </a:ln>
+                  </pic:spPr>
+                </pic:pic>
+              </a:graphicData>
+            </a:graphic>
+          </wp:inline>
+        </w:drawing>
+      </w:r>
+    </w:p>
+    <w:p>
+      <w:pPr>
+        <w:pStyle w:val="onVnHH"/>
+      </w:pPr>
+      <w:r>
+        <w:t>Khi triển khai:</w:t>
+      </w:r>
+    </w:p>
+    <w:p>
+      <w:pPr>
+        <w:pStyle w:val="onVnHH"/>
+        <w:numPr>
+          <w:ilvl w:val="0"/>
+          <w:numId w:val="26"/>
+        </w:numPr>
+      </w:pPr>
+      <w:r>
+        <w:t>Dùng phương thức HTTP phù hợp với mục đích và truyền tham số/dữ liệu theo hợp đồng API đã thống nhất.</w:t>
+      </w:r>
+    </w:p>
+    <w:p>
+      <w:pPr>
+        <w:pStyle w:val="onVnHH"/>
+        <w:numPr>
+          <w:ilvl w:val="0"/>
+          <w:numId w:val="26"/>
+        </w:numPr>
+      </w:pPr>
+      <w:r>
+        <w:t>Chuẩn hóa xử lý lỗi mạng, lỗi xác thực và lỗi nghiệp vụ; tránh hiển thị nguyên văn thông tin kỹ thuật nhạy cảm.</w:t>
+      </w:r>
+    </w:p>
+    <w:p>
+      <w:pPr>
+        <w:pStyle w:val="onVnHH"/>
+        <w:numPr>
+          <w:ilvl w:val="0"/>
+          <w:numId w:val="26"/>
+        </w:numPr>
+      </w:pPr>
+      <w:r>
+        <w:t>Khi gửi token, chỉ sử dụng kênh HTTPS trong môi trường triển khai và cân nhắc cách lưu trữ token an toàn; không ghi token vào log.</w:t>
+      </w:r>
+    </w:p>
+    <w:p>
+      <w:pPr>
+        <w:pStyle w:val="onVnHH"/>
+        <w:ind w:firstLine="567"/>
+      </w:pPr>
+      <w:r>
+        <w:t>Tailwind CSS và shadcn/ui: Tailwind CSS là hệ thống utility-first, cho phép mô tả trực tiếp bố cục, khoảng cách, màu sắc, kiểu chữ và trạng thái tương tác thông qua các lớp tiện ích. shadcn/ui cung cấp mã nguồn các thành phần giao diện có thể đưa vào dự án và tùy chỉnh; đây không phải bộ giao diện đóng chỉ dùng nguyên trạng. Kết hợp hai công cụ giúp duy trì phong cách nhất quán, đồng thời cho phép điều chỉnh chi tiết theo nhu cầu ứng dụng.</w:t>
+      </w:r>
+    </w:p>
+    <w:p>
+      <w:pPr>
+        <w:spacing w:before="120" w:after="120" w:line="360" w:lineRule="auto"/>
+        <w:rPr>
+          <w:rFonts w:ascii="Times New Roman" w:hAnsi="Times New Roman"/>
+        </w:rPr>
+      </w:pPr>
+      <w:r>
+        <w:br w:type="page"/>
+      </w:r>
+    </w:p>
+    <w:p>
+      <w:pPr>
+        <w:pStyle w:val="onVnHH"/>
+        <w:ind w:firstLine="567"/>
+        <w:rPr>
+          <w:sz w:val="24"/>
+        </w:rPr>
+      </w:pPr>
+      <w:r>
+        <w:lastRenderedPageBreak/>
+        <w:t>Trong website nghe nhạc, Tailwind CSS có thể được dùng để xây dựng bố cục co giãn theo kích thước màn hình, trạng thái hover/focus và giao diện tối. shadcn/ui hỗ trợ các thành phần tương tác thường gặp như nút, hộp thoại, menu, tab hoặc thông báo; các thành phần cần được chọn và điều chỉnh phù hợp với thiết kế, không nên sử dụng dàn trải.</w:t>
+      </w:r>
+    </w:p>
+    <w:p>
+      <w:pPr>
+        <w:pStyle w:val="onVnHH"/>
+        <w:rPr>
+          <w:sz w:val="24"/>
+        </w:rPr>
+      </w:pPr>
+      <w:r>
+        <w:t>Khi sử dụng:</w:t>
+      </w:r>
+    </w:p>
+    <w:p>
+      <w:pPr>
+        <w:pStyle w:val="onVnHH"/>
+        <w:numPr>
+          <w:ilvl w:val="0"/>
+          <w:numId w:val="27"/>
+        </w:numPr>
+        <w:rPr>
+          <w:sz w:val="24"/>
+        </w:rPr>
+      </w:pPr>
+      <w:r>
+        <w:t>Tạo quy ước dùng chung cho màu sắc, khoảng cách, kiểu chữ và trạng thái để các trang không bị lệch phong cách.</w:t>
+      </w:r>
+    </w:p>
+    <w:p>
+      <w:pPr>
+        <w:pStyle w:val="onVnHH"/>
+        <w:numPr>
+          <w:ilvl w:val="0"/>
+          <w:numId w:val="27"/>
+        </w:numPr>
+        <w:rPr>
+          <w:sz w:val="24"/>
+        </w:rPr>
+      </w:pPr>
+      <w:r>
+        <w:t>Kiểm tra khả năng sử dụng bằng bàn phím, độ tương phản, nhãn điều khiển và hiển thị trên màn hình nhỏ.</w:t>
+      </w:r>
+    </w:p>
+    <w:p>
+      <w:pPr>
+        <w:pStyle w:val="onVnHH"/>
+        <w:numPr>
+          <w:ilvl w:val="0"/>
+          <w:numId w:val="27"/>
+        </w:numPr>
+        <w:rPr>
+          <w:sz w:val="24"/>
+        </w:rPr>
+      </w:pPr>
+      <w:r>
+        <w:t>Tùy biến thành phần theo thiết kế của đề tài, đồng thời kiểm soát số lượng lớp tiện ích để mã giao diện vẫn dễ đọc.</w:t>
+      </w:r>
+    </w:p>
+    <w:p>
+      <w:pPr>
+        <w:pStyle w:val="u3"/>
+        <w:rPr>
+          <w:lang w:val="de-DE"/>
+        </w:rPr>
+      </w:pPr>
+      <w:r>
+        <w:rPr>
+          <w:lang w:val="de-DE"/>
+        </w:rPr>
+        <w:t>Backend</w:t>
+      </w:r>
+      <w:bookmarkEnd w:id="5"/>
+    </w:p>
+    <w:p>
+      <w:pPr>
+        <w:pStyle w:val="onVnHH"/>
+        <w:ind w:firstLine="567"/>
+        <w:rPr>
+          <w:i/>
+          <w:iCs/>
+          <w:u w:val="single"/>
+          <w:lang w:val="de-DE"/>
+        </w:rPr>
+      </w:pPr>
+      <w:bookmarkStart w:id="6" w:name="_Toc242968874"/>
+      <w:r>
+        <w:rPr>
+          <w:bCs/>
+          <w:i/>
+          <w:iCs/>
+          <w:u w:val="single"/>
+        </w:rPr>
+        <w:t>Spring Boot:</w:t>
+      </w:r>
+      <w:r>
+        <w:t xml:space="preserve"> Nền tảng phát triển ứng dụng Java, hỗ trợ cấu hình tự động và xây dựng ứng dụng web/API theo mô hình Spring. Trong đề tài, Spring Boot tổ chức các endpoint REST, tiếp nhận yêu cầu từ Frontend, gọi các lớp nghiệp vụ và phối hợp với tầng truy cập dữ liệu.</w:t>
+      </w:r>
+    </w:p>
+    <w:p>
+      <w:pPr>
+        <w:pStyle w:val="onVnHH"/>
+        <w:ind w:firstLine="510"/>
+      </w:pPr>
+      <w:r>
+        <w:t>Spring Boot được lựa chọn thay vì PHP, C# hoặc Python nhờ khả năng tổ chức mã nguồn theo kiến trúc phân lớp, hỗ trợ xây dựng REST API và tích hợp hiệu quả với các công nghệ như Spring Security, Spring Data JPA và MySQL. Java có hệ sinh thái thư viện phong phú, cơ chế kiểm soát kiểu dữ liệu chặt chẽ và khả năng bảo trì mã nguồn tốt, phù hợp với ứng dụng có nhiều chức năng quản lý và xử lý nghiệp vụ. Bên cạnh đó, Spring Boot giúp giảm khối lượng cấu hình ban đầu, thuận tiện cho việc mở rộng và kiểm thử hệ thống. Việc lựa chọn công nghệ này cũng phù hợp với định hướng học tập và vận dụng kiến thức lập trình Java vào phát triển ứng dụng web theo mô hình Client–Server.</w:t>
+      </w:r>
+    </w:p>
+    <w:p>
+      <w:pPr>
+        <w:pStyle w:val="onVnHH"/>
+        <w:ind w:firstLine="567"/>
+        <w:rPr>
+          <w:i/>
+          <w:iCs/>
+          <w:u w:val="single"/>
+          <w:lang w:val="de-DE"/>
+        </w:rPr>
+      </w:pPr>
+      <w:r>
+        <w:t>Trong ứng dụng này, Spring Boot đóng vai trò nền tảng chạy Backend và tổ chức các thành phần xử lý yêu cầu. Endpoint REST tiếp nhận dữ liệu từ trình duyệt, lớp điều khiển ánh xạ đường dẫn và phương thức HTTP, lớp dịch vụ thực hiện quy tắc nghiệp vụ, còn tầng truy cập dữ liệu phối hợp với cơ sở dữ liệu. Phân chia trách nhiệm giúp mã nguồn rõ ràng hơn và thuận tiện kiểm thử từng phần.</w:t>
+      </w:r>
+    </w:p>
+    <w:p>
+      <w:pPr>
+        <w:pStyle w:val="onVnHH"/>
+        <w:ind w:firstLine="567"/>
+        <w:rPr>
+          <w:i/>
+          <w:iCs/>
+          <w:u w:val="single"/>
+          <w:lang w:val="de-DE"/>
+        </w:rPr>
+      </w:pPr>
+      <w:r>
+        <w:lastRenderedPageBreak/>
+        <w:t>Phản hồi API nên có cấu trúc nhất quán, mã trạng thái HTTP phù hợp và chỉ trả về các trường dữ liệu cần thiết. Dữ liệu đầu vào cần được kiểm tra trước khi xử lý; các lỗi dự kiến nên được chuyển thành phản hồi dễ hiểu thay vì để lộ dấu vết lỗi nội bộ. Các endpoint liên quan đến bài hát có thể phục vụ truy vấn danh sách, tìm kiếm, thông tin chi tiết và nghiệp vụ quản lý nội dung theo quyền.</w:t>
+      </w:r>
+    </w:p>
+    <w:p>
+      <w:pPr>
+        <w:pStyle w:val="onVnHH"/>
+        <w:ind w:firstLine="567"/>
+        <w:rPr>
+          <w:i/>
+          <w:iCs/>
+          <w:u w:val="single"/>
+        </w:rPr>
+      </w:pPr>
+      <w:r>
+        <w:t>Spring Security và JWT: Spring Security là khung bảo mật tích hợp với ứng dụng Spring, hỗ trợ thiết lập chuỗi bộ lọc để xác thực yêu cầu và áp dụng quy tắc phân quyền. JSON Web Token là định dạng token mang các thông tin định danh/claims đã được ký; trong mô hình stateless, máy chủ xác minh chữ ký và thời hạn của token ở các yêu cầu được bảo vệ. Token không được xem là dữ liệu bí mật đã mã hóa: không đưa mật khẩu hay thông tin nhạy cảm vào payload. Kết nối cần sử dụng HTTPS và chính sách lưu trữ token phải được cân nhắc theo mức độ rủi ro.</w:t>
+      </w:r>
+    </w:p>
+    <w:p>
+      <w:pPr>
+        <w:pStyle w:val="onVnHH"/>
+        <w:ind w:firstLine="567"/>
+        <w:rPr>
+          <w:i/>
+          <w:iCs/>
+          <w:u w:val="single"/>
+          <w:lang w:val="de-DE"/>
+        </w:rPr>
+      </w:pPr>
+      <w:r>
+        <w:t>Sau khi xác thực thành công, hệ thống xác định danh tính người dùng và quyền/vai trò được phép thực hiện. Các thao tác như chỉnh sửa hồ sơ cá nhân, đăng bài hát hoặc xử lý nội dung quản trị cần được bảo vệ ở phía máy chủ; ẩn nút trên giao diện không thay thế cho kiểm tra quyền tại Backend.</w:t>
+      </w:r>
+    </w:p>
+    <w:p>
+      <w:pPr>
+        <w:pStyle w:val="onVnHH"/>
+        <w:numPr>
+          <w:ilvl w:val="0"/>
+          <w:numId w:val="28"/>
+        </w:numPr>
+        <w:rPr>
+          <w:i/>
+          <w:iCs/>
+          <w:u w:val="single"/>
+          <w:lang w:val="de-DE"/>
+        </w:rPr>
+      </w:pPr>
+      <w:r>
+        <w:t>Kiểm tra token ở mọi endpoint yêu cầu đăng nhập, bao gồm chữ ký, thời hạn và các điều kiện xác thực cần thiết.</w:t>
+      </w:r>
+    </w:p>
+    <w:p>
+      <w:pPr>
+        <w:pStyle w:val="onVnHH"/>
+        <w:numPr>
+          <w:ilvl w:val="0"/>
+          <w:numId w:val="28"/>
+        </w:numPr>
+        <w:rPr>
+          <w:i/>
+          <w:iCs/>
+          <w:u w:val="single"/>
+          <w:lang w:val="de-DE"/>
+        </w:rPr>
+      </w:pPr>
+      <w:r>
+        <w:t>Phân biệt xác thực (người dùng là ai) với phân quyền (người dùng được làm gì), áp dụng quyền tối thiểu cần thiết.</w:t>
+      </w:r>
+    </w:p>
+    <w:p>
+      <w:pPr>
+        <w:pStyle w:val="onVnHH"/>
+        <w:numPr>
+          <w:ilvl w:val="0"/>
+          <w:numId w:val="28"/>
+        </w:numPr>
+        <w:rPr>
+          <w:i/>
+          <w:iCs/>
+          <w:u w:val="single"/>
+          <w:lang w:val="de-DE"/>
+        </w:rPr>
+      </w:pPr>
+      <w:r>
+        <w:t>Không ghi token/mật khẩu vào nhật ký; xử lý trường hợp hết hạn, đăng xuất và thu hồi phiên theo chính sách triển khai.</w:t>
+      </w:r>
+    </w:p>
+    <w:p>
+      <w:pPr>
+        <w:pStyle w:val="onVnHH"/>
+        <w:ind w:firstLine="567"/>
+      </w:pPr>
+      <w:r>
+        <w:rPr>
+          <w:bCs/>
+          <w:i/>
+          <w:iCs/>
+          <w:u w:val="single"/>
+        </w:rPr>
+        <w:t>Spring Data JPA (Hibernate):</w:t>
+      </w:r>
+      <w:r>
+        <w:t xml:space="preserve"> Spring Data JPA hỗ trợ thao tác dữ liệu theo chuẩn JPA thông qua repository, giảm mã truy vấn lặp lại; Hibernate là bộ triển khai ORM ánh xạ đối tượng Java với bảng quan hệ. Công nghệ này được sử dụng để lưu và truy xuất các thực thể như tài khoản, bài hát, album và playlist. Các ràng buộc, giao dịch và truy vấn cần được thiết kế phù hợp với yêu cầu hệ thống.</w:t>
+      </w:r>
+    </w:p>
+    <w:p>
+      <w:pPr>
+        <w:pStyle w:val="onVnHH"/>
+        <w:ind w:firstLine="567"/>
+      </w:pPr>
+      <w:r>
+        <w:t>Thông qua repository, tầng dịch vụ có thể gọi các thao tác truy vấn/lưu dữ liệu thay vì phụ thuộc trực tiếp vào chi tiết kết nối SQL ở mọi nơi. JPA mô tả cách ánh xạ đối tượng và quan hệ; Hibernate là một hiện thực phổ biến của đặc tả này. Những nghiệp vụ gồm nhiều thao tác dữ liệu liên quan cần được đặt trong phạm vi giao dịch phù hợp để bảo đảm tính nhất quán.</w:t>
+      </w:r>
+    </w:p>
+    <w:p>
+      <w:pPr>
+        <w:pStyle w:val="onVnHH"/>
+        <w:ind w:firstLine="567"/>
+      </w:pPr>
+      <w:r>
+        <w:lastRenderedPageBreak/>
+        <w:t>ORM giúp tăng tính thuận tiện nhưng không loại bỏ nhu cầu hiểu cấu trúc quan hệ và hiệu năng truy vấn. Cần xác định rõ quan hệ giữa thực thể, tránh tải dữ liệu không cần thiết, kiểm tra truy vấn phát sinh và sử dụng phân trang với danh sách dài. Với các truy vấn tìm kiếm hoặc báo cáo đặc thù, có thể cân nhắc truy vấn tường minh sau khi đo đạc và kiểm thử.</w:t>
+      </w:r>
+    </w:p>
+    <w:p>
+      <w:pPr>
+        <w:pStyle w:val="onVnHH"/>
+        <w:jc w:val="center"/>
+        <w:rPr>
+          <w:i/>
+          <w:iCs/>
+          <w:u w:val="single"/>
+        </w:rPr>
+      </w:pPr>
+      <w:r>
+        <w:rPr>
+          <w:noProof/>
+        </w:rPr>
+        <w:drawing>
+          <wp:inline distT="0" distB="0" distL="0" distR="0" wp14:anchorId="2C2BEE26" wp14:editId="2C5BE519">
+            <wp:extent cx="5394961" cy="1906154"/>
+            <wp:effectExtent l="0" t="0" r="0" b="0"/>
+            <wp:docPr id="102" name="Hình minh họa 2.2. Luồng xử lý và các thành phần Backend" descr="Hình minh họa 2.2. Luồng xử lý và các thành phần Backend"/>
+            <wp:cNvGraphicFramePr>
+              <a:graphicFrameLocks xmlns:a="http://schemas.openxmlformats.org/drawingml/2006/main" noChangeAspect="1"/>
+            </wp:cNvGraphicFramePr>
+            <a:graphic xmlns:a="http://schemas.openxmlformats.org/drawingml/2006/main">
+              <a:graphicData uri="http://schemas.openxmlformats.org/drawingml/2006/picture">
+                <pic:pic xmlns:pic="http://schemas.openxmlformats.org/drawingml/2006/picture">
+                  <pic:nvPicPr>
+                    <pic:cNvPr id="102" name="Hình minh họa 2.2. Luồng xử lý và các thành phần Backend"/>
+                    <pic:cNvPicPr/>
+                  </pic:nvPicPr>
+                  <pic:blipFill>
+                    <a:blip r:embed="rId13"/>
+                    <a:stretch>
+                      <a:fillRect/>
+                    </a:stretch>
+                  </pic:blipFill>
+                  <pic:spPr>
+                    <a:xfrm>
+                      <a:off x="0" y="0"/>
+                      <a:ext cx="5943600" cy="2100000"/>
+                    </a:xfrm>
+                    <a:prstGeom prst="rect">
+                      <a:avLst/>
+                    </a:prstGeom>
+                  </pic:spPr>
+                </pic:pic>
+              </a:graphicData>
+            </a:graphic>
+          </wp:inline>
+        </w:drawing>
+      </w:r>
+    </w:p>
+    <w:p>
+      <w:pPr>
+        <w:pStyle w:val="u3"/>
+        <w:rPr>
+          <w:lang w:val="de-DE"/>
+        </w:rPr>
+      </w:pPr>
+      <w:r>
+        <w:rPr>
+          <w:lang w:val="de-DE"/>
+        </w:rPr>
+        <w:t>Cơ sở dữ liệu</w:t>
+      </w:r>
+      <w:bookmarkEnd w:id="6"/>
+    </w:p>
+    <w:p>
+      <w:pPr>
+        <w:pStyle w:val="onVnHH"/>
+        <w:ind w:firstLine="510"/>
+        <w:rPr>
+          <w:i/>
+          <w:iCs/>
+          <w:u w:val="single"/>
+          <w:lang w:val="de-DE"/>
+        </w:rPr>
+      </w:pPr>
+      <w:r>
+        <w:t>PostgreSQL là hệ quản trị cơ sở dữ liệu quan hệ mã nguồn mở, sử dụng SQL để định nghĩa, truy vấn và cập nhật dữ liệu. Hệ thống lưu trữ dữ liệu trong các bảng có cấu trúc, hỗ trợ khai báo khóa chính, khóa ngoại, ràng buộc và giao dịch. Trong đề tài, PostgreSQL lưu các dữ liệu có cấu trúc như tài khoản, hồ sơ nghệ sĩ, bài hát, album, thể loại, playlist và mối liên kết giữa người dùng với nội dung.</w:t>
+      </w:r>
+    </w:p>
+    <w:p>
+      <w:pPr>
+        <w:pStyle w:val="onVnHH"/>
+        <w:rPr>
+          <w:i/>
+          <w:iCs/>
+          <w:u w:val="single"/>
+          <w:lang w:val="de-DE"/>
+        </w:rPr>
+      </w:pPr>
+      <w:r>
+        <w:t>Các lý do lựa chọn PostgreSQL cho đề tài:</w:t>
+      </w:r>
+    </w:p>
+    <w:p>
+      <w:pPr>
+        <w:pStyle w:val="onVnHH"/>
+        <w:numPr>
+          <w:ilvl w:val="0"/>
+          <w:numId w:val="29"/>
+        </w:numPr>
+        <w:rPr>
+          <w:i/>
+          <w:iCs/>
+          <w:u w:val="single"/>
+          <w:lang w:val="de-DE"/>
+        </w:rPr>
+      </w:pPr>
+      <w:r>
+        <w:t>Hỗ trợ dữ liệu quan hệ và các ràng buộc cần thiết để quản lý liên kết người dùng, bài hát, album và playlist.</w:t>
+      </w:r>
+    </w:p>
+    <w:p>
+      <w:pPr>
+        <w:pStyle w:val="onVnHH"/>
+        <w:numPr>
+          <w:ilvl w:val="0"/>
+          <w:numId w:val="29"/>
+        </w:numPr>
+        <w:rPr>
+          <w:i/>
+          <w:iCs/>
+          <w:u w:val="single"/>
+          <w:lang w:val="de-DE"/>
+        </w:rPr>
+      </w:pPr>
+      <w:r>
+        <w:t>Có thể kết hợp với Spring Data JPA/Hibernate để ánh xạ thực thể và thực hiện các thao tác CRUD, truy vấn theo nghiệp vụ.</w:t>
+      </w:r>
+    </w:p>
+    <w:p>
+      <w:pPr>
+        <w:pStyle w:val="onVnHH"/>
+        <w:numPr>
+          <w:ilvl w:val="0"/>
+          <w:numId w:val="29"/>
+        </w:numPr>
+        <w:rPr>
+          <w:i/>
+          <w:iCs/>
+          <w:u w:val="single"/>
+          <w:lang w:val="de-DE"/>
+        </w:rPr>
+      </w:pPr>
+      <w:r>
+        <w:t>Cung cấp giao dịch và chỉ mục phục vụ tính toàn vẹn và tối ưu truy vấn; cần thiết kế và kiểm thử theo dữ liệu, tải thực tế.</w:t>
+      </w:r>
+    </w:p>
+    <w:p>
+      <w:pPr>
+        <w:pStyle w:val="onVnHH"/>
+        <w:ind w:firstLine="510"/>
+        <w:rPr>
+          <w:i/>
+          <w:iCs/>
+          <w:u w:val="single"/>
+          <w:lang w:val="de-DE"/>
+        </w:rPr>
+      </w:pPr>
+      <w:r>
+        <w:t>Mô hình quan hệ phù hợp với dữ liệu của ứng dụng vì nhiều đối tượng có quan hệ xác định. Ví dụ, một người dùng có thể tạo nhiều playlist; một playlist có thể gồm nhiều bài hát và một bài hát có thể xuất hiện trong nhiều playlist. Quan hệ nhiều-nhiều thường được biểu diễn bằng bảng liên kết, trong đó có thể lưu thêm thứ tự bài hát hoặc thời điểm thêm vào danh sách. Cách tổ chức chính thức cần được chốt ở phần thiết kế cơ sở dữ liệu.</w:t>
+      </w:r>
+    </w:p>
+    <w:p>
+      <w:pPr>
+        <w:pStyle w:val="onVnHH"/>
+        <w:ind w:firstLine="510"/>
+        <w:rPr>
+          <w:i/>
+          <w:iCs/>
+          <w:u w:val="single"/>
+          <w:lang w:val="de-DE"/>
+        </w:rPr>
+      </w:pPr>
+      <w:r>
+        <w:lastRenderedPageBreak/>
+        <w:t>Khóa chính định danh duy nhất mỗi bản ghi; khóa ngoại giúp bảo đảm liên kết tham chiếu giữa các bảng; ràng buộc NOT NULL, UNIQUE hoặc CHECK có thể bảo vệ các điều kiện dữ liệu phù hợp. Chỉ mục (index) hỗ trợ tăng tốc một số truy vấn thường xuyên, chẳng hạn tra cứu theo định danh hoặc lọc theo trường được lập chỉ mục; việc thêm chỉ mục cần dựa trên mẫu truy vấn thực tế vì chỉ mục cũng làm tăng chi phí ghi và dung lượng lưu trữ.</w:t>
+      </w:r>
+    </w:p>
+    <w:p>
+      <w:pPr>
+        <w:pStyle w:val="onVnHH"/>
+        <w:ind w:firstLine="510"/>
+        <w:rPr>
+          <w:i/>
+          <w:iCs/>
+          <w:u w:val="single"/>
+          <w:lang w:val="de-DE"/>
+        </w:rPr>
+      </w:pPr>
+      <w:r>
+        <w:t>Giao dịch cho phép nhóm các thao tác liên quan thành một đơn vị xử lý nhất quán. Kết hợp giao dịch với các ràng buộc dữ liệu giúp hạn chế trạng thái dở dang, ví dụ khi thêm một bài hát vào playlist và cập nhật thông tin thứ tự. Dữ liệu âm thanh dung lượng lớn là tệp nhị phân; trong phạm vi thiết kế này, PostgreSQL chủ yếu lưu metadata và thông tin tham chiếu đến tệp, còn phương án lưu trữ tệp cần được lựa chọn riêng theo điều kiện triển khai.</w:t>
+      </w:r>
+    </w:p>
+    <w:p>
+      <w:pPr>
+        <w:pStyle w:val="u3"/>
+        <w:rPr>
+          <w:lang w:val="de-DE"/>
+        </w:rPr>
+      </w:pPr>
+      <w:bookmarkStart w:id="7" w:name="_Toc242968875"/>
+      <w:r>
+        <w:rPr>
+          <w:lang w:val="de-DE"/>
+        </w:rPr>
+        <w:t>Công cụ sử dụng</w:t>
+      </w:r>
+      <w:bookmarkEnd w:id="7"/>
+    </w:p>
+    <w:p>
+      <w:pPr>
+        <w:pStyle w:val="onVnHH"/>
+        <w:ind w:firstLine="510"/>
+        <w:rPr>
+          <w:rFonts w:eastAsiaTheme="majorEastAsia"/>
+          <w:lang w:val="de-DE"/>
+        </w:rPr>
+      </w:pPr>
+      <w:r>
+        <w:t>Visual Studio Code là trình soạn thảo mã nguồn đa nền tảng, được sử dụng làm môi trường làm việc với mã Frontend và Backend trong đề tài. Công cụ hỗ trợ tô sáng cú pháp, tìm kiếm trên dự án, quản lý tệp, tích hợp terminal và gỡ lỗi thông qua cấu hình/tiện ích phù hợp với ngôn ngữ và môi trường phát triển.</w:t>
+      </w:r>
+    </w:p>
+    <w:p>
+      <w:pPr>
+        <w:pStyle w:val="onVnHH"/>
+        <w:ind w:firstLine="510"/>
+        <w:rPr>
+          <w:rFonts w:eastAsiaTheme="majorEastAsia"/>
+          <w:lang w:val="de-DE"/>
+        </w:rPr>
+      </w:pPr>
+      <w:r>
+        <w:t>Trong quá trình thực hiện, VS Code hỗ trợ chỉnh sửa mã React/Java, theo dõi cấu trúc thư mục, chạy lệnh phát triển và xem thông báo lỗi. Tiện ích mở rộng chỉ nên cài đặt khi cần thiết, lựa chọn từ nguồn đáng tin cậy và cấu hình thống nhất để tránh phụ thuộc vào thiết lập riêng của một máy.</w:t>
+      </w:r>
+    </w:p>
+    <w:p>
+      <w:pPr>
+        <w:rPr>
+          <w:rFonts w:eastAsiaTheme="majorEastAsia"/>
+          <w:lang w:val="de-DE"/>
+        </w:rPr>
+      </w:pPr>
+      <w:r>
+        <w:t>Công việc thực hiện với VS Code:</w:t>
+      </w:r>
+    </w:p>
+    <w:p>
+      <w:pPr>
+        <w:pStyle w:val="onVnHH"/>
+        <w:numPr>
+          <w:ilvl w:val="0"/>
+          <w:numId w:val="25"/>
+        </w:numPr>
+        <w:rPr>
+          <w:rFonts w:eastAsiaTheme="majorEastAsia"/>
+          <w:lang w:val="de-DE"/>
+        </w:rPr>
+      </w:pPr>
+      <w:r>
+        <w:t>Tạo, chỉnh sửa và tìm kiếm mã nguồn trong các phần giao diện và máy chủ.</w:t>
+      </w:r>
+    </w:p>
+    <w:p>
+      <w:pPr>
+        <w:pStyle w:val="onVnHH"/>
+        <w:numPr>
+          <w:ilvl w:val="0"/>
+          <w:numId w:val="25"/>
+        </w:numPr>
+        <w:rPr>
+          <w:rFonts w:eastAsiaTheme="majorEastAsia"/>
+          <w:lang w:val="de-DE"/>
+        </w:rPr>
+      </w:pPr>
+      <w:r>
+        <w:t>Mở terminal để chạy ứng dụng, lệnh build hoặc kiểm thử theo cấu hình dự án.</w:t>
+      </w:r>
+    </w:p>
+    <w:p>
+      <w:pPr>
+        <w:pStyle w:val="onVnHH"/>
+        <w:numPr>
+          <w:ilvl w:val="0"/>
+          <w:numId w:val="25"/>
+        </w:numPr>
+        <w:rPr>
+          <w:rFonts w:eastAsiaTheme="majorEastAsia"/>
+          <w:lang w:val="de-DE"/>
+        </w:rPr>
+      </w:pPr>
+      <w:r>
+        <w:t>Hỗ trợ kiểm tra lỗi và rà soát thay đổi; VS Code không thay thế công cụ quản lý phiên bản hoặc quy trình kiểm thử.</w:t>
+      </w:r>
+    </w:p>
+    <w:p>
+      <w:pPr>
+        <w:pStyle w:val="onVnHH"/>
+        <w:ind w:firstLine="360"/>
+        <w:rPr>
+          <w:rFonts w:eastAsiaTheme="majorEastAsia"/>
+          <w:lang w:val="de-DE"/>
+        </w:rPr>
+      </w:pPr>
+      <w:r>
+        <w:t>Trong đề tài, diagrams.net được dùng cho công việc trực quan hóa và trình bày các sơ đồ phân tích/thiết kế. Người thực hiện cần chọn loại biểu đồ phù hợp với nội dung, thống nhất ký hiệu, đặt tên hình và bảo đảm chữ trong sơ đồ đọc rõ khi chèn vào tài liệu. Công cụ này phục vụ vẽ và xuất sơ đồ, không dùng để soạn thảo mã nguồn hoặc tự động kiểm chứng tính đúng đắn của mô hình.</w:t>
+      </w:r>
+    </w:p>
+    <w:p>
+      <w:pPr>
+        <w:spacing w:before="120" w:after="120" w:line="360" w:lineRule="auto"/>
+        <w:rPr>
+          <w:rFonts w:ascii="Times New Roman" w:eastAsiaTheme="majorEastAsia" w:hAnsi="Times New Roman" w:cstheme="majorBidi"/>
+          <w:b/>
+          <w:color w:val="000000" w:themeColor="text1"/>
+          <w:szCs w:val="26"/>
+          <w:lang w:val="de-DE"/>
+        </w:rPr>
+      </w:pPr>
+      <w:bookmarkStart w:id="8" w:name="_Toc242968876"/>
+      <w:r>
+        <w:rPr>
+          <w:lang w:val="de-DE"/>
+        </w:rPr>
+        <w:br w:type="page"/>
+      </w:r>
+    </w:p>
+    <w:p>
+      <w:pPr>
+        <w:pStyle w:val="u2"/>
+        <w:rPr>
+          <w:lang w:val="de-DE"/>
+        </w:rPr>
+      </w:pPr>
+      <w:r>
+        <w:rPr>
+          <w:lang w:val="de-DE"/>
+        </w:rPr>
+        <w:lastRenderedPageBreak/>
+        <w:t>Kiến trúc hệ thống</w:t>
+      </w:r>
+      <w:bookmarkEnd w:id="8"/>
+    </w:p>
+    <w:p>
+      <w:pPr>
+        <w:pStyle w:val="onVnHH"/>
+        <w:ind w:firstLine="510"/>
+      </w:pPr>
+      <w:r>
+        <w:t xml:space="preserve">Lý do lựa chọn mô hình Client–Server cho đề tài vì phù hợp với đặc điểm của một ứng dụng web nghe nhạc trực tuyến, trong đó giao diện người dùng và quá trình xử lý dữ liệu cần được phân chia rõ ràng. Client đảm nhiệm việc hiển thị giao diện, tiếp nhận thao tác của người dùng và gửi yêu cầu đến Server. Server chịu trách nhiệm xử lý nghiệp vụ, xác thực người dùng, quản lý dữ liệu và trao đổi thông tin với cơ sở dữ liệu. Việc sử dụng mô hình này giúp hệ thống dễ dàng bảo trì, kiểm thử và phát triển thêm chức năng trong tương lai. </w:t>
+      </w:r>
+    </w:p>
+    <w:p>
+      <w:pPr>
+        <w:pStyle w:val="onVnHH"/>
+      </w:pPr>
+      <w:r>
+        <w:t>Dưới đây là bảng so sánh giữa các kiến trúc:</w:t>
+      </w:r>
+    </w:p>
+    <w:tbl>
+      <w:tblPr>
+        <w:tblStyle w:val="BangLi4-Nhnmanh5"/>
+        <w:tblW w:w="9297" w:type="dxa"/>
+        <w:tblLook w:val="04A0" w:firstRow="1" w:lastRow="0" w:firstColumn="1" w:lastColumn="0" w:noHBand="0" w:noVBand="1"/>
+      </w:tblPr>
+      <w:tblGrid>
+        <w:gridCol w:w="1346"/>
+        <w:gridCol w:w="2335"/>
+        <w:gridCol w:w="3118"/>
+        <w:gridCol w:w="2498"/>
+      </w:tblGrid>
+      <w:tr>
+        <w:trPr>
+          <w:cnfStyle w:val="100000000000" w:firstRow="1" w:lastRow="0" w:firstColumn="0" w:lastColumn="0" w:oddVBand="0" w:evenVBand="0" w:oddHBand="0" w:evenHBand="0" w:firstRowFirstColumn="0" w:firstRowLastColumn="0" w:lastRowFirstColumn="0" w:lastRowLastColumn="0"/>
+        </w:trPr>
+        <w:tc>
+          <w:tcPr>
+            <w:cnfStyle w:val="001000000000" w:firstRow="0" w:lastRow="0" w:firstColumn="1" w:lastColumn="0" w:oddVBand="0" w:evenVBand="0" w:oddHBand="0" w:evenHBand="0" w:firstRowFirstColumn="0" w:firstRowLastColumn="0" w:lastRowFirstColumn="0" w:lastRowLastColumn="0"/>
+            <w:tcW w:w="0" w:type="auto"/>
+            <w:hideMark/>
+          </w:tcPr>
+          <w:p>
+            <w:pPr>
+              <w:pStyle w:val="onVnHH"/>
+              <w:jc w:val="center"/>
+            </w:pPr>
+            <w:r>
+              <w:t>Tiêu chí</w:t>
+            </w:r>
+          </w:p>
+        </w:tc>
+        <w:tc>
+          <w:tcPr>
+            <w:tcW w:w="2335" w:type="dxa"/>
+            <w:hideMark/>
+          </w:tcPr>
+          <w:p>
+            <w:pPr>
+              <w:pStyle w:val="onVnHH"/>
+              <w:jc w:val="center"/>
+              <w:cnfStyle w:val="100000000000" w:firstRow="1" w:lastRow="0" w:firstColumn="0" w:lastColumn="0" w:oddVBand="0" w:evenVBand="0" w:oddHBand="0" w:evenHBand="0" w:firstRowFirstColumn="0" w:firstRowLastColumn="0" w:lastRowFirstColumn="0" w:lastRowLastColumn="0"/>
+            </w:pPr>
+            <w:r>
+              <w:t>Client–Server</w:t>
+            </w:r>
+          </w:p>
+        </w:tc>
+        <w:tc>
+          <w:tcPr>
+            <w:tcW w:w="3118" w:type="dxa"/>
+            <w:hideMark/>
+          </w:tcPr>
+          <w:p>
+            <w:pPr>
+              <w:pStyle w:val="onVnHH"/>
+              <w:jc w:val="center"/>
+              <w:cnfStyle w:val="100000000000" w:firstRow="1" w:lastRow="0" w:firstColumn="0" w:lastColumn="0" w:oddVBand="0" w:evenVBand="0" w:oddHBand="0" w:evenHBand="0" w:firstRowFirstColumn="0" w:firstRowLastColumn="0" w:lastRowFirstColumn="0" w:lastRowLastColumn="0"/>
+            </w:pPr>
+            <w:r>
+              <w:t>MVC</w:t>
+            </w:r>
+          </w:p>
+        </w:tc>
+        <w:tc>
+          <w:tcPr>
+            <w:tcW w:w="2498" w:type="dxa"/>
+            <w:hideMark/>
+          </w:tcPr>
+          <w:p>
+            <w:pPr>
+              <w:pStyle w:val="onVnHH"/>
+              <w:jc w:val="center"/>
+              <w:cnfStyle w:val="100000000000" w:firstRow="1" w:lastRow="0" w:firstColumn="0" w:lastColumn="0" w:oddVBand="0" w:evenVBand="0" w:oddHBand="0" w:evenHBand="0" w:firstRowFirstColumn="0" w:firstRowLastColumn="0" w:lastRowFirstColumn="0" w:lastRowLastColumn="0"/>
+            </w:pPr>
+            <w:r>
+              <w:t>MVVM</w:t>
+            </w:r>
+          </w:p>
+        </w:tc>
+      </w:tr>
+      <w:tr>
+        <w:trPr>
+          <w:cnfStyle w:val="000000100000" w:firstRow="0" w:lastRow="0" w:firstColumn="0" w:lastColumn="0" w:oddVBand="0" w:evenVBand="0" w:oddHBand="1" w:evenHBand="0" w:firstRowFirstColumn="0" w:firstRowLastColumn="0" w:lastRowFirstColumn="0" w:lastRowLastColumn="0"/>
+        </w:trPr>
+        <w:tc>
+          <w:tcPr>
+            <w:cnfStyle w:val="001000000000" w:firstRow="0" w:lastRow="0" w:firstColumn="1" w:lastColumn="0" w:oddVBand="0" w:evenVBand="0" w:oddHBand="0" w:evenHBand="0" w:firstRowFirstColumn="0" w:firstRowLastColumn="0" w:lastRowFirstColumn="0" w:lastRowLastColumn="0"/>
+            <w:tcW w:w="0" w:type="auto"/>
+            <w:hideMark/>
+          </w:tcPr>
+          <w:p>
+            <w:pPr>
+              <w:pStyle w:val="onVnHH"/>
+              <w:jc w:val="center"/>
+            </w:pPr>
+            <w:r>
+              <w:t>Bản chất</w:t>
+            </w:r>
+          </w:p>
+        </w:tc>
+        <w:tc>
+          <w:tcPr>
+            <w:tcW w:w="2335" w:type="dxa"/>
+            <w:hideMark/>
+          </w:tcPr>
+          <w:p>
+            <w:pPr>
+              <w:pStyle w:val="onVnHH"/>
+              <w:jc w:val="left"/>
+              <w:cnfStyle w:val="000000100000" w:firstRow="0" w:lastRow="0" w:firstColumn="0" w:lastColumn="0" w:oddVBand="0" w:evenVBand="0" w:oddHBand="1" w:evenHBand="0" w:firstRowFirstColumn="0" w:firstRowLastColumn="0" w:lastRowFirstColumn="0" w:lastRowLastColumn="0"/>
+            </w:pPr>
+            <w:r>
+              <w:t>K</w:t>
+            </w:r>
+            <w:r>
+              <w:t>iến trúc phân tán</w:t>
+            </w:r>
+          </w:p>
+        </w:tc>
+        <w:tc>
+          <w:tcPr>
+            <w:tcW w:w="3118" w:type="dxa"/>
+            <w:hideMark/>
+          </w:tcPr>
+          <w:p>
+            <w:pPr>
+              <w:pStyle w:val="onVnHH"/>
+              <w:jc w:val="left"/>
+              <w:cnfStyle w:val="000000100000" w:firstRow="0" w:lastRow="0" w:firstColumn="0" w:lastColumn="0" w:oddVBand="0" w:evenVBand="0" w:oddHBand="1" w:evenHBand="0" w:firstRowFirstColumn="0" w:firstRowLastColumn="0" w:lastRowFirstColumn="0" w:lastRowLastColumn="0"/>
+            </w:pPr>
+            <w:r>
+              <w:t>T</w:t>
+            </w:r>
+            <w:r>
+              <w:t>ổ chức phần mềm</w:t>
+            </w:r>
+          </w:p>
+        </w:tc>
+        <w:tc>
+          <w:tcPr>
+            <w:tcW w:w="2498" w:type="dxa"/>
+            <w:hideMark/>
+          </w:tcPr>
+          <w:p>
+            <w:pPr>
+              <w:pStyle w:val="onVnHH"/>
+              <w:jc w:val="left"/>
+              <w:cnfStyle w:val="000000100000" w:firstRow="0" w:lastRow="0" w:firstColumn="0" w:lastColumn="0" w:oddVBand="0" w:evenVBand="0" w:oddHBand="1" w:evenHBand="0" w:firstRowFirstColumn="0" w:firstRowLastColumn="0" w:lastRowFirstColumn="0" w:lastRowLastColumn="0"/>
+            </w:pPr>
+            <w:r>
+              <w:t xml:space="preserve">Tổ </w:t>
+            </w:r>
+            <w:r>
+              <w:t>chức phần mềm</w:t>
+            </w:r>
+          </w:p>
+        </w:tc>
+      </w:tr>
+      <w:tr>
+        <w:tc>
+          <w:tcPr>
+            <w:cnfStyle w:val="001000000000" w:firstRow="0" w:lastRow="0" w:firstColumn="1" w:lastColumn="0" w:oddVBand="0" w:evenVBand="0" w:oddHBand="0" w:evenHBand="0" w:firstRowFirstColumn="0" w:firstRowLastColumn="0" w:lastRowFirstColumn="0" w:lastRowLastColumn="0"/>
+            <w:tcW w:w="0" w:type="auto"/>
+            <w:hideMark/>
+          </w:tcPr>
+          <w:p>
+            <w:pPr>
+              <w:pStyle w:val="onVnHH"/>
+              <w:jc w:val="center"/>
+            </w:pPr>
+            <w:r>
+              <w:t>Mục đích</w:t>
+            </w:r>
+          </w:p>
+        </w:tc>
+        <w:tc>
+          <w:tcPr>
+            <w:tcW w:w="2335" w:type="dxa"/>
+            <w:hideMark/>
+          </w:tcPr>
+          <w:p>
+            <w:pPr>
+              <w:pStyle w:val="onVnHH"/>
+              <w:jc w:val="left"/>
+              <w:cnfStyle w:val="000000000000" w:firstRow="0" w:lastRow="0" w:firstColumn="0" w:lastColumn="0" w:oddVBand="0" w:evenVBand="0" w:oddHBand="0" w:evenHBand="0" w:firstRowFirstColumn="0" w:firstRowLastColumn="0" w:lastRowFirstColumn="0" w:lastRowLastColumn="0"/>
+            </w:pPr>
+            <w:r>
+              <w:t>Phân chia Client và Server</w:t>
+            </w:r>
+          </w:p>
+        </w:tc>
+        <w:tc>
+          <w:tcPr>
+            <w:tcW w:w="3118" w:type="dxa"/>
+            <w:hideMark/>
+          </w:tcPr>
+          <w:p>
+            <w:pPr>
+              <w:pStyle w:val="onVnHH"/>
+              <w:jc w:val="left"/>
+              <w:cnfStyle w:val="000000000000" w:firstRow="0" w:lastRow="0" w:firstColumn="0" w:lastColumn="0" w:oddVBand="0" w:evenVBand="0" w:oddHBand="0" w:evenHBand="0" w:firstRowFirstColumn="0" w:firstRowLastColumn="0" w:lastRowFirstColumn="0" w:lastRowLastColumn="0"/>
+            </w:pPr>
+            <w:r>
+              <w:t>Phân chia dữ liệu, giao diện và xử lý</w:t>
+            </w:r>
+          </w:p>
+        </w:tc>
+        <w:tc>
+          <w:tcPr>
+            <w:tcW w:w="2498" w:type="dxa"/>
+            <w:hideMark/>
+          </w:tcPr>
+          <w:p>
+            <w:pPr>
+              <w:pStyle w:val="onVnHH"/>
+              <w:jc w:val="left"/>
+              <w:cnfStyle w:val="000000000000" w:firstRow="0" w:lastRow="0" w:firstColumn="0" w:lastColumn="0" w:oddVBand="0" w:evenVBand="0" w:oddHBand="0" w:evenHBand="0" w:firstRowFirstColumn="0" w:firstRowLastColumn="0" w:lastRowFirstColumn="0" w:lastRowLastColumn="0"/>
+            </w:pPr>
+            <w:r>
+              <w:t>Tách giao diện khỏi logic trình bày</w:t>
+            </w:r>
+          </w:p>
+        </w:tc>
+      </w:tr>
+      <w:tr>
+        <w:trPr>
+          <w:cnfStyle w:val="000000100000" w:firstRow="0" w:lastRow="0" w:firstColumn="0" w:lastColumn="0" w:oddVBand="0" w:evenVBand="0" w:oddHBand="1" w:evenHBand="0" w:firstRowFirstColumn="0" w:firstRowLastColumn="0" w:lastRowFirstColumn="0" w:lastRowLastColumn="0"/>
+        </w:trPr>
+        <w:tc>
+          <w:tcPr>
+            <w:cnfStyle w:val="001000000000" w:firstRow="0" w:lastRow="0" w:firstColumn="1" w:lastColumn="0" w:oddVBand="0" w:evenVBand="0" w:oddHBand="0" w:evenHBand="0" w:firstRowFirstColumn="0" w:firstRowLastColumn="0" w:lastRowFirstColumn="0" w:lastRowLastColumn="0"/>
+            <w:tcW w:w="0" w:type="auto"/>
+            <w:hideMark/>
+          </w:tcPr>
+          <w:p>
+            <w:pPr>
+              <w:pStyle w:val="onVnHH"/>
+              <w:jc w:val="center"/>
+            </w:pPr>
+            <w:r>
+              <w:t>Thành phần</w:t>
+            </w:r>
+          </w:p>
+        </w:tc>
+        <w:tc>
+          <w:tcPr>
+            <w:tcW w:w="2335" w:type="dxa"/>
+            <w:hideMark/>
+          </w:tcPr>
+          <w:p>
+            <w:pPr>
+              <w:pStyle w:val="onVnHH"/>
+              <w:jc w:val="left"/>
+              <w:cnfStyle w:val="000000100000" w:firstRow="0" w:lastRow="0" w:firstColumn="0" w:lastColumn="0" w:oddVBand="0" w:evenVBand="0" w:oddHBand="1" w:evenHBand="0" w:firstRowFirstColumn="0" w:firstRowLastColumn="0" w:lastRowFirstColumn="0" w:lastRowLastColumn="0"/>
+            </w:pPr>
+            <w:r>
+              <w:t>Client, Server</w:t>
+            </w:r>
+          </w:p>
+        </w:tc>
+        <w:tc>
+          <w:tcPr>
+            <w:tcW w:w="3118" w:type="dxa"/>
+            <w:hideMark/>
+          </w:tcPr>
+          <w:p>
+            <w:pPr>
+              <w:pStyle w:val="onVnHH"/>
+              <w:jc w:val="left"/>
+              <w:cnfStyle w:val="000000100000" w:firstRow="0" w:lastRow="0" w:firstColumn="0" w:lastColumn="0" w:oddVBand="0" w:evenVBand="0" w:oddHBand="1" w:evenHBand="0" w:firstRowFirstColumn="0" w:firstRowLastColumn="0" w:lastRowFirstColumn="0" w:lastRowLastColumn="0"/>
+            </w:pPr>
+            <w:r>
+              <w:t>Model, View,Controller</w:t>
+            </w:r>
+          </w:p>
+        </w:tc>
+        <w:tc>
+          <w:tcPr>
+            <w:tcW w:w="2498" w:type="dxa"/>
+            <w:hideMark/>
+          </w:tcPr>
+          <w:p>
+            <w:pPr>
+              <w:pStyle w:val="onVnHH"/>
+              <w:jc w:val="left"/>
+              <w:cnfStyle w:val="000000100000" w:firstRow="0" w:lastRow="0" w:firstColumn="0" w:lastColumn="0" w:oddVBand="0" w:evenVBand="0" w:oddHBand="1" w:evenHBand="0" w:firstRowFirstColumn="0" w:firstRowLastColumn="0" w:lastRowFirstColumn="0" w:lastRowLastColumn="0"/>
+            </w:pPr>
+            <w:r>
+              <w:t>Model, View, ViewModel</w:t>
+            </w:r>
+          </w:p>
+        </w:tc>
+      </w:tr>
+      <w:tr>
+        <w:tc>
+          <w:tcPr>
+            <w:cnfStyle w:val="001000000000" w:firstRow="0" w:lastRow="0" w:firstColumn="1" w:lastColumn="0" w:oddVBand="0" w:evenVBand="0" w:oddHBand="0" w:evenHBand="0" w:firstRowFirstColumn="0" w:firstRowLastColumn="0" w:lastRowFirstColumn="0" w:lastRowLastColumn="0"/>
+            <w:tcW w:w="0" w:type="auto"/>
+            <w:hideMark/>
+          </w:tcPr>
+          <w:p>
+            <w:pPr>
+              <w:pStyle w:val="onVnHH"/>
+              <w:jc w:val="center"/>
+            </w:pPr>
+            <w:r>
+              <w:t>Phạm vi</w:t>
+            </w:r>
+          </w:p>
+        </w:tc>
+        <w:tc>
+          <w:tcPr>
+            <w:tcW w:w="2335" w:type="dxa"/>
+            <w:hideMark/>
+          </w:tcPr>
+          <w:p>
+            <w:pPr>
+              <w:pStyle w:val="onVnHH"/>
+              <w:jc w:val="left"/>
+              <w:cnfStyle w:val="000000000000" w:firstRow="0" w:lastRow="0" w:firstColumn="0" w:lastColumn="0" w:oddVBand="0" w:evenVBand="0" w:oddHBand="0" w:evenHBand="0" w:firstRowFirstColumn="0" w:firstRowLastColumn="0" w:lastRowFirstColumn="0" w:lastRowLastColumn="0"/>
+            </w:pPr>
+            <w:r>
+              <w:t>Toàn hệ thống</w:t>
+            </w:r>
+          </w:p>
+        </w:tc>
+        <w:tc>
+          <w:tcPr>
+            <w:tcW w:w="3118" w:type="dxa"/>
+            <w:hideMark/>
+          </w:tcPr>
+          <w:p>
+            <w:pPr>
+              <w:pStyle w:val="onVnHH"/>
+              <w:jc w:val="left"/>
+              <w:cnfStyle w:val="000000000000" w:firstRow="0" w:lastRow="0" w:firstColumn="0" w:lastColumn="0" w:oddVBand="0" w:evenVBand="0" w:oddHBand="0" w:evenHBand="0" w:firstRowFirstColumn="0" w:firstRowLastColumn="0" w:lastRowFirstColumn="0" w:lastRowLastColumn="0"/>
+            </w:pPr>
+            <w:r>
+              <w:t>Thường ở</w:t>
+            </w:r>
+            <w:r>
+              <w:t xml:space="preserve"> tầng phần mềm</w:t>
+            </w:r>
+          </w:p>
+        </w:tc>
+        <w:tc>
+          <w:tcPr>
+            <w:tcW w:w="2498" w:type="dxa"/>
+            <w:hideMark/>
+          </w:tcPr>
+          <w:p>
+            <w:pPr>
+              <w:pStyle w:val="onVnHH"/>
+              <w:jc w:val="left"/>
+              <w:cnfStyle w:val="000000000000" w:firstRow="0" w:lastRow="0" w:firstColumn="0" w:lastColumn="0" w:oddVBand="0" w:evenVBand="0" w:oddHBand="0" w:evenHBand="0" w:firstRowFirstColumn="0" w:firstRowLastColumn="0" w:lastRowFirstColumn="0" w:lastRowLastColumn="0"/>
+            </w:pPr>
+            <w:r>
+              <w:t xml:space="preserve">Thường ở </w:t>
+            </w:r>
+            <w:r>
+              <w:t>tầng giao diện</w:t>
+            </w:r>
+          </w:p>
+        </w:tc>
+      </w:tr>
+      <w:tr>
+        <w:trPr>
+          <w:cnfStyle w:val="000000100000" w:firstRow="0" w:lastRow="0" w:firstColumn="0" w:lastColumn="0" w:oddVBand="0" w:evenVBand="0" w:oddHBand="1" w:evenHBand="0" w:firstRowFirstColumn="0" w:firstRowLastColumn="0" w:lastRowFirstColumn="0" w:lastRowLastColumn="0"/>
+        </w:trPr>
+        <w:tc>
+          <w:tcPr>
+            <w:cnfStyle w:val="001000000000" w:firstRow="0" w:lastRow="0" w:firstColumn="1" w:lastColumn="0" w:oddVBand="0" w:evenVBand="0" w:oddHBand="0" w:evenHBand="0" w:firstRowFirstColumn="0" w:firstRowLastColumn="0" w:lastRowFirstColumn="0" w:lastRowLastColumn="0"/>
+            <w:tcW w:w="0" w:type="auto"/>
+            <w:hideMark/>
+          </w:tcPr>
+          <w:p>
+            <w:pPr>
+              <w:pStyle w:val="onVnHH"/>
+              <w:jc w:val="center"/>
+            </w:pPr>
+            <w:r>
+              <w:t>Mức sử dụng</w:t>
+            </w:r>
+          </w:p>
+        </w:tc>
+        <w:tc>
+          <w:tcPr>
+            <w:tcW w:w="2335" w:type="dxa"/>
+            <w:hideMark/>
+          </w:tcPr>
+          <w:p>
+            <w:pPr>
+              <w:pStyle w:val="onVnHH"/>
+              <w:jc w:val="left"/>
+              <w:cnfStyle w:val="000000100000" w:firstRow="0" w:lastRow="0" w:firstColumn="0" w:lastColumn="0" w:oddVBand="0" w:evenVBand="0" w:oddHBand="1" w:evenHBand="0" w:firstRowFirstColumn="0" w:firstRowLastColumn="0" w:lastRowFirstColumn="0" w:lastRowLastColumn="0"/>
+            </w:pPr>
+            <w:r>
+              <w:t>Rất phổ biến</w:t>
+            </w:r>
+          </w:p>
+        </w:tc>
+        <w:tc>
+          <w:tcPr>
+            <w:tcW w:w="3118" w:type="dxa"/>
+            <w:hideMark/>
+          </w:tcPr>
+          <w:p>
+            <w:pPr>
+              <w:pStyle w:val="onVnHH"/>
+              <w:jc w:val="left"/>
+              <w:cnfStyle w:val="000000100000" w:firstRow="0" w:lastRow="0" w:firstColumn="0" w:lastColumn="0" w:oddVBand="0" w:evenVBand="0" w:oddHBand="1" w:evenHBand="0" w:firstRowFirstColumn="0" w:firstRowLastColumn="0" w:lastRowFirstColumn="0" w:lastRowLastColumn="0"/>
+            </w:pPr>
+            <w:r>
+              <w:t>Phổ biến</w:t>
+            </w:r>
+          </w:p>
+        </w:tc>
+        <w:tc>
+          <w:tcPr>
+            <w:tcW w:w="2498" w:type="dxa"/>
+            <w:hideMark/>
+          </w:tcPr>
+          <w:p>
+            <w:pPr>
+              <w:pStyle w:val="onVnHH"/>
+              <w:jc w:val="left"/>
+              <w:cnfStyle w:val="000000100000" w:firstRow="0" w:lastRow="0" w:firstColumn="0" w:lastColumn="0" w:oddVBand="0" w:evenVBand="0" w:oddHBand="1" w:evenHBand="0" w:firstRowFirstColumn="0" w:firstRowLastColumn="0" w:lastRowFirstColumn="0" w:lastRowLastColumn="0"/>
+            </w:pPr>
+            <w:r>
+              <w:t>Phổ biến trong một số framework</w:t>
+            </w:r>
+          </w:p>
+        </w:tc>
+      </w:tr>
+    </w:tbl>
+    <w:p/>
+    <w:p>
+      <w:pPr>
+        <w:pStyle w:val="onVnHH"/>
+        <w:ind w:firstLine="510"/>
+      </w:pPr>
+      <w:r>
+        <w:t>Mô hình Client–Server là mô hình kiến trúc mạng trong đó hệ thống được tổ chức thành hai thành phần chính: Client (máy khách) và Server (máy chủ). Client gửi yêu cầu đến Server để sử dụng các dịch vụ hoặc truy xuất dữ liệu, trong khi Server tiếp nhận, xử lý yêu cầu và trả kết quả về cho Client. Mô hình này giúp phân chia trách nhiệm giữa giao diện người dùng và xử lý dữ liệu, tạo điều kiện thuận lợi cho việc phát triển, bảo trì và mở rộng hệ thống.</w:t>
+      </w:r>
+    </w:p>
+    <w:p>
+      <w:pPr>
+        <w:pStyle w:val="onVnHH"/>
+        <w:ind w:firstLine="510"/>
+      </w:pPr>
+      <w:r>
+        <w:t xml:space="preserve">Trong mô hình này, Client chịu trách nhiệm cung cấp giao diện tương tác, tiếp nhận thao tác của người dùng và gửi yêu cầu đến Server. Server đảm nhận việc xử lý nghiệp vụ, kiểm tra dữ liệu, xác thực và phân quyền người dùng, đồng thời phối hợp với hệ quản trị cơ sở dữ liệu để lưu trữ và truy xuất thông tin. Việc trao đổi dữ liệu giữa hai </w:t>
+      </w:r>
+      <w:r>
+        <w:lastRenderedPageBreak/>
+        <w:t>thành phần thường được thực hiện thông qua giao thức HTTP/HTTPS, với dữ liệu phản hồi có thể được biểu diễn dưới định dạng JSON.</w:t>
+      </w:r>
+    </w:p>
+    <w:p>
+      <w:pPr>
+        <w:pStyle w:val="onVnHH"/>
+        <w:ind w:firstLine="510"/>
+      </w:pPr>
+      <w:r>
+        <w:rPr>
+          <w:lang w:val="de-DE"/>
+        </w:rPr>
+        <w:drawing>
+          <wp:inline distT="0" distB="0" distL="0" distR="0" wp14:anchorId="5C70B9E3" wp14:editId="6B981014">
+            <wp:extent cx="5105842" cy="3703641"/>
+            <wp:effectExtent l="0" t="0" r="0" b="0"/>
+            <wp:docPr id="674326217" name="Hình ảnh 1"/>
+            <wp:cNvGraphicFramePr>
+              <a:graphicFrameLocks xmlns:a="http://schemas.openxmlformats.org/drawingml/2006/main" noChangeAspect="1"/>
+            </wp:cNvGraphicFramePr>
+            <a:graphic xmlns:a="http://schemas.openxmlformats.org/drawingml/2006/main">
+              <a:graphicData uri="http://schemas.openxmlformats.org/drawingml/2006/picture">
+                <pic:pic xmlns:pic="http://schemas.openxmlformats.org/drawingml/2006/picture">
+                  <pic:nvPicPr>
+                    <pic:cNvPr id="674326217" name=""/>
+                    <pic:cNvPicPr/>
+                  </pic:nvPicPr>
+                  <pic:blipFill>
+                    <a:blip r:embed="rId14"/>
+                    <a:stretch>
+                      <a:fillRect/>
+                    </a:stretch>
+                  </pic:blipFill>
+                  <pic:spPr>
+                    <a:xfrm>
+                      <a:off x="0" y="0"/>
+                      <a:ext cx="5105842" cy="3703641"/>
+                    </a:xfrm>
+                    <a:prstGeom prst="rect">
+                      <a:avLst/>
+                    </a:prstGeom>
+                  </pic:spPr>
+                </pic:pic>
+              </a:graphicData>
+            </a:graphic>
+          </wp:inline>
+        </w:drawing>
+      </w:r>
+    </w:p>
+    <w:p>
+      <w:pPr>
+        <w:pStyle w:val="onVnHH"/>
+        <w:ind w:firstLine="510"/>
+      </w:pPr>
+      <w:r>
+        <w:t>Đối với đề tài xây dựng ứng dụng web nghe nhạc trực tuyến, mô hình Client–Server được áp dụng để phân tách giao diện và xử lý phía máy chủ. Client được xây dựng bằng React, chịu trách nhiệm hiển thị giao diện, tiếp nhận thao tác tìm kiếm bài hát, quản lý thư viện cá nhân và điều khiển trình phát nhạc. Server được xây dựng bằng Spring Boot, cung cấp các REST API để tiếp nhận yêu cầu, xử lý nghiệp vụ, xác thực người dùng và trao đổi dữ liệu với cơ sở dữ liệu PostgreSQL. Cách tổ chức này giúp hệ thống có cấu trúc rõ ràng, thuận tiện cho việc phát triển và kiểm thử từng thành phần độc lập.</w:t>
+      </w:r>
+    </w:p>
+    <w:p>
+      <w:pPr>
+        <w:pStyle w:val="onVnHH"/>
+      </w:pPr>
+    </w:p>
+    <w:p>
+      <w:pPr>
+        <w:pStyle w:val="onVnHH"/>
+        <w:jc w:val="center"/>
+        <w:rPr>
+          <w:rFonts w:eastAsiaTheme="majorEastAsia" w:cstheme="majorBidi"/>
+          <w:color w:val="000000" w:themeColor="text1"/>
+          <w:szCs w:val="26"/>
+          <w:lang w:val="de-DE"/>
+        </w:rPr>
+      </w:pPr>
+      <w:r>
+        <w:rPr>
+          <w:lang w:val="de-DE"/>
+        </w:rPr>
+        <w:br w:type="page"/>
+      </w:r>
+    </w:p>
+    <w:p>
+      <w:pPr>
+        <w:pStyle w:val="u2"/>
+        <w:rPr>
+          <w:lang w:val="de-DE"/>
+        </w:rPr>
+      </w:pPr>
+      <w:r>
+        <w:rPr>
+          <w:lang w:val="de-DE"/>
+        </w:rPr>
+        <w:lastRenderedPageBreak/>
+        <w:t>Công cụ hỗ trợ</w:t>
+      </w:r>
+    </w:p>
+    <w:p>
+      <w:pPr>
+        <w:pStyle w:val="onVnHH"/>
+        <w:ind w:firstLine="510"/>
+        <w:rPr>
+          <w:rFonts w:eastAsiaTheme="majorEastAsia"/>
+          <w:lang w:val="de-DE"/>
+        </w:rPr>
+      </w:pPr>
+      <w:r>
+        <w:t>Visual Studio Code: Công cụ hỗ trợ soạn thảo, tìm kiếm, tổ chức và gỡ lỗi mã nguồn. Trong phạm vi đề tài, VS Code được sử dụng để làm việc với mã Frontend/Backend, chạy lệnh cần thiết và rà soát cấu trúc dự án.</w:t>
+      </w:r>
+    </w:p>
+    <w:p>
+      <w:pPr>
+        <w:pStyle w:val="onVnHH"/>
+        <w:ind w:firstLine="510"/>
+        <w:rPr>
+          <w:rFonts w:eastAsiaTheme="majorEastAsia"/>
+          <w:lang w:val="de-DE"/>
+        </w:rPr>
+      </w:pPr>
+      <w:r>
+        <w:t>Diagrams.net (draw.io): Công cụ tạo và chỉnh sửa sơ đồ phục vụ phân tích, thiết kế. Sơ đồ được xuất/chèn vào báo cáo với tên hình, chú thích và kích thước bảo đảm dễ đọc. Đây là công cụ trực quan hóa, tách biệt với môi trường viết mã.</w:t>
+      </w:r>
+    </w:p>
+    <w:p>
+      <w:pPr>
+        <w:jc w:val="center"/>
+      </w:pPr>
+      <w:r>
+        <w:rPr>
+          <w:noProof/>
+        </w:rPr>
+        <w:drawing>
+          <wp:inline distT="0" distB="0" distL="0" distR="0" wp14:anchorId="43ADCE92" wp14:editId="7DDA81E4">
+            <wp:extent cx="5349240" cy="1890000"/>
+            <wp:effectExtent l="0" t="0" r="0" b="0"/>
+            <wp:docPr id="104" name="Hình minh họa 2.4. Vai trò của các công cụ phát triển và thiết kế" descr="Hình minh họa 2.4. Vai trò của các công cụ phát triển và thiết kế"/>
+            <wp:cNvGraphicFramePr>
+              <a:graphicFrameLocks xmlns:a="http://schemas.openxmlformats.org/drawingml/2006/main" noChangeAspect="1"/>
+            </wp:cNvGraphicFramePr>
+            <a:graphic xmlns:a="http://schemas.openxmlformats.org/drawingml/2006/main">
+              <a:graphicData uri="http://schemas.openxmlformats.org/drawingml/2006/picture">
+                <pic:pic xmlns:pic="http://schemas.openxmlformats.org/drawingml/2006/picture">
+                  <pic:nvPicPr>
+                    <pic:cNvPr id="104" name="Hình minh họa 2.4. Vai trò của các công cụ phát triển và thiết kế"/>
+                    <pic:cNvPicPr/>
+                  </pic:nvPicPr>
+                  <pic:blipFill>
+                    <a:blip r:embed="rId15"/>
+                    <a:stretch>
+                      <a:fillRect/>
+                    </a:stretch>
+                  </pic:blipFill>
+                  <pic:spPr>
+                    <a:xfrm>
+                      <a:off x="0" y="0"/>
+                      <a:ext cx="5943600" cy="2100000"/>
+                    </a:xfrm>
+                    <a:prstGeom prst="rect">
+                      <a:avLst/>
+                    </a:prstGeom>
+                  </pic:spPr>
+                </pic:pic>
+              </a:graphicData>
+            </a:graphic>
+          </wp:inline>
+        </w:drawing>
+      </w:r>
+    </w:p>
+    <w:p>
+      <w:pPr>
+        <w:spacing w:before="120" w:after="120" w:line="360" w:lineRule="auto"/>
         <w:jc w:val="both"/>
         <w:rPr>
           <w:rFonts w:ascii="Times New Roman" w:hAnsi="Times New Roman"/>
@@ -5489,6 +6734,47 @@
           <w:szCs w:val="28"/>
           <w:lang w:val="de-DE"/>
         </w:rPr>
+        <w:t>Kết luận chương</w:t>
+      </w:r>
+    </w:p>
+    <w:p>
+      <w:pPr>
+        <w:spacing w:before="120" w:after="120" w:line="360" w:lineRule="auto"/>
+        <w:rPr>
+          <w:rFonts w:ascii="Times New Roman" w:eastAsiaTheme="majorEastAsia" w:hAnsi="Times New Roman" w:cstheme="majorBidi"/>
+          <w:b/>
+          <w:color w:val="000000" w:themeColor="text1"/>
+          <w:szCs w:val="26"/>
+          <w:lang w:val="de-DE"/>
+        </w:rPr>
+      </w:pPr>
+      <w:r>
+        <w:rPr>
+          <w:lang w:val="de-DE"/>
+        </w:rPr>
+        <w:br w:type="page"/>
+      </w:r>
+    </w:p>
+    <w:bookmarkEnd w:id="2"/>
+    <w:p>
+      <w:pPr>
+        <w:spacing w:before="120" w:after="120" w:line="360" w:lineRule="auto"/>
+        <w:jc w:val="both"/>
+        <w:rPr>
+          <w:rFonts w:ascii="Times New Roman" w:hAnsi="Times New Roman"/>
+          <w:sz w:val="28"/>
+          <w:szCs w:val="28"/>
+          <w:lang w:val="de-DE"/>
+        </w:rPr>
+      </w:pPr>
+      <w:r>
+        <w:rPr>
+          <w:rFonts w:ascii="Times New Roman" w:hAnsi="Times New Roman"/>
+          <w:sz w:val="28"/>
+          <w:szCs w:val="28"/>
+          <w:lang w:val="de-DE"/>
+        </w:rPr>
+        <w:lastRenderedPageBreak/>
         <w:t>Kết luận chương</w:t>
       </w:r>
     </w:p>
@@ -6498,7 +7784,7 @@
         </w:rPr>
         <w:t xml:space="preserve"> [Online], Available:  </w:t>
       </w:r>
-      <w:hyperlink r:id="rId12" w:history="1">
+      <w:hyperlink r:id="rId16" w:history="1">
         <w:r>
           <w:rPr>
             <w:rStyle w:val="Siuktni"/>
@@ -9278,8 +10564,8 @@
       </w:r>
     </w:p>
     <w:sectPr>
-      <w:headerReference w:type="default" r:id="rId13"/>
-      <w:footerReference w:type="default" r:id="rId14"/>
+      <w:headerReference w:type="default" r:id="rId17"/>
+      <w:footerReference w:type="default" r:id="rId18"/>
       <w:pgSz w:w="11906" w:h="16838" w:code="9"/>
       <w:pgMar w:top="1134" w:right="1134" w:bottom="1134" w:left="1701" w:header="720" w:footer="720" w:gutter="0"/>
       <w:pgNumType w:start="1"/>
@@ -10700,6 +11986,119 @@
     </w:lvl>
   </w:abstractNum>
   <w:abstractNum w:abstractNumId="9" w15:restartNumberingAfterBreak="0">
+    <w:nsid w:val="2C127073"/>
+    <w:multiLevelType w:val="hybridMultilevel"/>
+    <w:tmpl w:val="60AE5434"/>
+    <w:lvl w:ilvl="0" w:tplc="04090001">
+      <w:start w:val="1"/>
+      <w:numFmt w:val="bullet"/>
+      <w:lvlText w:val=""/>
+      <w:lvlJc w:val="left"/>
+      <w:pPr>
+        <w:ind w:left="870" w:hanging="360"/>
+      </w:pPr>
+      <w:rPr>
+        <w:rFonts w:ascii="Symbol" w:hAnsi="Symbol" w:hint="default"/>
+      </w:rPr>
+    </w:lvl>
+    <w:lvl w:ilvl="1" w:tplc="04090003" w:tentative="1">
+      <w:start w:val="1"/>
+      <w:numFmt w:val="bullet"/>
+      <w:lvlText w:val="o"/>
+      <w:lvlJc w:val="left"/>
+      <w:pPr>
+        <w:ind w:left="1590" w:hanging="360"/>
+      </w:pPr>
+      <w:rPr>
+        <w:rFonts w:ascii="Courier New" w:hAnsi="Courier New" w:cs="Courier New" w:hint="default"/>
+      </w:rPr>
+    </w:lvl>
+    <w:lvl w:ilvl="2" w:tplc="04090005" w:tentative="1">
+      <w:start w:val="1"/>
+      <w:numFmt w:val="bullet"/>
+      <w:lvlText w:val=""/>
+      <w:lvlJc w:val="left"/>
+      <w:pPr>
+        <w:ind w:left="2310" w:hanging="360"/>
+      </w:pPr>
+      <w:rPr>
+        <w:rFonts w:ascii="Wingdings" w:hAnsi="Wingdings" w:hint="default"/>
+      </w:rPr>
+    </w:lvl>
+    <w:lvl w:ilvl="3" w:tplc="04090001" w:tentative="1">
+      <w:start w:val="1"/>
+      <w:numFmt w:val="bullet"/>
+      <w:lvlText w:val=""/>
+      <w:lvlJc w:val="left"/>
+      <w:pPr>
+        <w:ind w:left="3030" w:hanging="360"/>
+      </w:pPr>
+      <w:rPr>
+        <w:rFonts w:ascii="Symbol" w:hAnsi="Symbol" w:hint="default"/>
+      </w:rPr>
+    </w:lvl>
+    <w:lvl w:ilvl="4" w:tplc="04090003" w:tentative="1">
+      <w:start w:val="1"/>
+      <w:numFmt w:val="bullet"/>
+      <w:lvlText w:val="o"/>
+      <w:lvlJc w:val="left"/>
+      <w:pPr>
+        <w:ind w:left="3750" w:hanging="360"/>
+      </w:pPr>
+      <w:rPr>
+        <w:rFonts w:ascii="Courier New" w:hAnsi="Courier New" w:cs="Courier New" w:hint="default"/>
+      </w:rPr>
+    </w:lvl>
+    <w:lvl w:ilvl="5" w:tplc="04090005" w:tentative="1">
+      <w:start w:val="1"/>
+      <w:numFmt w:val="bullet"/>
+      <w:lvlText w:val=""/>
+      <w:lvlJc w:val="left"/>
+      <w:pPr>
+        <w:ind w:left="4470" w:hanging="360"/>
+      </w:pPr>
+      <w:rPr>
+        <w:rFonts w:ascii="Wingdings" w:hAnsi="Wingdings" w:hint="default"/>
+      </w:rPr>
+    </w:lvl>
+    <w:lvl w:ilvl="6" w:tplc="04090001" w:tentative="1">
+      <w:start w:val="1"/>
+      <w:numFmt w:val="bullet"/>
+      <w:lvlText w:val=""/>
+      <w:lvlJc w:val="left"/>
+      <w:pPr>
+        <w:ind w:left="5190" w:hanging="360"/>
+      </w:pPr>
+      <w:rPr>
+        <w:rFonts w:ascii="Symbol" w:hAnsi="Symbol" w:hint="default"/>
+      </w:rPr>
+    </w:lvl>
+    <w:lvl w:ilvl="7" w:tplc="04090003" w:tentative="1">
+      <w:start w:val="1"/>
+      <w:numFmt w:val="bullet"/>
+      <w:lvlText w:val="o"/>
+      <w:lvlJc w:val="left"/>
+      <w:pPr>
+        <w:ind w:left="5910" w:hanging="360"/>
+      </w:pPr>
+      <w:rPr>
+        <w:rFonts w:ascii="Courier New" w:hAnsi="Courier New" w:cs="Courier New" w:hint="default"/>
+      </w:rPr>
+    </w:lvl>
+    <w:lvl w:ilvl="8" w:tplc="04090005" w:tentative="1">
+      <w:start w:val="1"/>
+      <w:numFmt w:val="bullet"/>
+      <w:lvlText w:val=""/>
+      <w:lvlJc w:val="left"/>
+      <w:pPr>
+        <w:ind w:left="6630" w:hanging="360"/>
+      </w:pPr>
+      <w:rPr>
+        <w:rFonts w:ascii="Wingdings" w:hAnsi="Wingdings" w:hint="default"/>
+      </w:rPr>
+    </w:lvl>
+  </w:abstractNum>
+  <w:abstractNum w:abstractNumId="10" w15:restartNumberingAfterBreak="0">
     <w:nsid w:val="31FF3621"/>
     <w:multiLevelType w:val="multilevel"/>
     <w:tmpl w:val="CB74CC44"/>
@@ -10815,7 +12214,120 @@
       </w:rPr>
     </w:lvl>
   </w:abstractNum>
-  <w:abstractNum w:abstractNumId="10" w15:restartNumberingAfterBreak="0">
+  <w:abstractNum w:abstractNumId="11" w15:restartNumberingAfterBreak="0">
+    <w:nsid w:val="32CF5CD2"/>
+    <w:multiLevelType w:val="hybridMultilevel"/>
+    <w:tmpl w:val="98207F60"/>
+    <w:lvl w:ilvl="0" w:tplc="04090001">
+      <w:start w:val="1"/>
+      <w:numFmt w:val="bullet"/>
+      <w:lvlText w:val=""/>
+      <w:lvlJc w:val="left"/>
+      <w:pPr>
+        <w:ind w:left="870" w:hanging="360"/>
+      </w:pPr>
+      <w:rPr>
+        <w:rFonts w:ascii="Symbol" w:hAnsi="Symbol" w:hint="default"/>
+      </w:rPr>
+    </w:lvl>
+    <w:lvl w:ilvl="1" w:tplc="04090003">
+      <w:start w:val="1"/>
+      <w:numFmt w:val="bullet"/>
+      <w:lvlText w:val="o"/>
+      <w:lvlJc w:val="left"/>
+      <w:pPr>
+        <w:ind w:left="1590" w:hanging="360"/>
+      </w:pPr>
+      <w:rPr>
+        <w:rFonts w:ascii="Courier New" w:hAnsi="Courier New" w:cs="Courier New" w:hint="default"/>
+      </w:rPr>
+    </w:lvl>
+    <w:lvl w:ilvl="2" w:tplc="04090005" w:tentative="1">
+      <w:start w:val="1"/>
+      <w:numFmt w:val="bullet"/>
+      <w:lvlText w:val=""/>
+      <w:lvlJc w:val="left"/>
+      <w:pPr>
+        <w:ind w:left="2310" w:hanging="360"/>
+      </w:pPr>
+      <w:rPr>
+        <w:rFonts w:ascii="Wingdings" w:hAnsi="Wingdings" w:hint="default"/>
+      </w:rPr>
+    </w:lvl>
+    <w:lvl w:ilvl="3" w:tplc="04090001" w:tentative="1">
+      <w:start w:val="1"/>
+      <w:numFmt w:val="bullet"/>
+      <w:lvlText w:val=""/>
+      <w:lvlJc w:val="left"/>
+      <w:pPr>
+        <w:ind w:left="3030" w:hanging="360"/>
+      </w:pPr>
+      <w:rPr>
+        <w:rFonts w:ascii="Symbol" w:hAnsi="Symbol" w:hint="default"/>
+      </w:rPr>
+    </w:lvl>
+    <w:lvl w:ilvl="4" w:tplc="04090003" w:tentative="1">
+      <w:start w:val="1"/>
+      <w:numFmt w:val="bullet"/>
+      <w:lvlText w:val="o"/>
+      <w:lvlJc w:val="left"/>
+      <w:pPr>
+        <w:ind w:left="3750" w:hanging="360"/>
+      </w:pPr>
+      <w:rPr>
+        <w:rFonts w:ascii="Courier New" w:hAnsi="Courier New" w:cs="Courier New" w:hint="default"/>
+      </w:rPr>
+    </w:lvl>
+    <w:lvl w:ilvl="5" w:tplc="04090005" w:tentative="1">
+      <w:start w:val="1"/>
+      <w:numFmt w:val="bullet"/>
+      <w:lvlText w:val=""/>
+      <w:lvlJc w:val="left"/>
+      <w:pPr>
+        <w:ind w:left="4470" w:hanging="360"/>
+      </w:pPr>
+      <w:rPr>
+        <w:rFonts w:ascii="Wingdings" w:hAnsi="Wingdings" w:hint="default"/>
+      </w:rPr>
+    </w:lvl>
+    <w:lvl w:ilvl="6" w:tplc="04090001" w:tentative="1">
+      <w:start w:val="1"/>
+      <w:numFmt w:val="bullet"/>
+      <w:lvlText w:val=""/>
+      <w:lvlJc w:val="left"/>
+      <w:pPr>
+        <w:ind w:left="5190" w:hanging="360"/>
+      </w:pPr>
+      <w:rPr>
+        <w:rFonts w:ascii="Symbol" w:hAnsi="Symbol" w:hint="default"/>
+      </w:rPr>
+    </w:lvl>
+    <w:lvl w:ilvl="7" w:tplc="04090003" w:tentative="1">
+      <w:start w:val="1"/>
+      <w:numFmt w:val="bullet"/>
+      <w:lvlText w:val="o"/>
+      <w:lvlJc w:val="left"/>
+      <w:pPr>
+        <w:ind w:left="5910" w:hanging="360"/>
+      </w:pPr>
+      <w:rPr>
+        <w:rFonts w:ascii="Courier New" w:hAnsi="Courier New" w:cs="Courier New" w:hint="default"/>
+      </w:rPr>
+    </w:lvl>
+    <w:lvl w:ilvl="8" w:tplc="04090005" w:tentative="1">
+      <w:start w:val="1"/>
+      <w:numFmt w:val="bullet"/>
+      <w:lvlText w:val=""/>
+      <w:lvlJc w:val="left"/>
+      <w:pPr>
+        <w:ind w:left="6630" w:hanging="360"/>
+      </w:pPr>
+      <w:rPr>
+        <w:rFonts w:ascii="Wingdings" w:hAnsi="Wingdings" w:hint="default"/>
+      </w:rPr>
+    </w:lvl>
+  </w:abstractNum>
+  <w:abstractNum w:abstractNumId="12" w15:restartNumberingAfterBreak="0">
     <w:nsid w:val="375614E0"/>
     <w:multiLevelType w:val="multilevel"/>
     <w:tmpl w:val="2FBA725C"/>
@@ -10928,7 +12440,120 @@
       </w:rPr>
     </w:lvl>
   </w:abstractNum>
-  <w:abstractNum w:abstractNumId="11" w15:restartNumberingAfterBreak="0">
+  <w:abstractNum w:abstractNumId="13" w15:restartNumberingAfterBreak="0">
+    <w:nsid w:val="47554DAC"/>
+    <w:multiLevelType w:val="hybridMultilevel"/>
+    <w:tmpl w:val="E57A1E42"/>
+    <w:lvl w:ilvl="0" w:tplc="04090001">
+      <w:start w:val="1"/>
+      <w:numFmt w:val="bullet"/>
+      <w:lvlText w:val=""/>
+      <w:lvlJc w:val="left"/>
+      <w:pPr>
+        <w:ind w:left="870" w:hanging="360"/>
+      </w:pPr>
+      <w:rPr>
+        <w:rFonts w:ascii="Symbol" w:hAnsi="Symbol" w:hint="default"/>
+      </w:rPr>
+    </w:lvl>
+    <w:lvl w:ilvl="1" w:tplc="04090003">
+      <w:start w:val="1"/>
+      <w:numFmt w:val="bullet"/>
+      <w:lvlText w:val="o"/>
+      <w:lvlJc w:val="left"/>
+      <w:pPr>
+        <w:ind w:left="1590" w:hanging="360"/>
+      </w:pPr>
+      <w:rPr>
+        <w:rFonts w:ascii="Courier New" w:hAnsi="Courier New" w:cs="Courier New" w:hint="default"/>
+      </w:rPr>
+    </w:lvl>
+    <w:lvl w:ilvl="2" w:tplc="04090005" w:tentative="1">
+      <w:start w:val="1"/>
+      <w:numFmt w:val="bullet"/>
+      <w:lvlText w:val=""/>
+      <w:lvlJc w:val="left"/>
+      <w:pPr>
+        <w:ind w:left="2310" w:hanging="360"/>
+      </w:pPr>
+      <w:rPr>
+        <w:rFonts w:ascii="Wingdings" w:hAnsi="Wingdings" w:hint="default"/>
+      </w:rPr>
+    </w:lvl>
+    <w:lvl w:ilvl="3" w:tplc="04090001" w:tentative="1">
+      <w:start w:val="1"/>
+      <w:numFmt w:val="bullet"/>
+      <w:lvlText w:val=""/>
+      <w:lvlJc w:val="left"/>
+      <w:pPr>
+        <w:ind w:left="3030" w:hanging="360"/>
+      </w:pPr>
+      <w:rPr>
+        <w:rFonts w:ascii="Symbol" w:hAnsi="Symbol" w:hint="default"/>
+      </w:rPr>
+    </w:lvl>
+    <w:lvl w:ilvl="4" w:tplc="04090003" w:tentative="1">
+      <w:start w:val="1"/>
+      <w:numFmt w:val="bullet"/>
+      <w:lvlText w:val="o"/>
+      <w:lvlJc w:val="left"/>
+      <w:pPr>
+        <w:ind w:left="3750" w:hanging="360"/>
+      </w:pPr>
+      <w:rPr>
+        <w:rFonts w:ascii="Courier New" w:hAnsi="Courier New" w:cs="Courier New" w:hint="default"/>
+      </w:rPr>
+    </w:lvl>
+    <w:lvl w:ilvl="5" w:tplc="04090005" w:tentative="1">
+      <w:start w:val="1"/>
+      <w:numFmt w:val="bullet"/>
+      <w:lvlText w:val=""/>
+      <w:lvlJc w:val="left"/>
+      <w:pPr>
+        <w:ind w:left="4470" w:hanging="360"/>
+      </w:pPr>
+      <w:rPr>
+        <w:rFonts w:ascii="Wingdings" w:hAnsi="Wingdings" w:hint="default"/>
+      </w:rPr>
+    </w:lvl>
+    <w:lvl w:ilvl="6" w:tplc="04090001" w:tentative="1">
+      <w:start w:val="1"/>
+      <w:numFmt w:val="bullet"/>
+      <w:lvlText w:val=""/>
+      <w:lvlJc w:val="left"/>
+      <w:pPr>
+        <w:ind w:left="5190" w:hanging="360"/>
+      </w:pPr>
+      <w:rPr>
+        <w:rFonts w:ascii="Symbol" w:hAnsi="Symbol" w:hint="default"/>
+      </w:rPr>
+    </w:lvl>
+    <w:lvl w:ilvl="7" w:tplc="04090003" w:tentative="1">
+      <w:start w:val="1"/>
+      <w:numFmt w:val="bullet"/>
+      <w:lvlText w:val="o"/>
+      <w:lvlJc w:val="left"/>
+      <w:pPr>
+        <w:ind w:left="5910" w:hanging="360"/>
+      </w:pPr>
+      <w:rPr>
+        <w:rFonts w:ascii="Courier New" w:hAnsi="Courier New" w:cs="Courier New" w:hint="default"/>
+      </w:rPr>
+    </w:lvl>
+    <w:lvl w:ilvl="8" w:tplc="04090005" w:tentative="1">
+      <w:start w:val="1"/>
+      <w:numFmt w:val="bullet"/>
+      <w:lvlText w:val=""/>
+      <w:lvlJc w:val="left"/>
+      <w:pPr>
+        <w:ind w:left="6630" w:hanging="360"/>
+      </w:pPr>
+      <w:rPr>
+        <w:rFonts w:ascii="Wingdings" w:hAnsi="Wingdings" w:hint="default"/>
+      </w:rPr>
+    </w:lvl>
+  </w:abstractNum>
+  <w:abstractNum w:abstractNumId="14" w15:restartNumberingAfterBreak="0">
     <w:nsid w:val="48094DC9"/>
     <w:multiLevelType w:val="multilevel"/>
     <w:tmpl w:val="D82EE0F6"/>
@@ -11077,7 +12702,233 @@
       </w:rPr>
     </w:lvl>
   </w:abstractNum>
-  <w:abstractNum w:abstractNumId="12" w15:restartNumberingAfterBreak="0">
+  <w:abstractNum w:abstractNumId="15" w15:restartNumberingAfterBreak="0">
+    <w:nsid w:val="48E71C6A"/>
+    <w:multiLevelType w:val="hybridMultilevel"/>
+    <w:tmpl w:val="5002EE36"/>
+    <w:lvl w:ilvl="0" w:tplc="04090001">
+      <w:start w:val="1"/>
+      <w:numFmt w:val="bullet"/>
+      <w:lvlText w:val=""/>
+      <w:lvlJc w:val="left"/>
+      <w:pPr>
+        <w:ind w:left="720" w:hanging="360"/>
+      </w:pPr>
+      <w:rPr>
+        <w:rFonts w:ascii="Symbol" w:hAnsi="Symbol" w:hint="default"/>
+      </w:rPr>
+    </w:lvl>
+    <w:lvl w:ilvl="1" w:tplc="FFFFFFFF">
+      <w:start w:val="1"/>
+      <w:numFmt w:val="bullet"/>
+      <w:lvlText w:val="o"/>
+      <w:lvlJc w:val="left"/>
+      <w:pPr>
+        <w:ind w:left="1440" w:hanging="360"/>
+      </w:pPr>
+      <w:rPr>
+        <w:rFonts w:ascii="Courier New" w:hAnsi="Courier New" w:cs="Courier New" w:hint="default"/>
+      </w:rPr>
+    </w:lvl>
+    <w:lvl w:ilvl="2" w:tplc="FFFFFFFF" w:tentative="1">
+      <w:start w:val="1"/>
+      <w:numFmt w:val="bullet"/>
+      <w:lvlText w:val=""/>
+      <w:lvlJc w:val="left"/>
+      <w:pPr>
+        <w:ind w:left="2160" w:hanging="360"/>
+      </w:pPr>
+      <w:rPr>
+        <w:rFonts w:ascii="Wingdings" w:hAnsi="Wingdings" w:hint="default"/>
+      </w:rPr>
+    </w:lvl>
+    <w:lvl w:ilvl="3" w:tplc="FFFFFFFF" w:tentative="1">
+      <w:start w:val="1"/>
+      <w:numFmt w:val="bullet"/>
+      <w:lvlText w:val=""/>
+      <w:lvlJc w:val="left"/>
+      <w:pPr>
+        <w:ind w:left="2880" w:hanging="360"/>
+      </w:pPr>
+      <w:rPr>
+        <w:rFonts w:ascii="Symbol" w:hAnsi="Symbol" w:hint="default"/>
+      </w:rPr>
+    </w:lvl>
+    <w:lvl w:ilvl="4" w:tplc="FFFFFFFF" w:tentative="1">
+      <w:start w:val="1"/>
+      <w:numFmt w:val="bullet"/>
+      <w:lvlText w:val="o"/>
+      <w:lvlJc w:val="left"/>
+      <w:pPr>
+        <w:ind w:left="3600" w:hanging="360"/>
+      </w:pPr>
+      <w:rPr>
+        <w:rFonts w:ascii="Courier New" w:hAnsi="Courier New" w:cs="Courier New" w:hint="default"/>
+      </w:rPr>
+    </w:lvl>
+    <w:lvl w:ilvl="5" w:tplc="FFFFFFFF" w:tentative="1">
+      <w:start w:val="1"/>
+      <w:numFmt w:val="bullet"/>
+      <w:lvlText w:val=""/>
+      <w:lvlJc w:val="left"/>
+      <w:pPr>
+        <w:ind w:left="4320" w:hanging="360"/>
+      </w:pPr>
+      <w:rPr>
+        <w:rFonts w:ascii="Wingdings" w:hAnsi="Wingdings" w:hint="default"/>
+      </w:rPr>
+    </w:lvl>
+    <w:lvl w:ilvl="6" w:tplc="FFFFFFFF" w:tentative="1">
+      <w:start w:val="1"/>
+      <w:numFmt w:val="bullet"/>
+      <w:lvlText w:val=""/>
+      <w:lvlJc w:val="left"/>
+      <w:pPr>
+        <w:ind w:left="5040" w:hanging="360"/>
+      </w:pPr>
+      <w:rPr>
+        <w:rFonts w:ascii="Symbol" w:hAnsi="Symbol" w:hint="default"/>
+      </w:rPr>
+    </w:lvl>
+    <w:lvl w:ilvl="7" w:tplc="FFFFFFFF" w:tentative="1">
+      <w:start w:val="1"/>
+      <w:numFmt w:val="bullet"/>
+      <w:lvlText w:val="o"/>
+      <w:lvlJc w:val="left"/>
+      <w:pPr>
+        <w:ind w:left="5760" w:hanging="360"/>
+      </w:pPr>
+      <w:rPr>
+        <w:rFonts w:ascii="Courier New" w:hAnsi="Courier New" w:cs="Courier New" w:hint="default"/>
+      </w:rPr>
+    </w:lvl>
+    <w:lvl w:ilvl="8" w:tplc="FFFFFFFF" w:tentative="1">
+      <w:start w:val="1"/>
+      <w:numFmt w:val="bullet"/>
+      <w:lvlText w:val=""/>
+      <w:lvlJc w:val="left"/>
+      <w:pPr>
+        <w:ind w:left="6480" w:hanging="360"/>
+      </w:pPr>
+      <w:rPr>
+        <w:rFonts w:ascii="Wingdings" w:hAnsi="Wingdings" w:hint="default"/>
+      </w:rPr>
+    </w:lvl>
+  </w:abstractNum>
+  <w:abstractNum w:abstractNumId="16" w15:restartNumberingAfterBreak="0">
+    <w:nsid w:val="499466EE"/>
+    <w:multiLevelType w:val="hybridMultilevel"/>
+    <w:tmpl w:val="31281FC4"/>
+    <w:lvl w:ilvl="0" w:tplc="04090001">
+      <w:start w:val="1"/>
+      <w:numFmt w:val="bullet"/>
+      <w:lvlText w:val=""/>
+      <w:lvlJc w:val="left"/>
+      <w:pPr>
+        <w:ind w:left="720" w:hanging="360"/>
+      </w:pPr>
+      <w:rPr>
+        <w:rFonts w:ascii="Symbol" w:hAnsi="Symbol" w:hint="default"/>
+      </w:rPr>
+    </w:lvl>
+    <w:lvl w:ilvl="1" w:tplc="04090003" w:tentative="1">
+      <w:start w:val="1"/>
+      <w:numFmt w:val="bullet"/>
+      <w:lvlText w:val="o"/>
+      <w:lvlJc w:val="left"/>
+      <w:pPr>
+        <w:ind w:left="1440" w:hanging="360"/>
+      </w:pPr>
+      <w:rPr>
+        <w:rFonts w:ascii="Courier New" w:hAnsi="Courier New" w:cs="Courier New" w:hint="default"/>
+      </w:rPr>
+    </w:lvl>
+    <w:lvl w:ilvl="2" w:tplc="04090005" w:tentative="1">
+      <w:start w:val="1"/>
+      <w:numFmt w:val="bullet"/>
+      <w:lvlText w:val=""/>
+      <w:lvlJc w:val="left"/>
+      <w:pPr>
+        <w:ind w:left="2160" w:hanging="360"/>
+      </w:pPr>
+      <w:rPr>
+        <w:rFonts w:ascii="Wingdings" w:hAnsi="Wingdings" w:hint="default"/>
+      </w:rPr>
+    </w:lvl>
+    <w:lvl w:ilvl="3" w:tplc="04090001" w:tentative="1">
+      <w:start w:val="1"/>
+      <w:numFmt w:val="bullet"/>
+      <w:lvlText w:val=""/>
+      <w:lvlJc w:val="left"/>
+      <w:pPr>
+        <w:ind w:left="2880" w:hanging="360"/>
+      </w:pPr>
+      <w:rPr>
+        <w:rFonts w:ascii="Symbol" w:hAnsi="Symbol" w:hint="default"/>
+      </w:rPr>
+    </w:lvl>
+    <w:lvl w:ilvl="4" w:tplc="04090003" w:tentative="1">
+      <w:start w:val="1"/>
+      <w:numFmt w:val="bullet"/>
+      <w:lvlText w:val="o"/>
+      <w:lvlJc w:val="left"/>
+      <w:pPr>
+        <w:ind w:left="3600" w:hanging="360"/>
+      </w:pPr>
+      <w:rPr>
+        <w:rFonts w:ascii="Courier New" w:hAnsi="Courier New" w:cs="Courier New" w:hint="default"/>
+      </w:rPr>
+    </w:lvl>
+    <w:lvl w:ilvl="5" w:tplc="04090005" w:tentative="1">
+      <w:start w:val="1"/>
+      <w:numFmt w:val="bullet"/>
+      <w:lvlText w:val=""/>
+      <w:lvlJc w:val="left"/>
+      <w:pPr>
+        <w:ind w:left="4320" w:hanging="360"/>
+      </w:pPr>
+      <w:rPr>
+        <w:rFonts w:ascii="Wingdings" w:hAnsi="Wingdings" w:hint="default"/>
+      </w:rPr>
+    </w:lvl>
+    <w:lvl w:ilvl="6" w:tplc="04090001" w:tentative="1">
+      <w:start w:val="1"/>
+      <w:numFmt w:val="bullet"/>
+      <w:lvlText w:val=""/>
+      <w:lvlJc w:val="left"/>
+      <w:pPr>
+        <w:ind w:left="5040" w:hanging="360"/>
+      </w:pPr>
+      <w:rPr>
+        <w:rFonts w:ascii="Symbol" w:hAnsi="Symbol" w:hint="default"/>
+      </w:rPr>
+    </w:lvl>
+    <w:lvl w:ilvl="7" w:tplc="04090003" w:tentative="1">
+      <w:start w:val="1"/>
+      <w:numFmt w:val="bullet"/>
+      <w:lvlText w:val="o"/>
+      <w:lvlJc w:val="left"/>
+      <w:pPr>
+        <w:ind w:left="5760" w:hanging="360"/>
+      </w:pPr>
+      <w:rPr>
+        <w:rFonts w:ascii="Courier New" w:hAnsi="Courier New" w:cs="Courier New" w:hint="default"/>
+      </w:rPr>
+    </w:lvl>
+    <w:lvl w:ilvl="8" w:tplc="04090005" w:tentative="1">
+      <w:start w:val="1"/>
+      <w:numFmt w:val="bullet"/>
+      <w:lvlText w:val=""/>
+      <w:lvlJc w:val="left"/>
+      <w:pPr>
+        <w:ind w:left="6480" w:hanging="360"/>
+      </w:pPr>
+      <w:rPr>
+        <w:rFonts w:ascii="Wingdings" w:hAnsi="Wingdings" w:hint="default"/>
+      </w:rPr>
+    </w:lvl>
+  </w:abstractNum>
+  <w:abstractNum w:abstractNumId="17" w15:restartNumberingAfterBreak="0">
     <w:nsid w:val="4BF35F64"/>
     <w:multiLevelType w:val="multilevel"/>
     <w:tmpl w:val="B21A38E8"/>
@@ -11226,7 +13077,7 @@
       </w:rPr>
     </w:lvl>
   </w:abstractNum>
-  <w:abstractNum w:abstractNumId="13" w15:restartNumberingAfterBreak="0">
+  <w:abstractNum w:abstractNumId="18" w15:restartNumberingAfterBreak="0">
     <w:nsid w:val="50E526C1"/>
     <w:multiLevelType w:val="hybridMultilevel"/>
     <w:tmpl w:val="DA885166"/>
@@ -11366,7 +13217,7 @@
       </w:rPr>
     </w:lvl>
   </w:abstractNum>
-  <w:abstractNum w:abstractNumId="14" w15:restartNumberingAfterBreak="0">
+  <w:abstractNum w:abstractNumId="19" w15:restartNumberingAfterBreak="0">
     <w:nsid w:val="52097494"/>
     <w:multiLevelType w:val="hybridMultilevel"/>
     <w:tmpl w:val="6366A168"/>
@@ -11479,7 +13330,120 @@
       </w:rPr>
     </w:lvl>
   </w:abstractNum>
-  <w:abstractNum w:abstractNumId="15" w15:restartNumberingAfterBreak="0">
+  <w:abstractNum w:abstractNumId="20" w15:restartNumberingAfterBreak="0">
+    <w:nsid w:val="548071BC"/>
+    <w:multiLevelType w:val="hybridMultilevel"/>
+    <w:tmpl w:val="97E493C0"/>
+    <w:lvl w:ilvl="0" w:tplc="04090001">
+      <w:start w:val="1"/>
+      <w:numFmt w:val="bullet"/>
+      <w:lvlText w:val=""/>
+      <w:lvlJc w:val="left"/>
+      <w:pPr>
+        <w:ind w:left="720" w:hanging="360"/>
+      </w:pPr>
+      <w:rPr>
+        <w:rFonts w:ascii="Symbol" w:hAnsi="Symbol" w:hint="default"/>
+      </w:rPr>
+    </w:lvl>
+    <w:lvl w:ilvl="1" w:tplc="04090003">
+      <w:start w:val="1"/>
+      <w:numFmt w:val="bullet"/>
+      <w:lvlText w:val="o"/>
+      <w:lvlJc w:val="left"/>
+      <w:pPr>
+        <w:ind w:left="1440" w:hanging="360"/>
+      </w:pPr>
+      <w:rPr>
+        <w:rFonts w:ascii="Courier New" w:hAnsi="Courier New" w:cs="Courier New" w:hint="default"/>
+      </w:rPr>
+    </w:lvl>
+    <w:lvl w:ilvl="2" w:tplc="04090005" w:tentative="1">
+      <w:start w:val="1"/>
+      <w:numFmt w:val="bullet"/>
+      <w:lvlText w:val=""/>
+      <w:lvlJc w:val="left"/>
+      <w:pPr>
+        <w:ind w:left="2160" w:hanging="360"/>
+      </w:pPr>
+      <w:rPr>
+        <w:rFonts w:ascii="Wingdings" w:hAnsi="Wingdings" w:hint="default"/>
+      </w:rPr>
+    </w:lvl>
+    <w:lvl w:ilvl="3" w:tplc="04090001" w:tentative="1">
+      <w:start w:val="1"/>
+      <w:numFmt w:val="bullet"/>
+      <w:lvlText w:val=""/>
+      <w:lvlJc w:val="left"/>
+      <w:pPr>
+        <w:ind w:left="2880" w:hanging="360"/>
+      </w:pPr>
+      <w:rPr>
+        <w:rFonts w:ascii="Symbol" w:hAnsi="Symbol" w:hint="default"/>
+      </w:rPr>
+    </w:lvl>
+    <w:lvl w:ilvl="4" w:tplc="04090003" w:tentative="1">
+      <w:start w:val="1"/>
+      <w:numFmt w:val="bullet"/>
+      <w:lvlText w:val="o"/>
+      <w:lvlJc w:val="left"/>
+      <w:pPr>
+        <w:ind w:left="3600" w:hanging="360"/>
+      </w:pPr>
+      <w:rPr>
+        <w:rFonts w:ascii="Courier New" w:hAnsi="Courier New" w:cs="Courier New" w:hint="default"/>
+      </w:rPr>
+    </w:lvl>
+    <w:lvl w:ilvl="5" w:tplc="04090005" w:tentative="1">
+      <w:start w:val="1"/>
+      <w:numFmt w:val="bullet"/>
+      <w:lvlText w:val=""/>
+      <w:lvlJc w:val="left"/>
+      <w:pPr>
+        <w:ind w:left="4320" w:hanging="360"/>
+      </w:pPr>
+      <w:rPr>
+        <w:rFonts w:ascii="Wingdings" w:hAnsi="Wingdings" w:hint="default"/>
+      </w:rPr>
+    </w:lvl>
+    <w:lvl w:ilvl="6" w:tplc="04090001" w:tentative="1">
+      <w:start w:val="1"/>
+      <w:numFmt w:val="bullet"/>
+      <w:lvlText w:val=""/>
+      <w:lvlJc w:val="left"/>
+      <w:pPr>
+        <w:ind w:left="5040" w:hanging="360"/>
+      </w:pPr>
+      <w:rPr>
+        <w:rFonts w:ascii="Symbol" w:hAnsi="Symbol" w:hint="default"/>
+      </w:rPr>
+    </w:lvl>
+    <w:lvl w:ilvl="7" w:tplc="04090003" w:tentative="1">
+      <w:start w:val="1"/>
+      <w:numFmt w:val="bullet"/>
+      <w:lvlText w:val="o"/>
+      <w:lvlJc w:val="left"/>
+      <w:pPr>
+        <w:ind w:left="5760" w:hanging="360"/>
+      </w:pPr>
+      <w:rPr>
+        <w:rFonts w:ascii="Courier New" w:hAnsi="Courier New" w:cs="Courier New" w:hint="default"/>
+      </w:rPr>
+    </w:lvl>
+    <w:lvl w:ilvl="8" w:tplc="04090005" w:tentative="1">
+      <w:start w:val="1"/>
+      <w:numFmt w:val="bullet"/>
+      <w:lvlText w:val=""/>
+      <w:lvlJc w:val="left"/>
+      <w:pPr>
+        <w:ind w:left="6480" w:hanging="360"/>
+      </w:pPr>
+      <w:rPr>
+        <w:rFonts w:ascii="Wingdings" w:hAnsi="Wingdings" w:hint="default"/>
+      </w:rPr>
+    </w:lvl>
+  </w:abstractNum>
+  <w:abstractNum w:abstractNumId="21" w15:restartNumberingAfterBreak="0">
     <w:nsid w:val="689F6277"/>
     <w:multiLevelType w:val="hybridMultilevel"/>
     <w:tmpl w:val="05ACD098"/>
@@ -11619,7 +13583,7 @@
       </w:rPr>
     </w:lvl>
   </w:abstractNum>
-  <w:abstractNum w:abstractNumId="16" w15:restartNumberingAfterBreak="0">
+  <w:abstractNum w:abstractNumId="22" w15:restartNumberingAfterBreak="0">
     <w:nsid w:val="6F485DFC"/>
     <w:multiLevelType w:val="multilevel"/>
     <w:tmpl w:val="D2B4C112"/>
@@ -11738,7 +13702,120 @@
       </w:rPr>
     </w:lvl>
   </w:abstractNum>
-  <w:abstractNum w:abstractNumId="17" w15:restartNumberingAfterBreak="0">
+  <w:abstractNum w:abstractNumId="23" w15:restartNumberingAfterBreak="0">
+    <w:nsid w:val="7457759A"/>
+    <w:multiLevelType w:val="hybridMultilevel"/>
+    <w:tmpl w:val="E3002684"/>
+    <w:lvl w:ilvl="0" w:tplc="04090001">
+      <w:start w:val="1"/>
+      <w:numFmt w:val="bullet"/>
+      <w:lvlText w:val=""/>
+      <w:lvlJc w:val="left"/>
+      <w:pPr>
+        <w:ind w:left="870" w:hanging="360"/>
+      </w:pPr>
+      <w:rPr>
+        <w:rFonts w:ascii="Symbol" w:hAnsi="Symbol" w:hint="default"/>
+      </w:rPr>
+    </w:lvl>
+    <w:lvl w:ilvl="1" w:tplc="04090003">
+      <w:start w:val="1"/>
+      <w:numFmt w:val="bullet"/>
+      <w:lvlText w:val="o"/>
+      <w:lvlJc w:val="left"/>
+      <w:pPr>
+        <w:ind w:left="1590" w:hanging="360"/>
+      </w:pPr>
+      <w:rPr>
+        <w:rFonts w:ascii="Courier New" w:hAnsi="Courier New" w:cs="Courier New" w:hint="default"/>
+      </w:rPr>
+    </w:lvl>
+    <w:lvl w:ilvl="2" w:tplc="04090005" w:tentative="1">
+      <w:start w:val="1"/>
+      <w:numFmt w:val="bullet"/>
+      <w:lvlText w:val=""/>
+      <w:lvlJc w:val="left"/>
+      <w:pPr>
+        <w:ind w:left="2310" w:hanging="360"/>
+      </w:pPr>
+      <w:rPr>
+        <w:rFonts w:ascii="Wingdings" w:hAnsi="Wingdings" w:hint="default"/>
+      </w:rPr>
+    </w:lvl>
+    <w:lvl w:ilvl="3" w:tplc="04090001" w:tentative="1">
+      <w:start w:val="1"/>
+      <w:numFmt w:val="bullet"/>
+      <w:lvlText w:val=""/>
+      <w:lvlJc w:val="left"/>
+      <w:pPr>
+        <w:ind w:left="3030" w:hanging="360"/>
+      </w:pPr>
+      <w:rPr>
+        <w:rFonts w:ascii="Symbol" w:hAnsi="Symbol" w:hint="default"/>
+      </w:rPr>
+    </w:lvl>
+    <w:lvl w:ilvl="4" w:tplc="04090003" w:tentative="1">
+      <w:start w:val="1"/>
+      <w:numFmt w:val="bullet"/>
+      <w:lvlText w:val="o"/>
+      <w:lvlJc w:val="left"/>
+      <w:pPr>
+        <w:ind w:left="3750" w:hanging="360"/>
+      </w:pPr>
+      <w:rPr>
+        <w:rFonts w:ascii="Courier New" w:hAnsi="Courier New" w:cs="Courier New" w:hint="default"/>
+      </w:rPr>
+    </w:lvl>
+    <w:lvl w:ilvl="5" w:tplc="04090005" w:tentative="1">
+      <w:start w:val="1"/>
+      <w:numFmt w:val="bullet"/>
+      <w:lvlText w:val=""/>
+      <w:lvlJc w:val="left"/>
+      <w:pPr>
+        <w:ind w:left="4470" w:hanging="360"/>
+      </w:pPr>
+      <w:rPr>
+        <w:rFonts w:ascii="Wingdings" w:hAnsi="Wingdings" w:hint="default"/>
+      </w:rPr>
+    </w:lvl>
+    <w:lvl w:ilvl="6" w:tplc="04090001" w:tentative="1">
+      <w:start w:val="1"/>
+      <w:numFmt w:val="bullet"/>
+      <w:lvlText w:val=""/>
+      <w:lvlJc w:val="left"/>
+      <w:pPr>
+        <w:ind w:left="5190" w:hanging="360"/>
+      </w:pPr>
+      <w:rPr>
+        <w:rFonts w:ascii="Symbol" w:hAnsi="Symbol" w:hint="default"/>
+      </w:rPr>
+    </w:lvl>
+    <w:lvl w:ilvl="7" w:tplc="04090003" w:tentative="1">
+      <w:start w:val="1"/>
+      <w:numFmt w:val="bullet"/>
+      <w:lvlText w:val="o"/>
+      <w:lvlJc w:val="left"/>
+      <w:pPr>
+        <w:ind w:left="5910" w:hanging="360"/>
+      </w:pPr>
+      <w:rPr>
+        <w:rFonts w:ascii="Courier New" w:hAnsi="Courier New" w:cs="Courier New" w:hint="default"/>
+      </w:rPr>
+    </w:lvl>
+    <w:lvl w:ilvl="8" w:tplc="04090005" w:tentative="1">
+      <w:start w:val="1"/>
+      <w:numFmt w:val="bullet"/>
+      <w:lvlText w:val=""/>
+      <w:lvlJc w:val="left"/>
+      <w:pPr>
+        <w:ind w:left="6630" w:hanging="360"/>
+      </w:pPr>
+      <w:rPr>
+        <w:rFonts w:ascii="Wingdings" w:hAnsi="Wingdings" w:hint="default"/>
+      </w:rPr>
+    </w:lvl>
+  </w:abstractNum>
+  <w:abstractNum w:abstractNumId="24" w15:restartNumberingAfterBreak="0">
     <w:nsid w:val="78D846DC"/>
     <w:multiLevelType w:val="multilevel"/>
     <w:tmpl w:val="3B18598C"/>
@@ -11887,7 +13964,7 @@
       </w:rPr>
     </w:lvl>
   </w:abstractNum>
-  <w:abstractNum w:abstractNumId="18" w15:restartNumberingAfterBreak="0">
+  <w:abstractNum w:abstractNumId="25" w15:restartNumberingAfterBreak="0">
     <w:nsid w:val="7F036A23"/>
     <w:multiLevelType w:val="multilevel"/>
     <w:tmpl w:val="244A6DF0"/>
@@ -12040,25 +14117,25 @@
     <w:abstractNumId w:val="2"/>
   </w:num>
   <w:num w:numId="2" w16cid:durableId="627902492">
-    <w:abstractNumId w:val="15"/>
+    <w:abstractNumId w:val="21"/>
   </w:num>
   <w:num w:numId="3" w16cid:durableId="912547172">
     <w:abstractNumId w:val="3"/>
   </w:num>
   <w:num w:numId="4" w16cid:durableId="1367682481">
-    <w:abstractNumId w:val="13"/>
+    <w:abstractNumId w:val="18"/>
   </w:num>
   <w:num w:numId="5" w16cid:durableId="1404177357">
-    <w:abstractNumId w:val="10"/>
+    <w:abstractNumId w:val="12"/>
   </w:num>
   <w:num w:numId="6" w16cid:durableId="1981764410">
-    <w:abstractNumId w:val="17"/>
+    <w:abstractNumId w:val="24"/>
   </w:num>
   <w:num w:numId="7" w16cid:durableId="107283844">
     <w:abstractNumId w:val="7"/>
   </w:num>
   <w:num w:numId="8" w16cid:durableId="1975523739">
-    <w:abstractNumId w:val="10"/>
+    <w:abstractNumId w:val="12"/>
     <w:lvlOverride w:ilvl="0">
       <w:lvl w:ilvl="0">
         <w:start w:val="1"/>
@@ -12190,19 +14267,19 @@
     </w:lvlOverride>
   </w:num>
   <w:num w:numId="9" w16cid:durableId="75173249">
-    <w:abstractNumId w:val="9"/>
+    <w:abstractNumId w:val="10"/>
   </w:num>
   <w:num w:numId="10" w16cid:durableId="2005090684">
-    <w:abstractNumId w:val="16"/>
+    <w:abstractNumId w:val="22"/>
   </w:num>
   <w:num w:numId="11" w16cid:durableId="634599052">
-    <w:abstractNumId w:val="14"/>
+    <w:abstractNumId w:val="19"/>
   </w:num>
   <w:num w:numId="12" w16cid:durableId="216943288">
     <w:abstractNumId w:val="1"/>
   </w:num>
   <w:num w:numId="13" w16cid:durableId="1246770191">
-    <w:abstractNumId w:val="12"/>
+    <w:abstractNumId w:val="17"/>
   </w:num>
   <w:num w:numId="14" w16cid:durableId="1564170393">
     <w:abstractNumId w:val="8"/>
@@ -12211,13 +14288,13 @@
     <w:abstractNumId w:val="4"/>
   </w:num>
   <w:num w:numId="16" w16cid:durableId="1854220757">
-    <w:abstractNumId w:val="11"/>
+    <w:abstractNumId w:val="14"/>
   </w:num>
   <w:num w:numId="17" w16cid:durableId="730805812">
     <w:abstractNumId w:val="0"/>
   </w:num>
   <w:num w:numId="18" w16cid:durableId="1218738952">
-    <w:abstractNumId w:val="16"/>
+    <w:abstractNumId w:val="22"/>
     <w:lvlOverride w:ilvl="0">
       <w:startOverride w:val="1"/>
     </w:lvlOverride>
@@ -12247,7 +14324,7 @@
     </w:lvlOverride>
   </w:num>
   <w:num w:numId="19" w16cid:durableId="996035107">
-    <w:abstractNumId w:val="16"/>
+    <w:abstractNumId w:val="22"/>
     <w:lvlOverride w:ilvl="0">
       <w:startOverride w:val="1"/>
     </w:lvlOverride>
@@ -12280,10 +14357,31 @@
     <w:abstractNumId w:val="5"/>
   </w:num>
   <w:num w:numId="21" w16cid:durableId="314264928">
-    <w:abstractNumId w:val="18"/>
+    <w:abstractNumId w:val="25"/>
   </w:num>
   <w:num w:numId="22" w16cid:durableId="1828670340">
     <w:abstractNumId w:val="6"/>
+  </w:num>
+  <w:num w:numId="23" w16cid:durableId="2037149605">
+    <w:abstractNumId w:val="16"/>
+  </w:num>
+  <w:num w:numId="24" w16cid:durableId="756636312">
+    <w:abstractNumId w:val="11"/>
+  </w:num>
+  <w:num w:numId="25" w16cid:durableId="1272977568">
+    <w:abstractNumId w:val="15"/>
+  </w:num>
+  <w:num w:numId="26" w16cid:durableId="748574593">
+    <w:abstractNumId w:val="13"/>
+  </w:num>
+  <w:num w:numId="27" w16cid:durableId="703556631">
+    <w:abstractNumId w:val="23"/>
+  </w:num>
+  <w:num w:numId="28" w16cid:durableId="835846152">
+    <w:abstractNumId w:val="20"/>
+  </w:num>
+  <w:num w:numId="29" w16cid:durableId="628586268">
+    <w:abstractNumId w:val="9"/>
   </w:num>
 </w:numbering>
 </file>
@@ -12779,6 +14877,7 @@
   <w:style w:type="character" w:default="1" w:styleId="Phngmcinhcuaoanvn">
     <w:name w:val="Default Paragraph Font"/>
     <w:uiPriority w:val="1"/>
+    <w:semiHidden/>
     <w:unhideWhenUsed/>
   </w:style>
   <w:style w:type="table" w:default="1" w:styleId="BangThngthng">
@@ -13093,6 +15192,82 @@
       <w:bCs/>
     </w:rPr>
   </w:style>
+  <w:style w:type="table" w:styleId="BangLi4-Nhnmanh5">
+    <w:name w:val="Grid Table 4 Accent 5"/>
+    <w:basedOn w:val="BangThngthng"/>
+    <w:uiPriority w:val="49"/>
+    <w:rsid w:val="005219A3"/>
+    <w:pPr>
+      <w:spacing w:after="0" w:line="240" w:lineRule="auto"/>
+    </w:pPr>
+    <w:tblPr>
+      <w:tblStyleRowBandSize w:val="1"/>
+      <w:tblStyleColBandSize w:val="1"/>
+      <w:tblBorders>
+        <w:top w:val="single" w:sz="4" w:space="0" w:color="8EAADB" w:themeColor="accent5" w:themeTint="99"/>
+        <w:left w:val="single" w:sz="4" w:space="0" w:color="8EAADB" w:themeColor="accent5" w:themeTint="99"/>
+        <w:bottom w:val="single" w:sz="4" w:space="0" w:color="8EAADB" w:themeColor="accent5" w:themeTint="99"/>
+        <w:right w:val="single" w:sz="4" w:space="0" w:color="8EAADB" w:themeColor="accent5" w:themeTint="99"/>
+        <w:insideH w:val="single" w:sz="4" w:space="0" w:color="8EAADB" w:themeColor="accent5" w:themeTint="99"/>
+        <w:insideV w:val="single" w:sz="4" w:space="0" w:color="8EAADB" w:themeColor="accent5" w:themeTint="99"/>
+      </w:tblBorders>
+    </w:tblPr>
+    <w:tblStylePr w:type="firstRow">
+      <w:rPr>
+        <w:b/>
+        <w:bCs/>
+        <w:color w:val="FFFFFF" w:themeColor="background1"/>
+      </w:rPr>
+      <w:tblPr/>
+      <w:tcPr>
+        <w:tcBorders>
+          <w:top w:val="single" w:sz="4" w:space="0" w:color="4472C4" w:themeColor="accent5"/>
+          <w:left w:val="single" w:sz="4" w:space="0" w:color="4472C4" w:themeColor="accent5"/>
+          <w:bottom w:val="single" w:sz="4" w:space="0" w:color="4472C4" w:themeColor="accent5"/>
+          <w:right w:val="single" w:sz="4" w:space="0" w:color="4472C4" w:themeColor="accent5"/>
+          <w:insideH w:val="nil"/>
+          <w:insideV w:val="nil"/>
+        </w:tcBorders>
+        <w:shd w:val="clear" w:color="auto" w:fill="4472C4" w:themeFill="accent5"/>
+      </w:tcPr>
+    </w:tblStylePr>
+    <w:tblStylePr w:type="lastRow">
+      <w:rPr>
+        <w:b/>
+        <w:bCs/>
+      </w:rPr>
+      <w:tblPr/>
+      <w:tcPr>
+        <w:tcBorders>
+          <w:top w:val="double" w:sz="4" w:space="0" w:color="4472C4" w:themeColor="accent5"/>
+        </w:tcBorders>
+      </w:tcPr>
+    </w:tblStylePr>
+    <w:tblStylePr w:type="firstCol">
+      <w:rPr>
+        <w:b/>
+        <w:bCs/>
+      </w:rPr>
+    </w:tblStylePr>
+    <w:tblStylePr w:type="lastCol">
+      <w:rPr>
+        <w:b/>
+        <w:bCs/>
+      </w:rPr>
+    </w:tblStylePr>
+    <w:tblStylePr w:type="band1Vert">
+      <w:tblPr/>
+      <w:tcPr>
+        <w:shd w:val="clear" w:color="auto" w:fill="D9E2F3" w:themeFill="accent5" w:themeFillTint="33"/>
+      </w:tcPr>
+    </w:tblStylePr>
+    <w:tblStylePr w:type="band1Horz">
+      <w:tblPr/>
+      <w:tcPr>
+        <w:shd w:val="clear" w:color="auto" w:fill="D9E2F3" w:themeFill="accent5" w:themeFillTint="33"/>
+      </w:tcPr>
+    </w:tblStylePr>
+  </w:style>
 </w:styles>
 </file>
 

</xml_diff>

<commit_message>
bo sung noi dung chuong 1
</commit_message>
<xml_diff>
--- a/docs/Đào Huy Hoàng-Đề cương BTL_2026.docx
+++ b/docs/Đào Huy Hoàng-Đề cương BTL_2026.docx
@@ -1054,7 +1054,7 @@
                 <w:webHidden/>
                 <w:szCs w:val="26"/>
               </w:rPr>
-              <w:t>9</w:t>
+              <w:t>12</w:t>
             </w:r>
             <w:r>
               <w:rPr>
@@ -1143,7 +1143,7 @@
                 <w:webHidden/>
                 <w:szCs w:val="26"/>
               </w:rPr>
-              <w:t>9</w:t>
+              <w:t>12</w:t>
             </w:r>
             <w:r>
               <w:rPr>
@@ -1232,7 +1232,7 @@
                 <w:webHidden/>
                 <w:szCs w:val="26"/>
               </w:rPr>
-              <w:t>10</w:t>
+              <w:t>13</w:t>
             </w:r>
             <w:r>
               <w:rPr>
@@ -1321,7 +1321,7 @@
                 <w:webHidden/>
                 <w:szCs w:val="26"/>
               </w:rPr>
-              <w:t>10</w:t>
+              <w:t>13</w:t>
             </w:r>
             <w:r>
               <w:rPr>
@@ -1410,7 +1410,7 @@
                 <w:webHidden/>
                 <w:szCs w:val="26"/>
               </w:rPr>
-              <w:t>10</w:t>
+              <w:t>13</w:t>
             </w:r>
             <w:r>
               <w:rPr>
@@ -1499,7 +1499,7 @@
                 <w:webHidden/>
                 <w:szCs w:val="26"/>
               </w:rPr>
-              <w:t>10</w:t>
+              <w:t>17</w:t>
             </w:r>
             <w:r>
               <w:rPr>
@@ -1588,7 +1588,7 @@
                 <w:webHidden/>
                 <w:szCs w:val="26"/>
               </w:rPr>
-              <w:t>10</w:t>
+              <w:t>20</w:t>
             </w:r>
             <w:r>
               <w:rPr>
@@ -1677,7 +1677,7 @@
                 <w:webHidden/>
                 <w:szCs w:val="26"/>
               </w:rPr>
-              <w:t>10</w:t>
+              <w:t>21</w:t>
             </w:r>
             <w:r>
               <w:rPr>
@@ -1766,7 +1766,7 @@
                 <w:webHidden/>
                 <w:szCs w:val="26"/>
               </w:rPr>
-              <w:t>10</w:t>
+              <w:t>13</w:t>
             </w:r>
             <w:r>
               <w:rPr>
@@ -1854,7 +1854,7 @@
                 <w:webHidden/>
                 <w:szCs w:val="26"/>
               </w:rPr>
-              <w:t>11</w:t>
+              <w:t>24</w:t>
             </w:r>
             <w:r>
               <w:rPr>
@@ -1943,7 +1943,7 @@
                 <w:webHidden/>
                 <w:szCs w:val="26"/>
               </w:rPr>
-              <w:t>11</w:t>
+              <w:t>24</w:t>
             </w:r>
             <w:r>
               <w:rPr>
@@ -2032,7 +2032,7 @@
                 <w:webHidden/>
                 <w:szCs w:val="26"/>
               </w:rPr>
-              <w:t>11</w:t>
+              <w:t>24</w:t>
             </w:r>
             <w:r>
               <w:rPr>
@@ -2121,7 +2121,7 @@
                 <w:webHidden/>
                 <w:szCs w:val="26"/>
               </w:rPr>
-              <w:t>11</w:t>
+              <w:t>24</w:t>
             </w:r>
             <w:r>
               <w:rPr>
@@ -2210,7 +2210,7 @@
                 <w:webHidden/>
                 <w:szCs w:val="26"/>
               </w:rPr>
-              <w:t>11</w:t>
+              <w:t>24</w:t>
             </w:r>
             <w:r>
               <w:rPr>
@@ -2299,7 +2299,7 @@
                 <w:webHidden/>
                 <w:szCs w:val="26"/>
               </w:rPr>
-              <w:t>11</w:t>
+              <w:t>24</w:t>
             </w:r>
             <w:r>
               <w:rPr>
@@ -2388,7 +2388,7 @@
                 <w:webHidden/>
                 <w:szCs w:val="26"/>
               </w:rPr>
-              <w:t>11</w:t>
+              <w:t>24</w:t>
             </w:r>
             <w:r>
               <w:rPr>
@@ -2477,7 +2477,7 @@
                 <w:webHidden/>
                 <w:szCs w:val="26"/>
               </w:rPr>
-              <w:t>11</w:t>
+              <w:t>24</w:t>
             </w:r>
             <w:r>
               <w:rPr>
@@ -2566,7 +2566,7 @@
                 <w:webHidden/>
                 <w:szCs w:val="26"/>
               </w:rPr>
-              <w:t>11</w:t>
+              <w:t>24</w:t>
             </w:r>
             <w:r>
               <w:rPr>
@@ -2655,7 +2655,7 @@
                 <w:webHidden/>
                 <w:szCs w:val="26"/>
               </w:rPr>
-              <w:t>11</w:t>
+              <w:t>24</w:t>
             </w:r>
             <w:r>
               <w:rPr>
@@ -2744,7 +2744,7 @@
                 <w:webHidden/>
                 <w:szCs w:val="26"/>
               </w:rPr>
-              <w:t>11</w:t>
+              <w:t>24</w:t>
             </w:r>
             <w:r>
               <w:rPr>
@@ -2833,7 +2833,7 @@
                 <w:webHidden/>
                 <w:szCs w:val="26"/>
               </w:rPr>
-              <w:t>11</w:t>
+              <w:t>24</w:t>
             </w:r>
             <w:r>
               <w:rPr>
@@ -2922,7 +2922,7 @@
                 <w:webHidden/>
                 <w:szCs w:val="26"/>
               </w:rPr>
-              <w:t>11</w:t>
+              <w:t>24</w:t>
             </w:r>
             <w:r>
               <w:rPr>
@@ -3011,7 +3011,7 @@
                 <w:webHidden/>
                 <w:szCs w:val="26"/>
               </w:rPr>
-              <w:t>11</w:t>
+              <w:t>24</w:t>
             </w:r>
             <w:r>
               <w:rPr>
@@ -3100,7 +3100,7 @@
                 <w:webHidden/>
                 <w:szCs w:val="26"/>
               </w:rPr>
-              <w:t>11</w:t>
+              <w:t>24</w:t>
             </w:r>
             <w:r>
               <w:rPr>
@@ -3189,7 +3189,7 @@
                 <w:webHidden/>
                 <w:szCs w:val="26"/>
               </w:rPr>
-              <w:t>11</w:t>
+              <w:t>24</w:t>
             </w:r>
             <w:r>
               <w:rPr>
@@ -3278,7 +3278,7 @@
                 <w:webHidden/>
                 <w:szCs w:val="26"/>
               </w:rPr>
-              <w:t>11</w:t>
+              <w:t>24</w:t>
             </w:r>
             <w:r>
               <w:rPr>
@@ -3367,7 +3367,7 @@
                 <w:webHidden/>
                 <w:szCs w:val="26"/>
               </w:rPr>
-              <w:t>11</w:t>
+              <w:t>24</w:t>
             </w:r>
             <w:r>
               <w:rPr>
@@ -3456,7 +3456,7 @@
                 <w:webHidden/>
                 <w:szCs w:val="26"/>
               </w:rPr>
-              <w:t>11</w:t>
+              <w:t>24</w:t>
             </w:r>
             <w:r>
               <w:rPr>
@@ -3545,7 +3545,7 @@
                 <w:webHidden/>
                 <w:szCs w:val="26"/>
               </w:rPr>
-              <w:t>11</w:t>
+              <w:t>24</w:t>
             </w:r>
             <w:r>
               <w:rPr>
@@ -3634,7 +3634,7 @@
                 <w:webHidden/>
                 <w:szCs w:val="26"/>
               </w:rPr>
-              <w:t>11</w:t>
+              <w:t>24</w:t>
             </w:r>
             <w:r>
               <w:rPr>
@@ -3722,7 +3722,7 @@
                 <w:webHidden/>
                 <w:szCs w:val="26"/>
               </w:rPr>
-              <w:t>12</w:t>
+              <w:t>25</w:t>
             </w:r>
             <w:r>
               <w:rPr>
@@ -3810,7 +3810,7 @@
                 <w:webHidden/>
                 <w:szCs w:val="26"/>
               </w:rPr>
-              <w:t>12</w:t>
+              <w:t>25</w:t>
             </w:r>
             <w:r>
               <w:rPr>
@@ -3898,7 +3898,7 @@
                 <w:webHidden/>
                 <w:szCs w:val="26"/>
               </w:rPr>
-              <w:t>12</w:t>
+              <w:t>25</w:t>
             </w:r>
             <w:r>
               <w:rPr>
@@ -3986,7 +3986,7 @@
                 <w:webHidden/>
                 <w:szCs w:val="26"/>
               </w:rPr>
-              <w:t>12</w:t>
+              <w:t>25</w:t>
             </w:r>
             <w:r>
               <w:rPr>
@@ -4074,7 +4074,7 @@
                 <w:webHidden/>
                 <w:szCs w:val="26"/>
               </w:rPr>
-              <w:t>12</w:t>
+              <w:t>25</w:t>
             </w:r>
             <w:r>
               <w:rPr>
@@ -4567,7 +4567,7 @@
         <w:pStyle w:val="onVnHH"/>
         <w:numPr>
           <w:ilvl w:val="0"/>
-          <w:numId w:val="21"/>
+          <w:numId w:val="30"/>
         </w:numPr>
       </w:pPr>
       <w:r>
@@ -4857,6 +4857,10 @@
     <w:p>
       <w:pPr>
         <w:pStyle w:val="u1"/>
+        <w:numPr>
+          <w:ilvl w:val="0"/>
+          <w:numId w:val="31"/>
+        </w:numPr>
       </w:pPr>
       <w:bookmarkStart w:id="0" w:name="_Toc242968869"/>
       <w:r>
@@ -4940,8 +4944,8 @@
           <w:lang w:val="de-DE"/>
         </w:rPr>
       </w:pPr>
-      <w:bookmarkStart w:id="2" w:name="_Toc242968877"/>
-      <w:bookmarkStart w:id="3" w:name="_Toc242968871"/>
+      <w:bookmarkStart w:id="2" w:name="_Toc242968871"/>
+      <w:bookmarkStart w:id="3" w:name="_Toc242968877"/>
       <w:r>
         <w:rPr>
           <w:lang w:val="de-DE"/>
@@ -4949,7 +4953,7 @@
         <w:lastRenderedPageBreak/>
         <w:t>Các công nghệ sử dụng trong hệ thống</w:t>
       </w:r>
-      <w:bookmarkEnd w:id="3"/>
+      <w:bookmarkEnd w:id="2"/>
     </w:p>
     <w:p>
       <w:pPr>
@@ -5203,59 +5207,14 @@
         <w:pStyle w:val="onVnHH"/>
       </w:pPr>
       <w:r>
-        <w:t>Một số nguyên tắc sử dụng:</w:t>
-      </w:r>
-    </w:p>
-    <w:p>
-      <w:pPr>
-        <w:pStyle w:val="onVnHH"/>
-        <w:numPr>
-          <w:ilvl w:val="0"/>
-          <w:numId w:val="24"/>
-        </w:numPr>
-      </w:pPr>
-      <w:r>
-        <w:t>Chỉ cập nhật những trường trạng thái có liên quan đến thao tác, giúp giao diện phản hồi đúng và dễ dự đoán.</w:t>
-      </w:r>
-    </w:p>
-    <w:p>
-      <w:pPr>
-        <w:pStyle w:val="onVnHH"/>
-        <w:numPr>
-          <w:ilvl w:val="0"/>
-          <w:numId w:val="24"/>
-        </w:numPr>
-      </w:pPr>
-      <w:r>
-        <w:t>Tách các hành động như play, pause, next và setVolume thành hàm có mục đích rõ ràng; kiểm thử các chuyển trạng thái quan trọng.</w:t>
-      </w:r>
-    </w:p>
-    <w:p>
-      <w:pPr>
-        <w:pStyle w:val="onVnHH"/>
-        <w:numPr>
-          <w:ilvl w:val="0"/>
-          <w:numId w:val="24"/>
-        </w:numPr>
-      </w:pPr>
-      <w:r>
-        <w:t>Không lưu dữ liệu nhạy cảm hoặc thay thế cơ chế xác thực của máy chủ bằng store phía trình duyệt.</w:t>
-      </w:r>
-    </w:p>
-    <w:p>
-      <w:pPr>
-        <w:pStyle w:val="onVnHH"/>
-        <w:jc w:val="center"/>
-      </w:pPr>
-      <w:r>
         <w:rPr>
           <w:noProof/>
         </w:rPr>
         <w:drawing>
-          <wp:inline distT="0" distB="0" distL="0" distR="0" wp14:anchorId="3EC0820C" wp14:editId="7A49D1F5">
-            <wp:extent cx="5120640" cy="1809231"/>
-            <wp:effectExtent l="0" t="0" r="0" b="0"/>
-            <wp:docPr id="101" name="Hình minh họa 2.1. Nhóm công nghệ Frontend và vai trò trong ứng dụng SPA" descr="Hình minh họa 2.1. Nhóm công nghệ Frontend và vai trò trong ứng dụng SPA"/>
+          <wp:inline distT="0" distB="0" distL="0" distR="0" wp14:anchorId="79491379" wp14:editId="0978F939">
+            <wp:extent cx="5760085" cy="2682240"/>
+            <wp:effectExtent l="0" t="0" r="0" b="3810"/>
+            <wp:docPr id="571371962" name="Hình ảnh 2"/>
             <wp:cNvGraphicFramePr>
               <a:graphicFrameLocks xmlns:a="http://schemas.openxmlformats.org/drawingml/2006/main" noChangeAspect="1"/>
             </wp:cNvGraphicFramePr>
@@ -5263,11 +5222,655 @@
               <a:graphicData uri="http://schemas.openxmlformats.org/drawingml/2006/picture">
                 <pic:pic xmlns:pic="http://schemas.openxmlformats.org/drawingml/2006/picture">
                   <pic:nvPicPr>
-                    <pic:cNvPr id="101" name="Hình minh họa 2.1. Nhóm công nghệ Frontend và vai trò trong ứng dụng SPA"/>
+                    <pic:cNvPr id="0" name="Picture 1"/>
+                    <pic:cNvPicPr>
+                      <a:picLocks noChangeAspect="1" noChangeArrowheads="1"/>
+                    </pic:cNvPicPr>
+                  </pic:nvPicPr>
+                  <pic:blipFill rotWithShape="1">
+                    <a:blip r:embed="rId11">
+                      <a:extLst>
+                        <a:ext uri="{28A0092B-C50C-407E-A947-70E740481C1C}">
+                          <a14:useLocalDpi xmlns:a14="http://schemas.microsoft.com/office/drawing/2010/main" val="0"/>
+                        </a:ext>
+                      </a:extLst>
+                    </a:blip>
+                    <a:srcRect t="11602" b="5051"/>
+                    <a:stretch>
+                      <a:fillRect/>
+                    </a:stretch>
+                  </pic:blipFill>
+                  <pic:spPr bwMode="auto">
+                    <a:xfrm>
+                      <a:off x="0" y="0"/>
+                      <a:ext cx="5760085" cy="2682240"/>
+                    </a:xfrm>
+                    <a:prstGeom prst="rect">
+                      <a:avLst/>
+                    </a:prstGeom>
+                    <a:noFill/>
+                    <a:ln>
+                      <a:noFill/>
+                    </a:ln>
+                    <a:extLst>
+                      <a:ext uri="{53640926-AAD7-44D8-BBD7-CCE9431645EC}">
+                        <a14:shadowObscured xmlns:a14="http://schemas.microsoft.com/office/drawing/2010/main"/>
+                      </a:ext>
+                    </a:extLst>
+                  </pic:spPr>
+                </pic:pic>
+              </a:graphicData>
+            </a:graphic>
+          </wp:inline>
+        </w:drawing>
+      </w:r>
+    </w:p>
+    <w:p>
+      <w:pPr>
+        <w:pStyle w:val="onVnHH"/>
+      </w:pPr>
+      <w:r>
+        <w:t>Khi triển khai trong chương trình</w:t>
+      </w:r>
+      <w:r>
+        <w:t>:</w:t>
+      </w:r>
+    </w:p>
+    <w:p>
+      <w:pPr>
+        <w:pStyle w:val="onVnHH"/>
+        <w:numPr>
+          <w:ilvl w:val="0"/>
+          <w:numId w:val="24"/>
+        </w:numPr>
+      </w:pPr>
+      <w:r>
+        <w:t>Chỉ cập nhật những trường trạng thái có liên quan đến thao tác, giúp giao diện phản hồi đúng và dễ dự đoán.</w:t>
+      </w:r>
+    </w:p>
+    <w:p>
+      <w:pPr>
+        <w:pStyle w:val="onVnHH"/>
+        <w:numPr>
+          <w:ilvl w:val="0"/>
+          <w:numId w:val="24"/>
+        </w:numPr>
+      </w:pPr>
+      <w:r>
+        <w:t>Tách các hành động như play, pause, next và setVolume thành hàm có mục đích rõ ràng; kiểm thử các chuyển trạng thái quan trọng.</w:t>
+      </w:r>
+    </w:p>
+    <w:p>
+      <w:pPr>
+        <w:pStyle w:val="onVnHH"/>
+        <w:numPr>
+          <w:ilvl w:val="0"/>
+          <w:numId w:val="24"/>
+        </w:numPr>
+      </w:pPr>
+      <w:r>
+        <w:t>Không lưu dữ liệu nhạy cảm hoặc thay thế cơ chế xác thực của máy chủ bằng store phía trình duyệt.</w:t>
+      </w:r>
+    </w:p>
+    <w:p>
+      <w:pPr>
+        <w:pStyle w:val="onVnHH"/>
+      </w:pPr>
+    </w:p>
+    <w:p>
+      <w:pPr>
+        <w:spacing w:before="120" w:after="120" w:line="360" w:lineRule="auto"/>
+        <w:rPr>
+          <w:rFonts w:ascii="Times New Roman" w:hAnsi="Times New Roman"/>
+          <w:i/>
+          <w:iCs/>
+          <w:u w:val="single"/>
+        </w:rPr>
+      </w:pPr>
+      <w:r>
+        <w:rPr>
+          <w:i/>
+          <w:iCs/>
+          <w:u w:val="single"/>
+        </w:rPr>
+        <w:br w:type="page"/>
+      </w:r>
+    </w:p>
+    <w:p>
+      <w:pPr>
+        <w:pStyle w:val="onVnHH"/>
+        <w:ind w:firstLine="567"/>
+      </w:pPr>
+      <w:r>
+        <w:rPr>
+          <w:i/>
+          <w:iCs/>
+          <w:u w:val="single"/>
+        </w:rPr>
+        <w:lastRenderedPageBreak/>
+        <w:t>Axios:</w:t>
+      </w:r>
+      <w:r>
+        <w:t xml:space="preserve"> Là thư viện hỗ trợ gửi các yêu cầu HTTP từ Frontend đến Backend thông qua RESTful API. Axios được sử dụng để thực hiện các thao tác như đăng nhập, tìm kiếm bài hát, quản lý playlist và gửi dữ liệu đăng tải bài hát.</w:t>
+      </w:r>
+    </w:p>
+    <w:p>
+      <w:pPr>
+        <w:pStyle w:val="onVnHH"/>
+        <w:ind w:firstLine="567"/>
+      </w:pPr>
+      <w:r>
+        <w:t>Quy trình giao tiếp thường gồm: giao diện phát sinh thao tác → Frontend gửi yêu cầu HTTP đến endpoint tương ứng → Backend kiểm tra dữ liệu và xử lý nghiệp vụ → Axios nhận phản hồi → giao diện cập nhật trạng thái và hiển thị kết quả. Các trạng thái đang tải, thành công và lỗi cần được xử lý riêng để người dùng biết kết quả thao tác.</w:t>
+      </w:r>
+      <w:r>
+        <w:rPr>
+          <w:noProof/>
+        </w:rPr>
+        <w:drawing>
+          <wp:inline distT="0" distB="0" distL="0" distR="0" wp14:anchorId="7D08AEC5" wp14:editId="16EC26A4">
+            <wp:extent cx="5753100" cy="1998134"/>
+            <wp:effectExtent l="0" t="0" r="0" b="0"/>
+            <wp:docPr id="1373753362" name="Hình ảnh 3"/>
+            <wp:cNvGraphicFramePr>
+              <a:graphicFrameLocks xmlns:a="http://schemas.openxmlformats.org/drawingml/2006/main" noChangeAspect="1"/>
+            </wp:cNvGraphicFramePr>
+            <a:graphic xmlns:a="http://schemas.openxmlformats.org/drawingml/2006/main">
+              <a:graphicData uri="http://schemas.openxmlformats.org/drawingml/2006/picture">
+                <pic:pic xmlns:pic="http://schemas.openxmlformats.org/drawingml/2006/picture">
+                  <pic:nvPicPr>
+                    <pic:cNvPr id="0" name="Picture 6"/>
+                    <pic:cNvPicPr>
+                      <a:picLocks noChangeAspect="1" noChangeArrowheads="1"/>
+                    </pic:cNvPicPr>
+                  </pic:nvPicPr>
+                  <pic:blipFill rotWithShape="1">
+                    <a:blip r:embed="rId12">
+                      <a:extLst>
+                        <a:ext uri="{28A0092B-C50C-407E-A947-70E740481C1C}">
+                          <a14:useLocalDpi xmlns:a14="http://schemas.microsoft.com/office/drawing/2010/main" val="0"/>
+                        </a:ext>
+                      </a:extLst>
+                    </a:blip>
+                    <a:srcRect b="8950"/>
+                    <a:stretch>
+                      <a:fillRect/>
+                    </a:stretch>
+                  </pic:blipFill>
+                  <pic:spPr bwMode="auto">
+                    <a:xfrm>
+                      <a:off x="0" y="0"/>
+                      <a:ext cx="5753100" cy="1998134"/>
+                    </a:xfrm>
+                    <a:prstGeom prst="rect">
+                      <a:avLst/>
+                    </a:prstGeom>
+                    <a:noFill/>
+                    <a:ln>
+                      <a:noFill/>
+                    </a:ln>
+                    <a:extLst>
+                      <a:ext uri="{53640926-AAD7-44D8-BBD7-CCE9431645EC}">
+                        <a14:shadowObscured xmlns:a14="http://schemas.microsoft.com/office/drawing/2010/main"/>
+                      </a:ext>
+                    </a:extLst>
+                  </pic:spPr>
+                </pic:pic>
+              </a:graphicData>
+            </a:graphic>
+          </wp:inline>
+        </w:drawing>
+      </w:r>
+    </w:p>
+    <w:p>
+      <w:pPr>
+        <w:pStyle w:val="onVnHH"/>
+      </w:pPr>
+      <w:r>
+        <w:t>Khi triển khai trong chương trình</w:t>
+      </w:r>
+      <w:r>
+        <w:t>:</w:t>
+      </w:r>
+    </w:p>
+    <w:p>
+      <w:pPr>
+        <w:pStyle w:val="onVnHH"/>
+        <w:numPr>
+          <w:ilvl w:val="0"/>
+          <w:numId w:val="26"/>
+        </w:numPr>
+      </w:pPr>
+      <w:r>
+        <w:t>Dùng phương thức HTTP phù hợp với mục đích và truyền tham số/dữ liệu theo hợp đồng API đã thống nhất.</w:t>
+      </w:r>
+    </w:p>
+    <w:p>
+      <w:pPr>
+        <w:pStyle w:val="onVnHH"/>
+        <w:numPr>
+          <w:ilvl w:val="0"/>
+          <w:numId w:val="26"/>
+        </w:numPr>
+      </w:pPr>
+      <w:r>
+        <w:t>Chuẩn hóa xử lý lỗi mạng, lỗi xác thực và lỗi nghiệp vụ; tránh hiển thị nguyên văn thông tin kỹ thuật nhạy cảm.</w:t>
+      </w:r>
+    </w:p>
+    <w:p>
+      <w:pPr>
+        <w:pStyle w:val="onVnHH"/>
+        <w:numPr>
+          <w:ilvl w:val="0"/>
+          <w:numId w:val="26"/>
+        </w:numPr>
+      </w:pPr>
+      <w:r>
+        <w:t>Khi gửi token, chỉ sử dụng kênh HTTPS trong môi trường triển khai và cân nhắc cách lưu trữ token an toàn; không ghi token vào log.</w:t>
+      </w:r>
+    </w:p>
+    <w:p>
+      <w:pPr>
+        <w:spacing w:before="120" w:after="120" w:line="360" w:lineRule="auto"/>
+        <w:rPr>
+          <w:rFonts w:ascii="Times New Roman" w:hAnsi="Times New Roman"/>
+        </w:rPr>
+      </w:pPr>
+      <w:r>
+        <w:br w:type="page"/>
+      </w:r>
+    </w:p>
+    <w:p>
+      <w:pPr>
+        <w:pStyle w:val="onVnHH"/>
+        <w:ind w:firstLine="567"/>
+      </w:pPr>
+      <w:r>
+        <w:lastRenderedPageBreak/>
+        <w:t>Tailwind CSS và shadcn/ui: Tailwind CSS là hệ thống utility-first, cho phép mô tả trực tiếp bố cục, khoảng cách, màu sắc, kiểu chữ và trạng thái tương tác thông qua các lớp tiện ích. shadcn/ui cung cấp mã nguồn các thành phần giao diện có thể đưa vào dự án và tùy chỉnh; đây không phải bộ giao diện đóng chỉ dùng nguyên trạng. Kết hợp hai công cụ giúp duy trì phong cách nhất quán, đồng thời cho phép điều chỉnh chi tiết theo nhu cầu ứng dụng.</w:t>
+      </w:r>
+    </w:p>
+    <w:p>
+      <w:pPr>
+        <w:pStyle w:val="onVnHH"/>
+        <w:ind w:firstLine="567"/>
+        <w:rPr>
+          <w:sz w:val="24"/>
+        </w:rPr>
+      </w:pPr>
+      <w:r>
+        <w:t>Trong website nghe nhạc, Tailwind CSS có thể được dùng để xây dựng bố cục co giãn theo kích thước màn hình, trạng thái hover/focus và giao diện tối. shadcn/ui hỗ trợ các thành phần tương tác thường gặp như nút, hộp thoại, menu, tab hoặc thông báo; các thành phần cần được chọn và điều chỉnh phù hợp với thiết kế, không nên sử dụng dàn trải.</w:t>
+      </w:r>
+    </w:p>
+    <w:p>
+      <w:pPr>
+        <w:pStyle w:val="onVnHH"/>
+        <w:rPr>
+          <w:sz w:val="24"/>
+        </w:rPr>
+      </w:pPr>
+      <w:r>
+        <w:t>Khi sử dụng:</w:t>
+      </w:r>
+    </w:p>
+    <w:p>
+      <w:pPr>
+        <w:pStyle w:val="onVnHH"/>
+        <w:numPr>
+          <w:ilvl w:val="0"/>
+          <w:numId w:val="27"/>
+        </w:numPr>
+        <w:rPr>
+          <w:sz w:val="24"/>
+        </w:rPr>
+      </w:pPr>
+      <w:r>
+        <w:t>Tạo quy ước dùng chung cho màu sắc, khoảng cách, kiểu chữ và trạng thái để các trang không bị lệch phong cách.</w:t>
+      </w:r>
+    </w:p>
+    <w:p>
+      <w:pPr>
+        <w:pStyle w:val="onVnHH"/>
+        <w:numPr>
+          <w:ilvl w:val="0"/>
+          <w:numId w:val="27"/>
+        </w:numPr>
+        <w:rPr>
+          <w:sz w:val="24"/>
+        </w:rPr>
+      </w:pPr>
+      <w:r>
+        <w:t>Kiểm tra khả năng sử dụng bằng bàn phím, độ tương phản, nhãn điều khiển và hiển thị trên màn hình nhỏ.</w:t>
+      </w:r>
+    </w:p>
+    <w:p>
+      <w:pPr>
+        <w:pStyle w:val="onVnHH"/>
+        <w:numPr>
+          <w:ilvl w:val="0"/>
+          <w:numId w:val="27"/>
+        </w:numPr>
+        <w:rPr>
+          <w:sz w:val="24"/>
+        </w:rPr>
+      </w:pPr>
+      <w:r>
+        <w:t>Tùy biến thành phần theo thiết kế của đề tài, đồng thời kiểm soát số lượng lớp tiện ích để mã giao diện vẫn dễ đọc.</w:t>
+      </w:r>
+    </w:p>
+    <w:p>
+      <w:pPr>
+        <w:spacing w:before="120" w:after="120" w:line="360" w:lineRule="auto"/>
+        <w:rPr>
+          <w:rFonts w:ascii="Times New Roman" w:eastAsiaTheme="majorEastAsia" w:hAnsi="Times New Roman" w:cstheme="majorBidi"/>
+          <w:i/>
+          <w:color w:val="000000" w:themeColor="text1"/>
+          <w:lang w:val="de-DE"/>
+        </w:rPr>
+      </w:pPr>
+      <w:r>
+        <w:rPr>
+          <w:lang w:val="de-DE"/>
+        </w:rPr>
+        <w:br w:type="page"/>
+      </w:r>
+    </w:p>
+    <w:p>
+      <w:pPr>
+        <w:pStyle w:val="u3"/>
+        <w:rPr>
+          <w:lang w:val="de-DE"/>
+        </w:rPr>
+      </w:pPr>
+      <w:r>
+        <w:rPr>
+          <w:lang w:val="de-DE"/>
+        </w:rPr>
+        <w:lastRenderedPageBreak/>
+        <w:t>Backend</w:t>
+      </w:r>
+      <w:bookmarkEnd w:id="5"/>
+    </w:p>
+    <w:p>
+      <w:pPr>
+        <w:pStyle w:val="onVnHH"/>
+        <w:ind w:firstLine="567"/>
+      </w:pPr>
+      <w:bookmarkStart w:id="6" w:name="_Toc242968874"/>
+      <w:r>
+        <w:rPr>
+          <w:bCs/>
+          <w:i/>
+          <w:iCs/>
+          <w:u w:val="single"/>
+        </w:rPr>
+        <w:t>Spring Boot:</w:t>
+      </w:r>
+      <w:r>
+        <w:t xml:space="preserve"> Nền tảng phát triển ứng dụng Java, hỗ trợ cấu hình tự động và xây dựng ứng dụng web/API theo mô hình Spring. Trong đề tài, Spring Boot tổ chức các endpoint REST, tiếp nhận yêu cầu từ Frontend, gọi các lớp nghiệp vụ và phối hợp với tầng truy cập dữ liệu.</w:t>
+      </w:r>
+    </w:p>
+    <w:p>
+      <w:pPr>
+        <w:pStyle w:val="onVnHH"/>
+        <w:ind w:firstLine="510"/>
+      </w:pPr>
+      <w:r>
+        <w:t>Spring Boot được lựa chọn thay vì PHP, C# hoặc Python nhờ khả năng tổ chức mã nguồn theo kiến trúc phân lớp, hỗ trợ xây dựng REST API và tích hợp hiệu quả với các công nghệ như Spring Security, Spring Data JPA và MySQL. Java có hệ sinh thái thư viện phong phú, cơ chế kiểm soát kiểu dữ liệu chặt chẽ và khả năng bảo trì mã nguồn tốt, phù hợp với ứng dụng có nhiều chức năng quản lý và xử lý nghiệp vụ. Bên cạnh đó, Spring Boot giúp giảm khối lượng cấu hình ban đầu, thuận tiện cho việc mở rộng và kiểm thử hệ thống. Việc lựa chọn công nghệ này cũng phù hợp với định hướng học tập và vận dụng kiến thức lập trình Java vào phát triển ứng dụng web theo mô hình Client–Server.</w:t>
+      </w:r>
+    </w:p>
+    <w:p>
+      <w:pPr>
+        <w:pStyle w:val="onVnHH"/>
+      </w:pPr>
+      <w:r>
+        <w:rPr>
+          <w:noProof/>
+        </w:rPr>
+        <w:drawing>
+          <wp:inline distT="0" distB="0" distL="0" distR="0" wp14:anchorId="3614EB9C" wp14:editId="5576D66E">
+            <wp:extent cx="5714170" cy="2556510"/>
+            <wp:effectExtent l="0" t="0" r="1270" b="0"/>
+            <wp:docPr id="55288986" name="Hình ảnh 3"/>
+            <wp:cNvGraphicFramePr>
+              <a:graphicFrameLocks xmlns:a="http://schemas.openxmlformats.org/drawingml/2006/main" noChangeAspect="1"/>
+            </wp:cNvGraphicFramePr>
+            <a:graphic xmlns:a="http://schemas.openxmlformats.org/drawingml/2006/main">
+              <a:graphicData uri="http://schemas.openxmlformats.org/drawingml/2006/picture">
+                <pic:pic xmlns:pic="http://schemas.openxmlformats.org/drawingml/2006/picture">
+                  <pic:nvPicPr>
+                    <pic:cNvPr id="0" name="Picture 3"/>
+                    <pic:cNvPicPr>
+                      <a:picLocks noChangeAspect="1" noChangeArrowheads="1"/>
+                    </pic:cNvPicPr>
+                  </pic:nvPicPr>
+                  <pic:blipFill rotWithShape="1">
+                    <a:blip r:embed="rId13" cstate="print">
+                      <a:extLst>
+                        <a:ext uri="{28A0092B-C50C-407E-A947-70E740481C1C}">
+                          <a14:useLocalDpi xmlns:a14="http://schemas.microsoft.com/office/drawing/2010/main" val="0"/>
+                        </a:ext>
+                      </a:extLst>
+                    </a:blip>
+                    <a:srcRect t="8334" b="31746"/>
+                    <a:stretch>
+                      <a:fillRect/>
+                    </a:stretch>
+                  </pic:blipFill>
+                  <pic:spPr bwMode="auto">
+                    <a:xfrm>
+                      <a:off x="0" y="0"/>
+                      <a:ext cx="5715000" cy="2556881"/>
+                    </a:xfrm>
+                    <a:prstGeom prst="rect">
+                      <a:avLst/>
+                    </a:prstGeom>
+                    <a:noFill/>
+                    <a:ln>
+                      <a:noFill/>
+                    </a:ln>
+                    <a:extLst>
+                      <a:ext uri="{53640926-AAD7-44D8-BBD7-CCE9431645EC}">
+                        <a14:shadowObscured xmlns:a14="http://schemas.microsoft.com/office/drawing/2010/main"/>
+                      </a:ext>
+                    </a:extLst>
+                  </pic:spPr>
+                </pic:pic>
+              </a:graphicData>
+            </a:graphic>
+          </wp:inline>
+        </w:drawing>
+      </w:r>
+    </w:p>
+    <w:p>
+      <w:pPr>
+        <w:pStyle w:val="onVnHH"/>
+        <w:ind w:firstLine="567"/>
+        <w:rPr>
+          <w:i/>
+          <w:iCs/>
+          <w:u w:val="single"/>
+          <w:lang w:val="de-DE"/>
+        </w:rPr>
+      </w:pPr>
+      <w:r>
+        <w:t>Trong ứng dụng này, Spring Boot đóng vai trò nền tảng chạy Backend và tổ chức các thành phần xử lý yêu cầu. Endpoint REST tiếp nhận dữ liệu từ trình duyệt, lớp điều khiển ánh xạ đường dẫn và phương thức HTTP, lớp dịch vụ thực hiện quy tắc nghiệp vụ, còn tầng truy cập dữ liệu phối hợp với cơ sở dữ liệu. Phân chia trách nhiệm giúp mã nguồn rõ ràng hơn và thuận tiện kiểm thử từng phần.</w:t>
+      </w:r>
+    </w:p>
+    <w:p>
+      <w:pPr>
+        <w:pStyle w:val="onVnHH"/>
+        <w:ind w:firstLine="567"/>
+        <w:rPr>
+          <w:i/>
+          <w:iCs/>
+          <w:u w:val="single"/>
+          <w:lang w:val="de-DE"/>
+        </w:rPr>
+      </w:pPr>
+      <w:r>
+        <w:t>Phản hồi API nên có cấu trúc nhất quán, mã trạng thái HTTP phù hợp và chỉ trả về các trường dữ liệu cần thiết. Dữ liệu đầu vào cần được kiểm tra trước khi xử lý; các lỗi dự kiến nên được chuyển thành phản hồi dễ hiểu thay vì để lộ dấu vết lỗi nội bộ</w:t>
+      </w:r>
+    </w:p>
+    <w:p>
+      <w:pPr>
+        <w:pStyle w:val="onVnHH"/>
+        <w:ind w:firstLine="567"/>
+        <w:rPr>
+          <w:i/>
+          <w:iCs/>
+          <w:u w:val="single"/>
+        </w:rPr>
+      </w:pPr>
+      <w:r>
+        <w:rPr>
+          <w:i/>
+          <w:iCs/>
+          <w:u w:val="single"/>
+        </w:rPr>
+        <w:lastRenderedPageBreak/>
+        <w:t>Spring Security và JWT:</w:t>
+      </w:r>
+      <w:r>
+        <w:t xml:space="preserve"> Spring Security là khung bảo mật tích hợp với ứng dụng Spring, hỗ trợ thiết lập chuỗi bộ lọc để xác thực yêu cầu và áp dụng quy tắc phân quyền. JSON Web Token là định dạng token mang các thông tin định danh/claims đã được ký; trong mô hình stateless, máy chủ xác minh chữ ký và thời hạn của token ở các yêu cầu được bảo vệ. Token không được xem là dữ liệu bí mật đã mã hóa: không đưa mật khẩu hay thông tin nhạy cảm vào payload. Kết nối cần sử dụng HTTPS và chính sách lưu trữ token phải được cân nhắc theo mức độ rủi ro.</w:t>
+      </w:r>
+    </w:p>
+    <w:p>
+      <w:pPr>
+        <w:pStyle w:val="onVnHH"/>
+        <w:ind w:firstLine="567"/>
+        <w:rPr>
+          <w:i/>
+          <w:iCs/>
+          <w:u w:val="single"/>
+          <w:lang w:val="de-DE"/>
+        </w:rPr>
+      </w:pPr>
+      <w:r>
+        <w:t>Sau khi xác thực thành công, hệ thống xác định danh tính người dùng và quyền/vai trò được phép thực hiện. Các thao tác như chỉnh sửa hồ sơ cá nhân, đăng bài hát hoặc xử lý nội dung quản trị cần được bảo vệ ở phía máy chủ; ẩn nút trên giao diện không thay thế cho kiểm tra quyền tại Backend.</w:t>
+      </w:r>
+    </w:p>
+    <w:p>
+      <w:pPr>
+        <w:pStyle w:val="onVnHH"/>
+        <w:numPr>
+          <w:ilvl w:val="0"/>
+          <w:numId w:val="28"/>
+        </w:numPr>
+        <w:rPr>
+          <w:i/>
+          <w:iCs/>
+          <w:u w:val="single"/>
+          <w:lang w:val="de-DE"/>
+        </w:rPr>
+      </w:pPr>
+      <w:r>
+        <w:t>Kiểm tra token ở mọi endpoint yêu cầu đăng nhập, bao gồm chữ ký, thời hạn và các điều kiện xác thực cần thiết.</w:t>
+      </w:r>
+    </w:p>
+    <w:p>
+      <w:pPr>
+        <w:pStyle w:val="onVnHH"/>
+        <w:numPr>
+          <w:ilvl w:val="0"/>
+          <w:numId w:val="28"/>
+        </w:numPr>
+        <w:rPr>
+          <w:i/>
+          <w:iCs/>
+          <w:u w:val="single"/>
+          <w:lang w:val="de-DE"/>
+        </w:rPr>
+      </w:pPr>
+      <w:r>
+        <w:t>Phân biệt xác thực (người dùng là ai) với phân quyền (người dùng được làm gì), áp dụng quyền tối thiểu cần thiết.</w:t>
+      </w:r>
+    </w:p>
+    <w:p>
+      <w:pPr>
+        <w:pStyle w:val="onVnHH"/>
+        <w:numPr>
+          <w:ilvl w:val="0"/>
+          <w:numId w:val="28"/>
+        </w:numPr>
+        <w:rPr>
+          <w:i/>
+          <w:iCs/>
+          <w:u w:val="single"/>
+          <w:lang w:val="de-DE"/>
+        </w:rPr>
+      </w:pPr>
+      <w:r>
+        <w:t>Không ghi token/mật khẩu vào nhật ký; xử lý trường hợp hết hạn, đăng xuất và thu hồi phiên theo chính sách triển khai.</w:t>
+      </w:r>
+    </w:p>
+    <w:p>
+      <w:pPr>
+        <w:pStyle w:val="onVnHH"/>
+        <w:ind w:firstLine="567"/>
+      </w:pPr>
+      <w:r>
+        <w:rPr>
+          <w:bCs/>
+          <w:i/>
+          <w:iCs/>
+          <w:u w:val="single"/>
+        </w:rPr>
+        <w:t>Spring Data JPA (Hibernate):</w:t>
+      </w:r>
+      <w:r>
+        <w:t xml:space="preserve"> Spring Data JPA hỗ trợ thao tác dữ liệu theo chuẩn JPA thông qua repository, giảm mã truy vấn lặp lại; Hibernate là bộ triển khai ORM ánh xạ đối tượng Java với bảng quan hệ. Công nghệ này được sử dụng để lưu và truy xuất các thực thể như tài khoản, bài hát, album và playlist. Các ràng buộc, giao dịch và truy vấn cần được thiết kế phù hợp với yêu cầu hệ thống.</w:t>
+      </w:r>
+    </w:p>
+    <w:p>
+      <w:pPr>
+        <w:pStyle w:val="onVnHH"/>
+        <w:ind w:firstLine="567"/>
+      </w:pPr>
+      <w:r>
+        <w:t>Thông qua repository, tầng dịch vụ có thể gọi các thao tác truy vấn/lưu dữ liệu thay vì phụ thuộc trực tiếp vào chi tiết kết nối SQL ở mọi nơi. JPA mô tả cách ánh xạ đối tượng và quan hệ; Hibernate là một hiện thực phổ biến của đặc tả này. Những nghiệp vụ gồm nhiều thao tác dữ liệu liên quan cần được đặt trong phạm vi giao dịch phù hợp để bảo đảm tính nhất quán.</w:t>
+      </w:r>
+    </w:p>
+    <w:p>
+      <w:pPr>
+        <w:pStyle w:val="onVnHH"/>
+        <w:ind w:firstLine="567"/>
+      </w:pPr>
+      <w:r>
+        <w:t>ORM giúp tăng tính thuận tiện nhưng không loại bỏ nhu cầu hiểu cấu trúc quan hệ và hiệu năng truy vấn. Cần xác định rõ quan hệ giữa thực thể, tránh tải dữ liệu không cần thiết, kiểm tra truy vấn phát sinh và sử dụng phân trang với danh sách dài. Với các truy vấn tìm kiếm hoặc báo cáo đặc thù, có thể cân nhắc truy vấn tường minh sau khi đo đạc và kiểm thử.</w:t>
+      </w:r>
+    </w:p>
+    <w:p>
+      <w:pPr>
+        <w:pStyle w:val="onVnHH"/>
+        <w:jc w:val="center"/>
+        <w:rPr>
+          <w:i/>
+          <w:iCs/>
+          <w:u w:val="single"/>
+        </w:rPr>
+      </w:pPr>
+      <w:r>
+        <w:rPr>
+          <w:noProof/>
+        </w:rPr>
+        <w:lastRenderedPageBreak/>
+        <w:drawing>
+          <wp:inline distT="0" distB="0" distL="0" distR="0" wp14:anchorId="2C2BEE26" wp14:editId="2C5BE519">
+            <wp:extent cx="5394961" cy="1906154"/>
+            <wp:effectExtent l="0" t="0" r="0" b="0"/>
+            <wp:docPr id="102" name="Hình minh họa 2.2. Luồng xử lý và các thành phần Backend" descr="Hình minh họa 2.2. Luồng xử lý và các thành phần Backend"/>
+            <wp:cNvGraphicFramePr>
+              <a:graphicFrameLocks xmlns:a="http://schemas.openxmlformats.org/drawingml/2006/main" noChangeAspect="1"/>
+            </wp:cNvGraphicFramePr>
+            <a:graphic xmlns:a="http://schemas.openxmlformats.org/drawingml/2006/main">
+              <a:graphicData uri="http://schemas.openxmlformats.org/drawingml/2006/picture">
+                <pic:pic xmlns:pic="http://schemas.openxmlformats.org/drawingml/2006/picture">
+                  <pic:nvPicPr>
+                    <pic:cNvPr id="102" name="Hình minh họa 2.2. Luồng xử lý và các thành phần Backend"/>
                     <pic:cNvPicPr/>
                   </pic:nvPicPr>
                   <pic:blipFill>
-                    <a:blip r:embed="rId11"/>
+                    <a:blip r:embed="rId14"/>
                     <a:stretch>
                       <a:fillRect/>
                     </a:stretch>
@@ -5290,489 +5893,6 @@
     </w:p>
     <w:p>
       <w:pPr>
-        <w:spacing w:before="120" w:after="120" w:line="360" w:lineRule="auto"/>
-        <w:rPr>
-          <w:rFonts w:ascii="Times New Roman" w:hAnsi="Times New Roman"/>
-          <w:i/>
-          <w:iCs/>
-          <w:u w:val="single"/>
-        </w:rPr>
-      </w:pPr>
-      <w:r>
-        <w:rPr>
-          <w:i/>
-          <w:iCs/>
-          <w:u w:val="single"/>
-        </w:rPr>
-        <w:br w:type="page"/>
-      </w:r>
-    </w:p>
-    <w:p>
-      <w:pPr>
-        <w:pStyle w:val="onVnHH"/>
-        <w:ind w:firstLine="567"/>
-      </w:pPr>
-      <w:r>
-        <w:rPr>
-          <w:i/>
-          <w:iCs/>
-          <w:u w:val="single"/>
-        </w:rPr>
-        <w:lastRenderedPageBreak/>
-        <w:t>Axios:</w:t>
-      </w:r>
-      <w:r>
-        <w:t xml:space="preserve"> Là thư viện hỗ trợ gửi các yêu cầu HTTP từ Frontend đến Backend thông qua RESTful API. Axios được sử dụng để thực hiện các thao tác như đăng nhập, tìm kiếm bài hát, quản lý playlist và gửi dữ liệu đăng tải bài hát.</w:t>
-      </w:r>
-    </w:p>
-    <w:p>
-      <w:pPr>
-        <w:pStyle w:val="onVnHH"/>
-        <w:ind w:firstLine="567"/>
-      </w:pPr>
-      <w:r>
-        <w:t>Quy trình giao tiếp thường gồm: giao diện phát sinh thao tác → Frontend gửi yêu cầu HTTP đến endpoint tương ứng → Backend kiểm tra dữ liệu và xử lý nghiệp vụ → Axios nhận phản hồi → giao diện cập nhật trạng thái và hiển thị kết quả. Các trạng thái đang tải, thành công và lỗi cần được xử lý riêng để người dùng biết kết quả thao tác.</w:t>
-      </w:r>
-      <w:r>
-        <w:rPr>
-          <w:noProof/>
-        </w:rPr>
-        <w:drawing>
-          <wp:inline distT="0" distB="0" distL="0" distR="0" wp14:anchorId="7D08AEC5" wp14:editId="5125A4B1">
-            <wp:extent cx="5753100" cy="2194560"/>
-            <wp:effectExtent l="0" t="0" r="0" b="0"/>
-            <wp:docPr id="1373753362" name="Hình ảnh 3"/>
-            <wp:cNvGraphicFramePr>
-              <a:graphicFrameLocks xmlns:a="http://schemas.openxmlformats.org/drawingml/2006/main" noChangeAspect="1"/>
-            </wp:cNvGraphicFramePr>
-            <a:graphic xmlns:a="http://schemas.openxmlformats.org/drawingml/2006/main">
-              <a:graphicData uri="http://schemas.openxmlformats.org/drawingml/2006/picture">
-                <pic:pic xmlns:pic="http://schemas.openxmlformats.org/drawingml/2006/picture">
-                  <pic:nvPicPr>
-                    <pic:cNvPr id="0" name="Picture 6"/>
-                    <pic:cNvPicPr>
-                      <a:picLocks noChangeAspect="1" noChangeArrowheads="1"/>
-                    </pic:cNvPicPr>
-                  </pic:nvPicPr>
-                  <pic:blipFill>
-                    <a:blip r:embed="rId12">
-                      <a:extLst>
-                        <a:ext uri="{28A0092B-C50C-407E-A947-70E740481C1C}">
-                          <a14:useLocalDpi xmlns:a14="http://schemas.microsoft.com/office/drawing/2010/main" val="0"/>
-                        </a:ext>
-                      </a:extLst>
-                    </a:blip>
-                    <a:srcRect/>
-                    <a:stretch>
-                      <a:fillRect/>
-                    </a:stretch>
-                  </pic:blipFill>
-                  <pic:spPr bwMode="auto">
-                    <a:xfrm>
-                      <a:off x="0" y="0"/>
-                      <a:ext cx="5753100" cy="2194560"/>
-                    </a:xfrm>
-                    <a:prstGeom prst="rect">
-                      <a:avLst/>
-                    </a:prstGeom>
-                    <a:noFill/>
-                    <a:ln>
-                      <a:noFill/>
-                    </a:ln>
-                  </pic:spPr>
-                </pic:pic>
-              </a:graphicData>
-            </a:graphic>
-          </wp:inline>
-        </w:drawing>
-      </w:r>
-    </w:p>
-    <w:p>
-      <w:pPr>
-        <w:pStyle w:val="onVnHH"/>
-      </w:pPr>
-      <w:r>
-        <w:t>Khi triển khai:</w:t>
-      </w:r>
-    </w:p>
-    <w:p>
-      <w:pPr>
-        <w:pStyle w:val="onVnHH"/>
-        <w:numPr>
-          <w:ilvl w:val="0"/>
-          <w:numId w:val="26"/>
-        </w:numPr>
-      </w:pPr>
-      <w:r>
-        <w:t>Dùng phương thức HTTP phù hợp với mục đích và truyền tham số/dữ liệu theo hợp đồng API đã thống nhất.</w:t>
-      </w:r>
-    </w:p>
-    <w:p>
-      <w:pPr>
-        <w:pStyle w:val="onVnHH"/>
-        <w:numPr>
-          <w:ilvl w:val="0"/>
-          <w:numId w:val="26"/>
-        </w:numPr>
-      </w:pPr>
-      <w:r>
-        <w:t>Chuẩn hóa xử lý lỗi mạng, lỗi xác thực và lỗi nghiệp vụ; tránh hiển thị nguyên văn thông tin kỹ thuật nhạy cảm.</w:t>
-      </w:r>
-    </w:p>
-    <w:p>
-      <w:pPr>
-        <w:pStyle w:val="onVnHH"/>
-        <w:numPr>
-          <w:ilvl w:val="0"/>
-          <w:numId w:val="26"/>
-        </w:numPr>
-      </w:pPr>
-      <w:r>
-        <w:t>Khi gửi token, chỉ sử dụng kênh HTTPS trong môi trường triển khai và cân nhắc cách lưu trữ token an toàn; không ghi token vào log.</w:t>
-      </w:r>
-    </w:p>
-    <w:p>
-      <w:pPr>
-        <w:pStyle w:val="onVnHH"/>
-        <w:ind w:firstLine="567"/>
-      </w:pPr>
-      <w:r>
-        <w:t>Tailwind CSS và shadcn/ui: Tailwind CSS là hệ thống utility-first, cho phép mô tả trực tiếp bố cục, khoảng cách, màu sắc, kiểu chữ và trạng thái tương tác thông qua các lớp tiện ích. shadcn/ui cung cấp mã nguồn các thành phần giao diện có thể đưa vào dự án và tùy chỉnh; đây không phải bộ giao diện đóng chỉ dùng nguyên trạng. Kết hợp hai công cụ giúp duy trì phong cách nhất quán, đồng thời cho phép điều chỉnh chi tiết theo nhu cầu ứng dụng.</w:t>
-      </w:r>
-    </w:p>
-    <w:p>
-      <w:pPr>
-        <w:spacing w:before="120" w:after="120" w:line="360" w:lineRule="auto"/>
-        <w:rPr>
-          <w:rFonts w:ascii="Times New Roman" w:hAnsi="Times New Roman"/>
-        </w:rPr>
-      </w:pPr>
-      <w:r>
-        <w:br w:type="page"/>
-      </w:r>
-    </w:p>
-    <w:p>
-      <w:pPr>
-        <w:pStyle w:val="onVnHH"/>
-        <w:ind w:firstLine="567"/>
-        <w:rPr>
-          <w:sz w:val="24"/>
-        </w:rPr>
-      </w:pPr>
-      <w:r>
-        <w:lastRenderedPageBreak/>
-        <w:t>Trong website nghe nhạc, Tailwind CSS có thể được dùng để xây dựng bố cục co giãn theo kích thước màn hình, trạng thái hover/focus và giao diện tối. shadcn/ui hỗ trợ các thành phần tương tác thường gặp như nút, hộp thoại, menu, tab hoặc thông báo; các thành phần cần được chọn và điều chỉnh phù hợp với thiết kế, không nên sử dụng dàn trải.</w:t>
-      </w:r>
-    </w:p>
-    <w:p>
-      <w:pPr>
-        <w:pStyle w:val="onVnHH"/>
-        <w:rPr>
-          <w:sz w:val="24"/>
-        </w:rPr>
-      </w:pPr>
-      <w:r>
-        <w:t>Khi sử dụng:</w:t>
-      </w:r>
-    </w:p>
-    <w:p>
-      <w:pPr>
-        <w:pStyle w:val="onVnHH"/>
-        <w:numPr>
-          <w:ilvl w:val="0"/>
-          <w:numId w:val="27"/>
-        </w:numPr>
-        <w:rPr>
-          <w:sz w:val="24"/>
-        </w:rPr>
-      </w:pPr>
-      <w:r>
-        <w:t>Tạo quy ước dùng chung cho màu sắc, khoảng cách, kiểu chữ và trạng thái để các trang không bị lệch phong cách.</w:t>
-      </w:r>
-    </w:p>
-    <w:p>
-      <w:pPr>
-        <w:pStyle w:val="onVnHH"/>
-        <w:numPr>
-          <w:ilvl w:val="0"/>
-          <w:numId w:val="27"/>
-        </w:numPr>
-        <w:rPr>
-          <w:sz w:val="24"/>
-        </w:rPr>
-      </w:pPr>
-      <w:r>
-        <w:t>Kiểm tra khả năng sử dụng bằng bàn phím, độ tương phản, nhãn điều khiển và hiển thị trên màn hình nhỏ.</w:t>
-      </w:r>
-    </w:p>
-    <w:p>
-      <w:pPr>
-        <w:pStyle w:val="onVnHH"/>
-        <w:numPr>
-          <w:ilvl w:val="0"/>
-          <w:numId w:val="27"/>
-        </w:numPr>
-        <w:rPr>
-          <w:sz w:val="24"/>
-        </w:rPr>
-      </w:pPr>
-      <w:r>
-        <w:t>Tùy biến thành phần theo thiết kế của đề tài, đồng thời kiểm soát số lượng lớp tiện ích để mã giao diện vẫn dễ đọc.</w:t>
-      </w:r>
-    </w:p>
-    <w:p>
-      <w:pPr>
-        <w:pStyle w:val="u3"/>
-        <w:rPr>
-          <w:lang w:val="de-DE"/>
-        </w:rPr>
-      </w:pPr>
-      <w:r>
-        <w:rPr>
-          <w:lang w:val="de-DE"/>
-        </w:rPr>
-        <w:t>Backend</w:t>
-      </w:r>
-      <w:bookmarkEnd w:id="5"/>
-    </w:p>
-    <w:p>
-      <w:pPr>
-        <w:pStyle w:val="onVnHH"/>
-        <w:ind w:firstLine="567"/>
-        <w:rPr>
-          <w:i/>
-          <w:iCs/>
-          <w:u w:val="single"/>
-          <w:lang w:val="de-DE"/>
-        </w:rPr>
-      </w:pPr>
-      <w:bookmarkStart w:id="6" w:name="_Toc242968874"/>
-      <w:r>
-        <w:rPr>
-          <w:bCs/>
-          <w:i/>
-          <w:iCs/>
-          <w:u w:val="single"/>
-        </w:rPr>
-        <w:t>Spring Boot:</w:t>
-      </w:r>
-      <w:r>
-        <w:t xml:space="preserve"> Nền tảng phát triển ứng dụng Java, hỗ trợ cấu hình tự động và xây dựng ứng dụng web/API theo mô hình Spring. Trong đề tài, Spring Boot tổ chức các endpoint REST, tiếp nhận yêu cầu từ Frontend, gọi các lớp nghiệp vụ và phối hợp với tầng truy cập dữ liệu.</w:t>
-      </w:r>
-    </w:p>
-    <w:p>
-      <w:pPr>
-        <w:pStyle w:val="onVnHH"/>
-        <w:ind w:firstLine="510"/>
-      </w:pPr>
-      <w:r>
-        <w:t>Spring Boot được lựa chọn thay vì PHP, C# hoặc Python nhờ khả năng tổ chức mã nguồn theo kiến trúc phân lớp, hỗ trợ xây dựng REST API và tích hợp hiệu quả với các công nghệ như Spring Security, Spring Data JPA và MySQL. Java có hệ sinh thái thư viện phong phú, cơ chế kiểm soát kiểu dữ liệu chặt chẽ và khả năng bảo trì mã nguồn tốt, phù hợp với ứng dụng có nhiều chức năng quản lý và xử lý nghiệp vụ. Bên cạnh đó, Spring Boot giúp giảm khối lượng cấu hình ban đầu, thuận tiện cho việc mở rộng và kiểm thử hệ thống. Việc lựa chọn công nghệ này cũng phù hợp với định hướng học tập và vận dụng kiến thức lập trình Java vào phát triển ứng dụng web theo mô hình Client–Server.</w:t>
-      </w:r>
-    </w:p>
-    <w:p>
-      <w:pPr>
-        <w:pStyle w:val="onVnHH"/>
-        <w:ind w:firstLine="567"/>
-        <w:rPr>
-          <w:i/>
-          <w:iCs/>
-          <w:u w:val="single"/>
-          <w:lang w:val="de-DE"/>
-        </w:rPr>
-      </w:pPr>
-      <w:r>
-        <w:t>Trong ứng dụng này, Spring Boot đóng vai trò nền tảng chạy Backend và tổ chức các thành phần xử lý yêu cầu. Endpoint REST tiếp nhận dữ liệu từ trình duyệt, lớp điều khiển ánh xạ đường dẫn và phương thức HTTP, lớp dịch vụ thực hiện quy tắc nghiệp vụ, còn tầng truy cập dữ liệu phối hợp với cơ sở dữ liệu. Phân chia trách nhiệm giúp mã nguồn rõ ràng hơn và thuận tiện kiểm thử từng phần.</w:t>
-      </w:r>
-    </w:p>
-    <w:p>
-      <w:pPr>
-        <w:pStyle w:val="onVnHH"/>
-        <w:ind w:firstLine="567"/>
-        <w:rPr>
-          <w:i/>
-          <w:iCs/>
-          <w:u w:val="single"/>
-          <w:lang w:val="de-DE"/>
-        </w:rPr>
-      </w:pPr>
-      <w:r>
-        <w:lastRenderedPageBreak/>
-        <w:t>Phản hồi API nên có cấu trúc nhất quán, mã trạng thái HTTP phù hợp và chỉ trả về các trường dữ liệu cần thiết. Dữ liệu đầu vào cần được kiểm tra trước khi xử lý; các lỗi dự kiến nên được chuyển thành phản hồi dễ hiểu thay vì để lộ dấu vết lỗi nội bộ. Các endpoint liên quan đến bài hát có thể phục vụ truy vấn danh sách, tìm kiếm, thông tin chi tiết và nghiệp vụ quản lý nội dung theo quyền.</w:t>
-      </w:r>
-    </w:p>
-    <w:p>
-      <w:pPr>
-        <w:pStyle w:val="onVnHH"/>
-        <w:ind w:firstLine="567"/>
-        <w:rPr>
-          <w:i/>
-          <w:iCs/>
-          <w:u w:val="single"/>
-        </w:rPr>
-      </w:pPr>
-      <w:r>
-        <w:t>Spring Security và JWT: Spring Security là khung bảo mật tích hợp với ứng dụng Spring, hỗ trợ thiết lập chuỗi bộ lọc để xác thực yêu cầu và áp dụng quy tắc phân quyền. JSON Web Token là định dạng token mang các thông tin định danh/claims đã được ký; trong mô hình stateless, máy chủ xác minh chữ ký và thời hạn của token ở các yêu cầu được bảo vệ. Token không được xem là dữ liệu bí mật đã mã hóa: không đưa mật khẩu hay thông tin nhạy cảm vào payload. Kết nối cần sử dụng HTTPS và chính sách lưu trữ token phải được cân nhắc theo mức độ rủi ro.</w:t>
-      </w:r>
-    </w:p>
-    <w:p>
-      <w:pPr>
-        <w:pStyle w:val="onVnHH"/>
-        <w:ind w:firstLine="567"/>
-        <w:rPr>
-          <w:i/>
-          <w:iCs/>
-          <w:u w:val="single"/>
-          <w:lang w:val="de-DE"/>
-        </w:rPr>
-      </w:pPr>
-      <w:r>
-        <w:t>Sau khi xác thực thành công, hệ thống xác định danh tính người dùng và quyền/vai trò được phép thực hiện. Các thao tác như chỉnh sửa hồ sơ cá nhân, đăng bài hát hoặc xử lý nội dung quản trị cần được bảo vệ ở phía máy chủ; ẩn nút trên giao diện không thay thế cho kiểm tra quyền tại Backend.</w:t>
-      </w:r>
-    </w:p>
-    <w:p>
-      <w:pPr>
-        <w:pStyle w:val="onVnHH"/>
-        <w:numPr>
-          <w:ilvl w:val="0"/>
-          <w:numId w:val="28"/>
-        </w:numPr>
-        <w:rPr>
-          <w:i/>
-          <w:iCs/>
-          <w:u w:val="single"/>
-          <w:lang w:val="de-DE"/>
-        </w:rPr>
-      </w:pPr>
-      <w:r>
-        <w:t>Kiểm tra token ở mọi endpoint yêu cầu đăng nhập, bao gồm chữ ký, thời hạn và các điều kiện xác thực cần thiết.</w:t>
-      </w:r>
-    </w:p>
-    <w:p>
-      <w:pPr>
-        <w:pStyle w:val="onVnHH"/>
-        <w:numPr>
-          <w:ilvl w:val="0"/>
-          <w:numId w:val="28"/>
-        </w:numPr>
-        <w:rPr>
-          <w:i/>
-          <w:iCs/>
-          <w:u w:val="single"/>
-          <w:lang w:val="de-DE"/>
-        </w:rPr>
-      </w:pPr>
-      <w:r>
-        <w:t>Phân biệt xác thực (người dùng là ai) với phân quyền (người dùng được làm gì), áp dụng quyền tối thiểu cần thiết.</w:t>
-      </w:r>
-    </w:p>
-    <w:p>
-      <w:pPr>
-        <w:pStyle w:val="onVnHH"/>
-        <w:numPr>
-          <w:ilvl w:val="0"/>
-          <w:numId w:val="28"/>
-        </w:numPr>
-        <w:rPr>
-          <w:i/>
-          <w:iCs/>
-          <w:u w:val="single"/>
-          <w:lang w:val="de-DE"/>
-        </w:rPr>
-      </w:pPr>
-      <w:r>
-        <w:t>Không ghi token/mật khẩu vào nhật ký; xử lý trường hợp hết hạn, đăng xuất và thu hồi phiên theo chính sách triển khai.</w:t>
-      </w:r>
-    </w:p>
-    <w:p>
-      <w:pPr>
-        <w:pStyle w:val="onVnHH"/>
-        <w:ind w:firstLine="567"/>
-      </w:pPr>
-      <w:r>
-        <w:rPr>
-          <w:bCs/>
-          <w:i/>
-          <w:iCs/>
-          <w:u w:val="single"/>
-        </w:rPr>
-        <w:t>Spring Data JPA (Hibernate):</w:t>
-      </w:r>
-      <w:r>
-        <w:t xml:space="preserve"> Spring Data JPA hỗ trợ thao tác dữ liệu theo chuẩn JPA thông qua repository, giảm mã truy vấn lặp lại; Hibernate là bộ triển khai ORM ánh xạ đối tượng Java với bảng quan hệ. Công nghệ này được sử dụng để lưu và truy xuất các thực thể như tài khoản, bài hát, album và playlist. Các ràng buộc, giao dịch và truy vấn cần được thiết kế phù hợp với yêu cầu hệ thống.</w:t>
-      </w:r>
-    </w:p>
-    <w:p>
-      <w:pPr>
-        <w:pStyle w:val="onVnHH"/>
-        <w:ind w:firstLine="567"/>
-      </w:pPr>
-      <w:r>
-        <w:t>Thông qua repository, tầng dịch vụ có thể gọi các thao tác truy vấn/lưu dữ liệu thay vì phụ thuộc trực tiếp vào chi tiết kết nối SQL ở mọi nơi. JPA mô tả cách ánh xạ đối tượng và quan hệ; Hibernate là một hiện thực phổ biến của đặc tả này. Những nghiệp vụ gồm nhiều thao tác dữ liệu liên quan cần được đặt trong phạm vi giao dịch phù hợp để bảo đảm tính nhất quán.</w:t>
-      </w:r>
-    </w:p>
-    <w:p>
-      <w:pPr>
-        <w:pStyle w:val="onVnHH"/>
-        <w:ind w:firstLine="567"/>
-      </w:pPr>
-      <w:r>
-        <w:lastRenderedPageBreak/>
-        <w:t>ORM giúp tăng tính thuận tiện nhưng không loại bỏ nhu cầu hiểu cấu trúc quan hệ và hiệu năng truy vấn. Cần xác định rõ quan hệ giữa thực thể, tránh tải dữ liệu không cần thiết, kiểm tra truy vấn phát sinh và sử dụng phân trang với danh sách dài. Với các truy vấn tìm kiếm hoặc báo cáo đặc thù, có thể cân nhắc truy vấn tường minh sau khi đo đạc và kiểm thử.</w:t>
-      </w:r>
-    </w:p>
-    <w:p>
-      <w:pPr>
-        <w:pStyle w:val="onVnHH"/>
-        <w:jc w:val="center"/>
-        <w:rPr>
-          <w:i/>
-          <w:iCs/>
-          <w:u w:val="single"/>
-        </w:rPr>
-      </w:pPr>
-      <w:r>
-        <w:rPr>
-          <w:noProof/>
-        </w:rPr>
-        <w:drawing>
-          <wp:inline distT="0" distB="0" distL="0" distR="0" wp14:anchorId="2C2BEE26" wp14:editId="2C5BE519">
-            <wp:extent cx="5394961" cy="1906154"/>
-            <wp:effectExtent l="0" t="0" r="0" b="0"/>
-            <wp:docPr id="102" name="Hình minh họa 2.2. Luồng xử lý và các thành phần Backend" descr="Hình minh họa 2.2. Luồng xử lý và các thành phần Backend"/>
-            <wp:cNvGraphicFramePr>
-              <a:graphicFrameLocks xmlns:a="http://schemas.openxmlformats.org/drawingml/2006/main" noChangeAspect="1"/>
-            </wp:cNvGraphicFramePr>
-            <a:graphic xmlns:a="http://schemas.openxmlformats.org/drawingml/2006/main">
-              <a:graphicData uri="http://schemas.openxmlformats.org/drawingml/2006/picture">
-                <pic:pic xmlns:pic="http://schemas.openxmlformats.org/drawingml/2006/picture">
-                  <pic:nvPicPr>
-                    <pic:cNvPr id="102" name="Hình minh họa 2.2. Luồng xử lý và các thành phần Backend"/>
-                    <pic:cNvPicPr/>
-                  </pic:nvPicPr>
-                  <pic:blipFill>
-                    <a:blip r:embed="rId13"/>
-                    <a:stretch>
-                      <a:fillRect/>
-                    </a:stretch>
-                  </pic:blipFill>
-                  <pic:spPr>
-                    <a:xfrm>
-                      <a:off x="0" y="0"/>
-                      <a:ext cx="5943600" cy="2100000"/>
-                    </a:xfrm>
-                    <a:prstGeom prst="rect">
-                      <a:avLst/>
-                    </a:prstGeom>
-                  </pic:spPr>
-                </pic:pic>
-              </a:graphicData>
-            </a:graphic>
-          </wp:inline>
-        </w:drawing>
-      </w:r>
-    </w:p>
-    <w:p>
-      <w:pPr>
         <w:pStyle w:val="u3"/>
         <w:rPr>
           <w:lang w:val="de-DE"/>
@@ -5896,8 +6016,11 @@
         </w:rPr>
       </w:pPr>
       <w:r>
+        <w:t xml:space="preserve">Khóa chính định danh duy nhất mỗi bản ghi; khóa ngoại giúp bảo đảm liên kết tham chiếu giữa các bảng; ràng buộc NOT NULL, UNIQUE hoặc CHECK có thể bảo vệ các điều kiện dữ liệu phù hợp. Chỉ mục (index) hỗ trợ tăng tốc một số truy vấn thường xuyên, chẳng hạn tra cứu theo định danh hoặc lọc theo trường được lập chỉ mục; việc </w:t>
+      </w:r>
+      <w:r>
         <w:lastRenderedPageBreak/>
-        <w:t>Khóa chính định danh duy nhất mỗi bản ghi; khóa ngoại giúp bảo đảm liên kết tham chiếu giữa các bảng; ràng buộc NOT NULL, UNIQUE hoặc CHECK có thể bảo vệ các điều kiện dữ liệu phù hợp. Chỉ mục (index) hỗ trợ tăng tốc một số truy vấn thường xuyên, chẳng hạn tra cứu theo định danh hoặc lọc theo trường được lập chỉ mục; việc thêm chỉ mục cần dựa trên mẫu truy vấn thực tế vì chỉ mục cũng làm tăng chi phí ghi và dung lượng lưu trữ.</w:t>
+        <w:t>thêm chỉ mục cần dựa trên mẫu truy vấn thực tế vì chỉ mục cũng làm tăng chi phí ghi và dung lượng lưu trữ.</w:t>
       </w:r>
     </w:p>
     <w:p>
@@ -6533,11 +6656,7 @@
         <w:ind w:firstLine="510"/>
       </w:pPr>
       <w:r>
-        <w:t xml:space="preserve">Trong mô hình này, Client chịu trách nhiệm cung cấp giao diện tương tác, tiếp nhận thao tác của người dùng và gửi yêu cầu đến Server. Server đảm nhận việc xử lý nghiệp vụ, kiểm tra dữ liệu, xác thực và phân quyền người dùng, đồng thời phối hợp với hệ quản trị cơ sở dữ liệu để lưu trữ và truy xuất thông tin. Việc trao đổi dữ liệu giữa hai </w:t>
-      </w:r>
-      <w:r>
-        <w:lastRenderedPageBreak/>
-        <w:t>thành phần thường được thực hiện thông qua giao thức HTTP/HTTPS, với dữ liệu phản hồi có thể được biểu diễn dưới định dạng JSON.</w:t>
+        <w:t xml:space="preserve">Trong mô hình này, Client chịu trách nhiệm cung cấp giao diện tương tác, tiếp nhận thao tác của người dùng và gửi yêu cầu đến Server. Server đảm nhận việc xử lý nghiệp vụ, kiểm tra dữ liệu, xác thực và phân quyền người dùng, đồng thời phối hợp với hệ quản trị cơ sở dữ liệu để lưu trữ và truy xuất thông tin. </w:t>
       </w:r>
     </w:p>
     <w:p>
@@ -6547,8 +6666,10 @@
       </w:pPr>
       <w:r>
         <w:rPr>
+          <w:noProof/>
           <w:lang w:val="de-DE"/>
         </w:rPr>
+        <w:lastRenderedPageBreak/>
         <w:drawing>
           <wp:inline distT="0" distB="0" distL="0" distR="0" wp14:anchorId="5C70B9E3" wp14:editId="6B981014">
             <wp:extent cx="5105842" cy="3703641"/>
@@ -6565,7 +6686,7 @@
                     <pic:cNvPicPr/>
                   </pic:nvPicPr>
                   <pic:blipFill>
-                    <a:blip r:embed="rId14"/>
+                    <a:blip r:embed="rId15"/>
                     <a:stretch>
                       <a:fillRect/>
                     </a:stretch>
@@ -6683,7 +6804,7 @@
                     <pic:cNvPicPr/>
                   </pic:nvPicPr>
                   <pic:blipFill>
-                    <a:blip r:embed="rId15"/>
+                    <a:blip r:embed="rId16"/>
                     <a:stretch>
                       <a:fillRect/>
                     </a:stretch>
@@ -6754,50 +6875,7 @@
         </w:rPr>
         <w:br w:type="page"/>
       </w:r>
-    </w:p>
-    <w:bookmarkEnd w:id="2"/>
-    <w:p>
-      <w:pPr>
-        <w:spacing w:before="120" w:after="120" w:line="360" w:lineRule="auto"/>
-        <w:jc w:val="both"/>
-        <w:rPr>
-          <w:rFonts w:ascii="Times New Roman" w:hAnsi="Times New Roman"/>
-          <w:sz w:val="28"/>
-          <w:szCs w:val="28"/>
-          <w:lang w:val="de-DE"/>
-        </w:rPr>
-      </w:pPr>
-      <w:r>
-        <w:rPr>
-          <w:rFonts w:ascii="Times New Roman" w:hAnsi="Times New Roman"/>
-          <w:sz w:val="28"/>
-          <w:szCs w:val="28"/>
-          <w:lang w:val="de-DE"/>
-        </w:rPr>
-        <w:lastRenderedPageBreak/>
-        <w:t>Kết luận chương</w:t>
-      </w:r>
-    </w:p>
-    <w:p>
-      <w:pPr>
-        <w:rPr>
-          <w:rFonts w:ascii="Times New Roman" w:hAnsi="Times New Roman"/>
-          <w:b/>
-          <w:sz w:val="28"/>
-          <w:szCs w:val="28"/>
-          <w:lang w:val="de-DE"/>
-        </w:rPr>
-      </w:pPr>
-      <w:r>
-        <w:rPr>
-          <w:rFonts w:ascii="Times New Roman" w:hAnsi="Times New Roman"/>
-          <w:b/>
-          <w:sz w:val="28"/>
-          <w:szCs w:val="28"/>
-          <w:lang w:val="de-DE"/>
-        </w:rPr>
-        <w:br w:type="page"/>
-      </w:r>
+      <w:bookmarkEnd w:id="3"/>
     </w:p>
     <w:p>
       <w:pPr>
@@ -7784,7 +7862,7 @@
         </w:rPr>
         <w:t xml:space="preserve"> [Online], Available:  </w:t>
       </w:r>
-      <w:hyperlink r:id="rId16" w:history="1">
+      <w:hyperlink r:id="rId17" w:history="1">
         <w:r>
           <w:rPr>
             <w:rStyle w:val="Siuktni"/>
@@ -10564,8 +10642,8 @@
       </w:r>
     </w:p>
     <w:sectPr>
-      <w:headerReference w:type="default" r:id="rId17"/>
-      <w:footerReference w:type="default" r:id="rId18"/>
+      <w:headerReference w:type="default" r:id="rId18"/>
+      <w:footerReference w:type="default" r:id="rId19"/>
       <w:pgSz w:w="11906" w:h="16838" w:code="9"/>
       <w:pgMar w:top="1134" w:right="1134" w:bottom="1134" w:left="1701" w:header="720" w:footer="720" w:gutter="0"/>
       <w:pgNumType w:start="1"/>
@@ -11541,7 +11619,7 @@
   <w:abstractNum w:abstractNumId="6" w15:restartNumberingAfterBreak="0">
     <w:nsid w:val="268324E2"/>
     <w:multiLevelType w:val="multilevel"/>
-    <w:tmpl w:val="35B6DABC"/>
+    <w:tmpl w:val="40F2E678"/>
     <w:lvl w:ilvl="0">
       <w:start w:val="1"/>
       <w:numFmt w:val="bullet"/>
@@ -11555,7 +11633,8 @@
       </w:pPr>
       <w:rPr>
         <w:rFonts w:ascii="Symbol" w:hAnsi="Symbol" w:hint="default"/>
-        <w:sz w:val="20"/>
+        <w:sz w:val="24"/>
+        <w:szCs w:val="24"/>
       </w:rPr>
     </w:lvl>
     <w:lvl w:ilvl="1" w:tentative="1">
@@ -13444,6 +13523,155 @@
     </w:lvl>
   </w:abstractNum>
   <w:abstractNum w:abstractNumId="21" w15:restartNumberingAfterBreak="0">
+    <w:nsid w:val="67492B75"/>
+    <w:multiLevelType w:val="multilevel"/>
+    <w:tmpl w:val="D5E2BFD0"/>
+    <w:lvl w:ilvl="0">
+      <w:start w:val="1"/>
+      <w:numFmt w:val="bullet"/>
+      <w:lvlText w:val=""/>
+      <w:lvlJc w:val="left"/>
+      <w:pPr>
+        <w:tabs>
+          <w:tab w:val="num" w:pos="720"/>
+        </w:tabs>
+        <w:ind w:left="720" w:hanging="360"/>
+      </w:pPr>
+      <w:rPr>
+        <w:rFonts w:ascii="Symbol" w:hAnsi="Symbol" w:hint="default"/>
+        <w:sz w:val="20"/>
+      </w:rPr>
+    </w:lvl>
+    <w:lvl w:ilvl="1" w:tentative="1">
+      <w:start w:val="1"/>
+      <w:numFmt w:val="bullet"/>
+      <w:lvlText w:val="o"/>
+      <w:lvlJc w:val="left"/>
+      <w:pPr>
+        <w:tabs>
+          <w:tab w:val="num" w:pos="1440"/>
+        </w:tabs>
+        <w:ind w:left="1440" w:hanging="360"/>
+      </w:pPr>
+      <w:rPr>
+        <w:rFonts w:ascii="Courier New" w:hAnsi="Courier New" w:hint="default"/>
+        <w:sz w:val="20"/>
+      </w:rPr>
+    </w:lvl>
+    <w:lvl w:ilvl="2" w:tentative="1">
+      <w:start w:val="1"/>
+      <w:numFmt w:val="bullet"/>
+      <w:lvlText w:val=""/>
+      <w:lvlJc w:val="left"/>
+      <w:pPr>
+        <w:tabs>
+          <w:tab w:val="num" w:pos="2160"/>
+        </w:tabs>
+        <w:ind w:left="2160" w:hanging="360"/>
+      </w:pPr>
+      <w:rPr>
+        <w:rFonts w:ascii="Wingdings" w:hAnsi="Wingdings" w:hint="default"/>
+        <w:sz w:val="20"/>
+      </w:rPr>
+    </w:lvl>
+    <w:lvl w:ilvl="3" w:tentative="1">
+      <w:start w:val="1"/>
+      <w:numFmt w:val="bullet"/>
+      <w:lvlText w:val=""/>
+      <w:lvlJc w:val="left"/>
+      <w:pPr>
+        <w:tabs>
+          <w:tab w:val="num" w:pos="2880"/>
+        </w:tabs>
+        <w:ind w:left="2880" w:hanging="360"/>
+      </w:pPr>
+      <w:rPr>
+        <w:rFonts w:ascii="Wingdings" w:hAnsi="Wingdings" w:hint="default"/>
+        <w:sz w:val="20"/>
+      </w:rPr>
+    </w:lvl>
+    <w:lvl w:ilvl="4" w:tentative="1">
+      <w:start w:val="1"/>
+      <w:numFmt w:val="bullet"/>
+      <w:lvlText w:val=""/>
+      <w:lvlJc w:val="left"/>
+      <w:pPr>
+        <w:tabs>
+          <w:tab w:val="num" w:pos="3600"/>
+        </w:tabs>
+        <w:ind w:left="3600" w:hanging="360"/>
+      </w:pPr>
+      <w:rPr>
+        <w:rFonts w:ascii="Wingdings" w:hAnsi="Wingdings" w:hint="default"/>
+        <w:sz w:val="20"/>
+      </w:rPr>
+    </w:lvl>
+    <w:lvl w:ilvl="5" w:tentative="1">
+      <w:start w:val="1"/>
+      <w:numFmt w:val="bullet"/>
+      <w:lvlText w:val=""/>
+      <w:lvlJc w:val="left"/>
+      <w:pPr>
+        <w:tabs>
+          <w:tab w:val="num" w:pos="4320"/>
+        </w:tabs>
+        <w:ind w:left="4320" w:hanging="360"/>
+      </w:pPr>
+      <w:rPr>
+        <w:rFonts w:ascii="Wingdings" w:hAnsi="Wingdings" w:hint="default"/>
+        <w:sz w:val="20"/>
+      </w:rPr>
+    </w:lvl>
+    <w:lvl w:ilvl="6" w:tentative="1">
+      <w:start w:val="1"/>
+      <w:numFmt w:val="bullet"/>
+      <w:lvlText w:val=""/>
+      <w:lvlJc w:val="left"/>
+      <w:pPr>
+        <w:tabs>
+          <w:tab w:val="num" w:pos="5040"/>
+        </w:tabs>
+        <w:ind w:left="5040" w:hanging="360"/>
+      </w:pPr>
+      <w:rPr>
+        <w:rFonts w:ascii="Wingdings" w:hAnsi="Wingdings" w:hint="default"/>
+        <w:sz w:val="20"/>
+      </w:rPr>
+    </w:lvl>
+    <w:lvl w:ilvl="7" w:tentative="1">
+      <w:start w:val="1"/>
+      <w:numFmt w:val="bullet"/>
+      <w:lvlText w:val=""/>
+      <w:lvlJc w:val="left"/>
+      <w:pPr>
+        <w:tabs>
+          <w:tab w:val="num" w:pos="5760"/>
+        </w:tabs>
+        <w:ind w:left="5760" w:hanging="360"/>
+      </w:pPr>
+      <w:rPr>
+        <w:rFonts w:ascii="Wingdings" w:hAnsi="Wingdings" w:hint="default"/>
+        <w:sz w:val="20"/>
+      </w:rPr>
+    </w:lvl>
+    <w:lvl w:ilvl="8" w:tentative="1">
+      <w:start w:val="1"/>
+      <w:numFmt w:val="bullet"/>
+      <w:lvlText w:val=""/>
+      <w:lvlJc w:val="left"/>
+      <w:pPr>
+        <w:tabs>
+          <w:tab w:val="num" w:pos="6480"/>
+        </w:tabs>
+        <w:ind w:left="6480" w:hanging="360"/>
+      </w:pPr>
+      <w:rPr>
+        <w:rFonts w:ascii="Wingdings" w:hAnsi="Wingdings" w:hint="default"/>
+        <w:sz w:val="20"/>
+      </w:rPr>
+    </w:lvl>
+  </w:abstractNum>
+  <w:abstractNum w:abstractNumId="22" w15:restartNumberingAfterBreak="0">
     <w:nsid w:val="689F6277"/>
     <w:multiLevelType w:val="hybridMultilevel"/>
     <w:tmpl w:val="05ACD098"/>
@@ -13583,7 +13811,7 @@
       </w:rPr>
     </w:lvl>
   </w:abstractNum>
-  <w:abstractNum w:abstractNumId="22" w15:restartNumberingAfterBreak="0">
+  <w:abstractNum w:abstractNumId="23" w15:restartNumberingAfterBreak="0">
     <w:nsid w:val="6F485DFC"/>
     <w:multiLevelType w:val="multilevel"/>
     <w:tmpl w:val="D2B4C112"/>
@@ -13702,7 +13930,7 @@
       </w:rPr>
     </w:lvl>
   </w:abstractNum>
-  <w:abstractNum w:abstractNumId="23" w15:restartNumberingAfterBreak="0">
+  <w:abstractNum w:abstractNumId="24" w15:restartNumberingAfterBreak="0">
     <w:nsid w:val="7457759A"/>
     <w:multiLevelType w:val="hybridMultilevel"/>
     <w:tmpl w:val="E3002684"/>
@@ -13815,7 +14043,7 @@
       </w:rPr>
     </w:lvl>
   </w:abstractNum>
-  <w:abstractNum w:abstractNumId="24" w15:restartNumberingAfterBreak="0">
+  <w:abstractNum w:abstractNumId="25" w15:restartNumberingAfterBreak="0">
     <w:nsid w:val="78D846DC"/>
     <w:multiLevelType w:val="multilevel"/>
     <w:tmpl w:val="3B18598C"/>
@@ -13964,7 +14192,7 @@
       </w:rPr>
     </w:lvl>
   </w:abstractNum>
-  <w:abstractNum w:abstractNumId="25" w15:restartNumberingAfterBreak="0">
+  <w:abstractNum w:abstractNumId="26" w15:restartNumberingAfterBreak="0">
     <w:nsid w:val="7F036A23"/>
     <w:multiLevelType w:val="multilevel"/>
     <w:tmpl w:val="244A6DF0"/>
@@ -14117,7 +14345,7 @@
     <w:abstractNumId w:val="2"/>
   </w:num>
   <w:num w:numId="2" w16cid:durableId="627902492">
-    <w:abstractNumId w:val="21"/>
+    <w:abstractNumId w:val="22"/>
   </w:num>
   <w:num w:numId="3" w16cid:durableId="912547172">
     <w:abstractNumId w:val="3"/>
@@ -14129,7 +14357,7 @@
     <w:abstractNumId w:val="12"/>
   </w:num>
   <w:num w:numId="6" w16cid:durableId="1981764410">
-    <w:abstractNumId w:val="24"/>
+    <w:abstractNumId w:val="25"/>
   </w:num>
   <w:num w:numId="7" w16cid:durableId="107283844">
     <w:abstractNumId w:val="7"/>
@@ -14270,7 +14498,7 @@
     <w:abstractNumId w:val="10"/>
   </w:num>
   <w:num w:numId="10" w16cid:durableId="2005090684">
-    <w:abstractNumId w:val="22"/>
+    <w:abstractNumId w:val="23"/>
   </w:num>
   <w:num w:numId="11" w16cid:durableId="634599052">
     <w:abstractNumId w:val="19"/>
@@ -14294,7 +14522,7 @@
     <w:abstractNumId w:val="0"/>
   </w:num>
   <w:num w:numId="18" w16cid:durableId="1218738952">
-    <w:abstractNumId w:val="22"/>
+    <w:abstractNumId w:val="23"/>
     <w:lvlOverride w:ilvl="0">
       <w:startOverride w:val="1"/>
     </w:lvlOverride>
@@ -14324,7 +14552,7 @@
     </w:lvlOverride>
   </w:num>
   <w:num w:numId="19" w16cid:durableId="996035107">
-    <w:abstractNumId w:val="22"/>
+    <w:abstractNumId w:val="23"/>
     <w:lvlOverride w:ilvl="0">
       <w:startOverride w:val="1"/>
     </w:lvlOverride>
@@ -14357,7 +14585,7 @@
     <w:abstractNumId w:val="5"/>
   </w:num>
   <w:num w:numId="21" w16cid:durableId="314264928">
-    <w:abstractNumId w:val="25"/>
+    <w:abstractNumId w:val="26"/>
   </w:num>
   <w:num w:numId="22" w16cid:durableId="1828670340">
     <w:abstractNumId w:val="6"/>
@@ -14375,13 +14603,46 @@
     <w:abstractNumId w:val="13"/>
   </w:num>
   <w:num w:numId="27" w16cid:durableId="703556631">
-    <w:abstractNumId w:val="23"/>
+    <w:abstractNumId w:val="24"/>
   </w:num>
   <w:num w:numId="28" w16cid:durableId="835846152">
     <w:abstractNumId w:val="20"/>
   </w:num>
   <w:num w:numId="29" w16cid:durableId="628586268">
     <w:abstractNumId w:val="9"/>
+  </w:num>
+  <w:num w:numId="30" w16cid:durableId="1591545315">
+    <w:abstractNumId w:val="21"/>
+  </w:num>
+  <w:num w:numId="31" w16cid:durableId="1867330110">
+    <w:abstractNumId w:val="23"/>
+    <w:lvlOverride w:ilvl="0">
+      <w:startOverride w:val="1"/>
+    </w:lvlOverride>
+    <w:lvlOverride w:ilvl="1">
+      <w:startOverride w:val="1"/>
+    </w:lvlOverride>
+    <w:lvlOverride w:ilvl="2">
+      <w:startOverride w:val="1"/>
+    </w:lvlOverride>
+    <w:lvlOverride w:ilvl="3">
+      <w:startOverride w:val="1"/>
+    </w:lvlOverride>
+    <w:lvlOverride w:ilvl="4">
+      <w:startOverride w:val="1"/>
+    </w:lvlOverride>
+    <w:lvlOverride w:ilvl="5">
+      <w:startOverride w:val="1"/>
+    </w:lvlOverride>
+    <w:lvlOverride w:ilvl="6">
+      <w:startOverride w:val="1"/>
+    </w:lvlOverride>
+    <w:lvlOverride w:ilvl="7">
+      <w:startOverride w:val="1"/>
+    </w:lvlOverride>
+    <w:lvlOverride w:ilvl="8">
+      <w:startOverride w:val="1"/>
+    </w:lvlOverride>
   </w:num>
 </w:numbering>
 </file>

</xml_diff>